<commit_message>
feat: add Patrimoine and Budget pages with CSV import and net worth visualization capabilities
</commit_message>
<xml_diff>
--- a/details technique/Plan_Fondora_Enrichi.docx
+++ b/details technique/Plan_Fondora_Enrichi.docx
@@ -10022,10 +10022,1736 @@
           <w:numId w:val="1"/>
         </w:numPr>
         <w:spacing w:after="80"/>
+        <w:rPr>
+          <w:b/>
+          <w:bCs/>
+        </w:rPr>
       </w:pPr>
       <w:r>
         <w:t>Transactions non reconnues → popup "Quelle catégorie ?" → mémorise via smart_rules</w:t>
       </w:r>
+      <w:r>
+        <w:br/>
+      </w:r>
+      <w:r>
+        <w:rPr>
+          <w:b/>
+          <w:bCs/>
+        </w:rPr>
+        <w:t>1. Robustesse du Parsing &amp; Pipeline de Données (Sous le Capot)</w:t>
+      </w:r>
+    </w:p>
+    <w:p>
+      <w:pPr>
+        <w:pStyle w:val="Paragraphedeliste"/>
+        <w:numPr>
+          <w:ilvl w:val="0"/>
+          <w:numId w:val="1"/>
+        </w:numPr>
+        <w:spacing w:after="80"/>
+      </w:pPr>
+      <w:r>
+        <w:t>Un import de fichier est par nature sujet à de multiples erreurs (encodages, formats de date, délimiteurs). Pour rendre le système infaillible :</w:t>
+      </w:r>
+    </w:p>
+    <w:p>
+      <w:pPr>
+        <w:pStyle w:val="Paragraphedeliste"/>
+        <w:numPr>
+          <w:ilvl w:val="0"/>
+          <w:numId w:val="1"/>
+        </w:numPr>
+        <w:spacing w:after="80"/>
+      </w:pPr>
+      <w:r>
+        <w:rPr>
+          <w:b/>
+          <w:bCs/>
+        </w:rPr>
+        <w:t>Normalisation automatique des fichiers :</w:t>
+      </w:r>
+    </w:p>
+    <w:p>
+      <w:pPr>
+        <w:pStyle w:val="Paragraphedeliste"/>
+        <w:numPr>
+          <w:ilvl w:val="0"/>
+          <w:numId w:val="1"/>
+        </w:numPr>
+        <w:spacing w:after="80"/>
+      </w:pPr>
+      <w:r>
+        <w:rPr>
+          <w:b/>
+          <w:bCs/>
+        </w:rPr>
+        <w:t>Détection automatique de l'encodage</w:t>
+      </w:r>
+      <w:r>
+        <w:t xml:space="preserve"> (UTF-8, ISO-8859-1) et du </w:t>
+      </w:r>
+      <w:r>
+        <w:rPr>
+          <w:b/>
+          <w:bCs/>
+        </w:rPr>
+        <w:t>délimiteur</w:t>
+      </w:r>
+      <w:r>
+        <w:t xml:space="preserve"> (virgule ,, point-virgule ;, tabulation \t) via une phase de pré-lecture du fichier avec PapaParse (configuration header: false pour analyser la structure initiale).</w:t>
+      </w:r>
+    </w:p>
+    <w:p>
+      <w:pPr>
+        <w:pStyle w:val="Paragraphedeliste"/>
+        <w:numPr>
+          <w:ilvl w:val="0"/>
+          <w:numId w:val="1"/>
+        </w:numPr>
+        <w:spacing w:after="80"/>
+      </w:pPr>
+      <w:r>
+        <w:rPr>
+          <w:b/>
+          <w:bCs/>
+        </w:rPr>
+        <w:t>Nettoyage des données parasites :</w:t>
+      </w:r>
+      <w:r>
+        <w:t xml:space="preserve"> Les banques françaises insèrent souvent des lignes de texte d'en-tête inutiles avant le vrai tableau (ex. </w:t>
+      </w:r>
+      <w:r>
+        <w:rPr>
+          <w:i/>
+          <w:iCs/>
+        </w:rPr>
+        <w:t>"Solde au 15/05/2026 : ..."</w:t>
+      </w:r>
+      <w:r>
+        <w:t>). Le parser doit scanner le fichier pour repérer dynamiquement la première ligne contenant une structure de données valide (par exemple, une ligne contenant une date, un montant et un libellé) et ignorer tout ce qui précède.</w:t>
+      </w:r>
+    </w:p>
+    <w:p>
+      <w:pPr>
+        <w:pStyle w:val="Paragraphedeliste"/>
+        <w:numPr>
+          <w:ilvl w:val="0"/>
+          <w:numId w:val="1"/>
+        </w:numPr>
+        <w:spacing w:after="80"/>
+      </w:pPr>
+      <w:r>
+        <w:rPr>
+          <w:b/>
+          <w:bCs/>
+        </w:rPr>
+        <w:t>Gestion des doublons (La bête noire des imports) :</w:t>
+      </w:r>
+    </w:p>
+    <w:p>
+      <w:pPr>
+        <w:pStyle w:val="Paragraphedeliste"/>
+        <w:numPr>
+          <w:ilvl w:val="0"/>
+          <w:numId w:val="1"/>
+        </w:numPr>
+        <w:spacing w:after="80"/>
+      </w:pPr>
+      <w:r>
+        <w:t xml:space="preserve">Ne vous basez pas uniquement sur la date ou le montant. Générez un </w:t>
+      </w:r>
+      <w:r>
+        <w:rPr>
+          <w:b/>
+          <w:bCs/>
+        </w:rPr>
+        <w:t>hash unique (SHA-256)</w:t>
+      </w:r>
+      <w:r>
+        <w:t xml:space="preserve"> par transaction combinant : date + libellé + montant + compte_id. </w:t>
+      </w:r>
+    </w:p>
+    <w:p>
+      <w:pPr>
+        <w:pStyle w:val="Paragraphedeliste"/>
+        <w:numPr>
+          <w:ilvl w:val="0"/>
+          <w:numId w:val="1"/>
+        </w:numPr>
+        <w:spacing w:after="80"/>
+      </w:pPr>
+      <w:r>
+        <w:t xml:space="preserve">Lors de l'import, comparez ces hashs avec ceux déjà présents en base de données (Supabase). Si un doublon est détecté, proposez à l'utilisateur : </w:t>
+      </w:r>
+      <w:r>
+        <w:rPr>
+          <w:i/>
+          <w:iCs/>
+        </w:rPr>
+        <w:t>"X transactions déjà importées ont été détectées et ignorées"</w:t>
+      </w:r>
+      <w:r>
+        <w:t xml:space="preserve"> avec une option pour forcer l'écrasement ou l'ignorer.</w:t>
+      </w:r>
+    </w:p>
+    <w:p>
+      <w:pPr>
+        <w:pStyle w:val="Paragraphedeliste"/>
+        <w:numPr>
+          <w:ilvl w:val="0"/>
+          <w:numId w:val="1"/>
+        </w:numPr>
+        <w:spacing w:after="80"/>
+        <w:rPr>
+          <w:b/>
+          <w:bCs/>
+        </w:rPr>
+      </w:pPr>
+      <w:r>
+        <w:rPr>
+          <w:b/>
+          <w:bCs/>
+        </w:rPr>
+        <w:t>2. Algorithme de Détection Automatique Intelligent (Zero-Configuration)</w:t>
+      </w:r>
+    </w:p>
+    <w:p>
+      <w:pPr>
+        <w:pStyle w:val="Paragraphedeliste"/>
+        <w:numPr>
+          <w:ilvl w:val="0"/>
+          <w:numId w:val="1"/>
+        </w:numPr>
+        <w:spacing w:after="80"/>
+      </w:pPr>
+      <w:r>
+        <w:t xml:space="preserve">Au lieu d'un simple matching de colonnes basique, créez un système de </w:t>
+      </w:r>
+      <w:r>
+        <w:rPr>
+          <w:b/>
+          <w:bCs/>
+        </w:rPr>
+        <w:t>signatures de formats</w:t>
+      </w:r>
+      <w:r>
+        <w:t xml:space="preserve"> pour les grandes banques (Boursorama, BNP, Fortuneo, Revolut, etc.) :</w:t>
+      </w:r>
+    </w:p>
+    <w:p>
+      <w:pPr>
+        <w:pStyle w:val="Paragraphedeliste"/>
+        <w:numPr>
+          <w:ilvl w:val="0"/>
+          <w:numId w:val="1"/>
+        </w:numPr>
+        <w:spacing w:after="80"/>
+      </w:pPr>
+      <w:r>
+        <w:rPr>
+          <w:b/>
+          <w:bCs/>
+        </w:rPr>
+        <w:t>Le système de "Signatures" :</w:t>
+      </w:r>
+    </w:p>
+    <w:p>
+      <w:pPr>
+        <w:pStyle w:val="Paragraphedeliste"/>
+        <w:numPr>
+          <w:ilvl w:val="0"/>
+          <w:numId w:val="1"/>
+        </w:numPr>
+        <w:spacing w:after="80"/>
+      </w:pPr>
+      <w:r>
+        <w:t>Chaque banque exporte ses colonnes dans un ordre et avec des noms bien précis (ex. Boursorama utilise "dateOp", "libelle", "montant" ; le Crédit Agricole utilise "Date de l'opération", "Libellé de l'opération", "Débit", "Crédit").</w:t>
+      </w:r>
+    </w:p>
+    <w:p>
+      <w:pPr>
+        <w:pStyle w:val="Paragraphedeliste"/>
+        <w:numPr>
+          <w:ilvl w:val="0"/>
+          <w:numId w:val="1"/>
+        </w:numPr>
+        <w:spacing w:after="80"/>
+      </w:pPr>
+      <w:r>
+        <w:t>Écrivez une fonction de détection qui compare la première ligne (headers) du CSV avec un dictionnaire de signatures connues.</w:t>
+      </w:r>
+    </w:p>
+    <w:p>
+      <w:pPr>
+        <w:pStyle w:val="Paragraphedeliste"/>
+        <w:numPr>
+          <w:ilvl w:val="0"/>
+          <w:numId w:val="1"/>
+        </w:numPr>
+        <w:spacing w:after="80"/>
+      </w:pPr>
+      <w:r>
+        <w:rPr>
+          <w:b/>
+          <w:bCs/>
+        </w:rPr>
+        <w:t>Gestion des flux de Débit / Crédit :</w:t>
+      </w:r>
+    </w:p>
+    <w:p>
+      <w:pPr>
+        <w:pStyle w:val="Paragraphedeliste"/>
+        <w:numPr>
+          <w:ilvl w:val="0"/>
+          <w:numId w:val="1"/>
+        </w:numPr>
+        <w:spacing w:after="80"/>
+      </w:pPr>
+      <w:r>
+        <w:t xml:space="preserve">Certaines banques séparent les dépenses et recettes dans deux colonnes distinctes (Débit et Crédit), d'autres utilisent une seule colonne Montant avec des signes négatifs - et positifs +. Votre parser doit unifier cela en un format standardisé pour Supabase : montant (numérique) et type (dépense/recette). </w:t>
+      </w:r>
+    </w:p>
+    <w:p>
+      <w:pPr>
+        <w:pStyle w:val="Paragraphedeliste"/>
+        <w:numPr>
+          <w:ilvl w:val="0"/>
+          <w:numId w:val="1"/>
+        </w:numPr>
+        <w:spacing w:after="80"/>
+        <w:rPr>
+          <w:b/>
+          <w:bCs/>
+        </w:rPr>
+      </w:pPr>
+      <w:r>
+        <w:rPr>
+          <w:b/>
+          <w:bCs/>
+        </w:rPr>
+        <w:lastRenderedPageBreak/>
+        <w:t>3. Le "Mapper Visuel" Interactif (Fallback UI Exceptionnel)</w:t>
+      </w:r>
+    </w:p>
+    <w:p>
+      <w:pPr>
+        <w:pStyle w:val="Paragraphedeliste"/>
+        <w:numPr>
+          <w:ilvl w:val="0"/>
+          <w:numId w:val="1"/>
+        </w:numPr>
+        <w:spacing w:after="80"/>
+      </w:pPr>
+      <w:r>
+        <w:t>Si le format n'est pas reconnu par le système de signatures, l'interface doit guider l'utilisateur de manière ultra-visuelle plutôt que de lui présenter un formulaire austère :</w:t>
+      </w:r>
+    </w:p>
+    <w:p>
+      <w:pPr>
+        <w:pStyle w:val="Paragraphedeliste"/>
+        <w:numPr>
+          <w:ilvl w:val="0"/>
+          <w:numId w:val="1"/>
+        </w:numPr>
+        <w:spacing w:after="80"/>
+      </w:pPr>
+      <w:r>
+        <w:rPr>
+          <w:b/>
+          <w:bCs/>
+        </w:rPr>
+        <w:t>Aperçu sous forme de tableau (Live Preview) :</w:t>
+      </w:r>
+    </w:p>
+    <w:p>
+      <w:pPr>
+        <w:pStyle w:val="Paragraphedeliste"/>
+        <w:numPr>
+          <w:ilvl w:val="0"/>
+          <w:numId w:val="1"/>
+        </w:numPr>
+        <w:spacing w:after="80"/>
+      </w:pPr>
+      <w:r>
+        <w:t>Affichez les 3 ou 5 premières lignes du CSV sous forme de tableau interactif Tailwind CSS.</w:t>
+      </w:r>
+    </w:p>
+    <w:p>
+      <w:pPr>
+        <w:pStyle w:val="Paragraphedeliste"/>
+        <w:numPr>
+          <w:ilvl w:val="0"/>
+          <w:numId w:val="1"/>
+        </w:numPr>
+        <w:spacing w:after="80"/>
+      </w:pPr>
+      <w:r>
+        <w:t>Au-dessus de chaque colonne du CSV importé, placez un menu déroulant (Dropdown) permettant de lier cette colonne à un champ système de Fondora :</w:t>
+      </w:r>
+    </w:p>
+    <w:p>
+      <w:pPr>
+        <w:pStyle w:val="Paragraphedeliste"/>
+        <w:numPr>
+          <w:ilvl w:val="0"/>
+          <w:numId w:val="1"/>
+        </w:numPr>
+        <w:spacing w:after="80"/>
+      </w:pPr>
+      <w:r>
+        <w:rPr>
+          <w:rFonts w:ascii="Segoe UI Emoji" w:hAnsi="Segoe UI Emoji" w:cs="Segoe UI Emoji"/>
+        </w:rPr>
+        <w:t>📅</w:t>
+      </w:r>
+      <w:r>
+        <w:t xml:space="preserve"> </w:t>
+      </w:r>
+      <w:r>
+        <w:rPr>
+          <w:b/>
+          <w:bCs/>
+        </w:rPr>
+        <w:t>Date</w:t>
+      </w:r>
+    </w:p>
+    <w:p>
+      <w:pPr>
+        <w:pStyle w:val="Paragraphedeliste"/>
+        <w:numPr>
+          <w:ilvl w:val="0"/>
+          <w:numId w:val="1"/>
+        </w:numPr>
+        <w:spacing w:after="80"/>
+      </w:pPr>
+      <w:r>
+        <w:rPr>
+          <w:rFonts w:ascii="Segoe UI Emoji" w:hAnsi="Segoe UI Emoji" w:cs="Segoe UI Emoji"/>
+        </w:rPr>
+        <w:t>📝</w:t>
+      </w:r>
+      <w:r>
+        <w:t xml:space="preserve"> </w:t>
+      </w:r>
+      <w:r>
+        <w:rPr>
+          <w:b/>
+          <w:bCs/>
+        </w:rPr>
+        <w:t>Description / Libellé</w:t>
+      </w:r>
+    </w:p>
+    <w:p>
+      <w:pPr>
+        <w:pStyle w:val="Paragraphedeliste"/>
+        <w:numPr>
+          <w:ilvl w:val="0"/>
+          <w:numId w:val="1"/>
+        </w:numPr>
+        <w:spacing w:after="80"/>
+      </w:pPr>
+      <w:r>
+        <w:rPr>
+          <w:rFonts w:ascii="Segoe UI Emoji" w:hAnsi="Segoe UI Emoji" w:cs="Segoe UI Emoji"/>
+        </w:rPr>
+        <w:t>💰</w:t>
+      </w:r>
+      <w:r>
+        <w:t xml:space="preserve"> </w:t>
+      </w:r>
+      <w:r>
+        <w:rPr>
+          <w:b/>
+          <w:bCs/>
+        </w:rPr>
+        <w:t>Montant</w:t>
+      </w:r>
+      <w:r>
+        <w:t xml:space="preserve"> (ou colonnes séparées Débit / Crédit)</w:t>
+      </w:r>
+    </w:p>
+    <w:p>
+      <w:pPr>
+        <w:pStyle w:val="Paragraphedeliste"/>
+        <w:numPr>
+          <w:ilvl w:val="0"/>
+          <w:numId w:val="1"/>
+        </w:numPr>
+        <w:spacing w:after="80"/>
+      </w:pPr>
+      <w:r>
+        <w:rPr>
+          <w:rFonts w:ascii="Segoe UI Emoji" w:hAnsi="Segoe UI Emoji" w:cs="Segoe UI Emoji"/>
+        </w:rPr>
+        <w:t>📂</w:t>
+      </w:r>
+      <w:r>
+        <w:t xml:space="preserve"> </w:t>
+      </w:r>
+      <w:r>
+        <w:rPr>
+          <w:b/>
+          <w:bCs/>
+        </w:rPr>
+        <w:t>Catégorie</w:t>
+      </w:r>
+      <w:r>
+        <w:t xml:space="preserve"> </w:t>
+      </w:r>
+      <w:r>
+        <w:rPr>
+          <w:i/>
+          <w:iCs/>
+        </w:rPr>
+        <w:t>(optionnel)</w:t>
+      </w:r>
+    </w:p>
+    <w:p>
+      <w:pPr>
+        <w:pStyle w:val="Paragraphedeliste"/>
+        <w:numPr>
+          <w:ilvl w:val="0"/>
+          <w:numId w:val="1"/>
+        </w:numPr>
+        <w:spacing w:after="80"/>
+      </w:pPr>
+      <w:r>
+        <w:rPr>
+          <w:b/>
+          <w:bCs/>
+        </w:rPr>
+        <w:t>Sauvegarde intelligente du template (User UX) :</w:t>
+      </w:r>
+    </w:p>
+    <w:p>
+      <w:pPr>
+        <w:pStyle w:val="Paragraphedeliste"/>
+        <w:numPr>
+          <w:ilvl w:val="0"/>
+          <w:numId w:val="1"/>
+        </w:numPr>
+        <w:spacing w:after="80"/>
+      </w:pPr>
+      <w:r>
+        <w:t xml:space="preserve">Dès que l'utilisateur valide son mapping personnalisé, affichez une case à cocher : </w:t>
+      </w:r>
+      <w:r>
+        <w:rPr>
+          <w:i/>
+          <w:iCs/>
+        </w:rPr>
+        <w:t>"Sauvegarder ce format d'import pour mes futurs fichiers"</w:t>
+      </w:r>
+      <w:r>
+        <w:t>.</w:t>
+      </w:r>
+    </w:p>
+    <w:p>
+      <w:pPr>
+        <w:pStyle w:val="Paragraphedeliste"/>
+        <w:numPr>
+          <w:ilvl w:val="0"/>
+          <w:numId w:val="1"/>
+        </w:numPr>
+        <w:spacing w:after="80"/>
+      </w:pPr>
+      <w:r>
+        <w:t xml:space="preserve">Si cochée, ouvrez un petit champ texte pré-rempli : </w:t>
+      </w:r>
+      <w:r>
+        <w:rPr>
+          <w:i/>
+          <w:iCs/>
+        </w:rPr>
+        <w:t>"Donnez un nom à ce format (ex: Mon compte pro Crédit Mutuel)"</w:t>
+      </w:r>
+      <w:r>
+        <w:t>.</w:t>
+      </w:r>
+    </w:p>
+    <w:p>
+      <w:pPr>
+        <w:pStyle w:val="Paragraphedeliste"/>
+        <w:numPr>
+          <w:ilvl w:val="0"/>
+          <w:numId w:val="1"/>
+        </w:numPr>
+        <w:spacing w:after="80"/>
+      </w:pPr>
+      <w:r>
+        <w:t xml:space="preserve">Enregistrez ce template dans une nouvelle table Supabase import_templates (id, user_id, nom_template, mapping_json). Lors du prochain import d'un fichier non reconnu, Fondora proposera : </w:t>
+      </w:r>
+      <w:r>
+        <w:rPr>
+          <w:i/>
+          <w:iCs/>
+        </w:rPr>
+        <w:t>"Appliquer le format sauvegardé : [Nom du template]"</w:t>
+      </w:r>
+      <w:r>
+        <w:t>.</w:t>
+      </w:r>
+    </w:p>
+    <w:p>
+      <w:pPr>
+        <w:pStyle w:val="Paragraphedeliste"/>
+        <w:numPr>
+          <w:ilvl w:val="0"/>
+          <w:numId w:val="1"/>
+        </w:numPr>
+        <w:spacing w:after="80"/>
+        <w:rPr>
+          <w:b/>
+          <w:bCs/>
+        </w:rPr>
+      </w:pPr>
+      <w:r>
+        <w:rPr>
+          <w:b/>
+          <w:bCs/>
+        </w:rPr>
+        <w:t>4. Moteur de Catégorisation Smart &amp; Apprentissage (Smart Rules)</w:t>
+      </w:r>
+    </w:p>
+    <w:p>
+      <w:pPr>
+        <w:pStyle w:val="Paragraphedeliste"/>
+        <w:numPr>
+          <w:ilvl w:val="0"/>
+          <w:numId w:val="1"/>
+        </w:numPr>
+        <w:spacing w:after="80"/>
+      </w:pPr>
+      <w:r>
+        <w:t>Pour que l'importation soit magique, l'attribution des catégories doit se faire en arrière-plan sans effort :</w:t>
+      </w:r>
+    </w:p>
+    <w:p>
+      <w:pPr>
+        <w:pStyle w:val="Paragraphedeliste"/>
+        <w:numPr>
+          <w:ilvl w:val="0"/>
+          <w:numId w:val="1"/>
+        </w:numPr>
+        <w:spacing w:after="80"/>
+      </w:pPr>
+      <w:r>
+        <w:rPr>
+          <w:b/>
+          <w:bCs/>
+        </w:rPr>
+        <w:t>Les Smart Rules Globales et Utilisateur :</w:t>
+      </w:r>
+    </w:p>
+    <w:p>
+      <w:pPr>
+        <w:pStyle w:val="Paragraphedeliste"/>
+        <w:numPr>
+          <w:ilvl w:val="0"/>
+          <w:numId w:val="1"/>
+        </w:numPr>
+        <w:spacing w:after="80"/>
+      </w:pPr>
+      <w:r>
+        <w:t xml:space="preserve">Créez une table smart_rules (id, user_id, pattern_recherche </w:t>
+      </w:r>
+      <w:r>
+        <w:rPr>
+          <w:i/>
+          <w:iCs/>
+        </w:rPr>
+        <w:t>(ex: "NETFLIX")</w:t>
+      </w:r>
+      <w:r>
+        <w:t>, categorie_id).</w:t>
+      </w:r>
+    </w:p>
+    <w:p>
+      <w:pPr>
+        <w:pStyle w:val="Paragraphedeliste"/>
+        <w:numPr>
+          <w:ilvl w:val="0"/>
+          <w:numId w:val="1"/>
+        </w:numPr>
+        <w:spacing w:after="80"/>
+      </w:pPr>
+      <w:r>
+        <w:t>Lors de l'import, le système analyse le libellé de la transaction :</w:t>
+      </w:r>
+    </w:p>
+    <w:p>
+      <w:pPr>
+        <w:pStyle w:val="Paragraphedeliste"/>
+        <w:numPr>
+          <w:ilvl w:val="0"/>
+          <w:numId w:val="1"/>
+        </w:numPr>
+        <w:spacing w:after="80"/>
+      </w:pPr>
+      <w:r>
+        <w:t xml:space="preserve">Si le libellé contient un mot-clé connu de la table globale ou de l'utilisateur, la catégorie est appliquée automatiquement. </w:t>
+      </w:r>
+    </w:p>
+    <w:p>
+      <w:pPr>
+        <w:pStyle w:val="Paragraphedeliste"/>
+        <w:numPr>
+          <w:ilvl w:val="0"/>
+          <w:numId w:val="1"/>
+        </w:numPr>
+        <w:spacing w:after="80"/>
+      </w:pPr>
+      <w:r>
+        <w:rPr>
+          <w:b/>
+          <w:bCs/>
+        </w:rPr>
+        <w:t>Algorithme de similarité textuelle :</w:t>
+      </w:r>
+      <w:r>
+        <w:t xml:space="preserve"> Pour aller plus loin, utilisez un algorithme simple de distance de Levenshtein ou de similarité (par exemple, </w:t>
+      </w:r>
+      <w:r>
+        <w:rPr>
+          <w:i/>
+          <w:iCs/>
+        </w:rPr>
+        <w:t>"Leclerc"</w:t>
+      </w:r>
+      <w:r>
+        <w:t xml:space="preserve">, </w:t>
+      </w:r>
+      <w:r>
+        <w:rPr>
+          <w:i/>
+          <w:iCs/>
+        </w:rPr>
+        <w:t>"E.Leclerc"</w:t>
+      </w:r>
+      <w:r>
+        <w:t xml:space="preserve">, </w:t>
+      </w:r>
+      <w:r>
+        <w:rPr>
+          <w:i/>
+          <w:iCs/>
+        </w:rPr>
+        <w:t>"LECLERC DIS"</w:t>
+      </w:r>
+      <w:r>
+        <w:t xml:space="preserve"> doivent tous être associés à la catégorie </w:t>
+      </w:r>
+      <w:r>
+        <w:rPr>
+          <w:i/>
+          <w:iCs/>
+        </w:rPr>
+        <w:t>Alimentation/Supermarché</w:t>
+      </w:r>
+      <w:r>
+        <w:t xml:space="preserve"> si l'utilisateur l'a déjà fait une fois).</w:t>
+      </w:r>
+    </w:p>
+    <w:p>
+      <w:pPr>
+        <w:pStyle w:val="Paragraphedeliste"/>
+        <w:numPr>
+          <w:ilvl w:val="0"/>
+          <w:numId w:val="1"/>
+        </w:numPr>
+        <w:spacing w:after="80"/>
+      </w:pPr>
+      <w:r>
+        <w:rPr>
+          <w:b/>
+          <w:bCs/>
+        </w:rPr>
+        <w:t>Popup d'apprentissage "Quelle catégorie ?" :</w:t>
+      </w:r>
+    </w:p>
+    <w:p>
+      <w:pPr>
+        <w:pStyle w:val="Paragraphedeliste"/>
+        <w:numPr>
+          <w:ilvl w:val="0"/>
+          <w:numId w:val="1"/>
+        </w:numPr>
+        <w:spacing w:after="80"/>
+      </w:pPr>
+      <w:r>
+        <w:t xml:space="preserve">Si une transaction n'est pas reconnue, laissez sa catégorie vide (ou "À catégoriser" avec un badge jaune). </w:t>
+      </w:r>
+    </w:p>
+    <w:p>
+      <w:pPr>
+        <w:pStyle w:val="Paragraphedeliste"/>
+        <w:numPr>
+          <w:ilvl w:val="0"/>
+          <w:numId w:val="1"/>
+        </w:numPr>
+        <w:spacing w:after="80"/>
+      </w:pPr>
+      <w:r>
+        <w:t xml:space="preserve">Lors de la validation de l'import, une modal synthétique ou un panneau latéral liste ces transactions non reconnues. </w:t>
+      </w:r>
+    </w:p>
+    <w:p>
+      <w:pPr>
+        <w:pStyle w:val="Paragraphedeliste"/>
+        <w:numPr>
+          <w:ilvl w:val="0"/>
+          <w:numId w:val="1"/>
+        </w:numPr>
+        <w:spacing w:after="80"/>
+      </w:pPr>
+      <w:r>
+        <w:t xml:space="preserve">Dès que l'utilisateur attribue une catégorie à l'une d'elles, une popup discrète lui demande : </w:t>
+      </w:r>
+      <w:r>
+        <w:rPr>
+          <w:i/>
+          <w:iCs/>
+        </w:rPr>
+        <w:t>"Voulez-vous toujours associer les transactions contenant '[Mot-clef]' à la catégorie [Catégorie] ?"</w:t>
+      </w:r>
+      <w:r>
+        <w:t xml:space="preserve">. Si oui, une nouvelle règle smart_rule est créée instantanément en base de données pour automatiser les futurs imports. </w:t>
+      </w:r>
+    </w:p>
+    <w:p>
+      <w:pPr>
+        <w:pStyle w:val="Paragraphedeliste"/>
+        <w:numPr>
+          <w:ilvl w:val="0"/>
+          <w:numId w:val="1"/>
+        </w:numPr>
+        <w:spacing w:after="80"/>
+        <w:rPr>
+          <w:b/>
+          <w:bCs/>
+        </w:rPr>
+      </w:pPr>
+      <w:r>
+        <w:rPr>
+          <w:b/>
+          <w:bCs/>
+        </w:rPr>
+        <w:t>5. L'Écran de "Revue d'Importation" (L'atout Pro)</w:t>
+      </w:r>
+    </w:p>
+    <w:p>
+      <w:pPr>
+        <w:pStyle w:val="Paragraphedeliste"/>
+        <w:numPr>
+          <w:ilvl w:val="0"/>
+          <w:numId w:val="1"/>
+        </w:numPr>
+        <w:spacing w:after="80"/>
+      </w:pPr>
+      <w:r>
+        <w:t>Ne versez jamais les transactions directement en base de données sans validation. Le workflow professionnel par excellence est le suivant :</w:t>
+      </w:r>
+    </w:p>
+    <w:p>
+      <w:pPr>
+        <w:pStyle w:val="Paragraphedeliste"/>
+        <w:numPr>
+          <w:ilvl w:val="0"/>
+          <w:numId w:val="1"/>
+        </w:numPr>
+        <w:spacing w:after="80"/>
+      </w:pPr>
+      <w:r>
+        <w:rPr>
+          <w:b/>
+          <w:bCs/>
+        </w:rPr>
+        <w:t>Upload :</w:t>
+      </w:r>
+      <w:r>
+        <w:t xml:space="preserve"> L'utilisateur dépose son CSV.</w:t>
+      </w:r>
+    </w:p>
+    <w:p>
+      <w:pPr>
+        <w:pStyle w:val="Paragraphedeliste"/>
+        <w:numPr>
+          <w:ilvl w:val="0"/>
+          <w:numId w:val="1"/>
+        </w:numPr>
+        <w:spacing w:after="80"/>
+      </w:pPr>
+      <w:r>
+        <w:rPr>
+          <w:b/>
+          <w:bCs/>
+        </w:rPr>
+        <w:t>Simulation &amp; Revue (L'étape clé) :</w:t>
+      </w:r>
+      <w:r>
+        <w:t xml:space="preserve"> * Fondora n'enregistre rien encore. L'application affiche un écran de transition intitulé </w:t>
+      </w:r>
+      <w:r>
+        <w:rPr>
+          <w:b/>
+          <w:bCs/>
+        </w:rPr>
+        <w:t>"Revue de votre import"</w:t>
+      </w:r>
+      <w:r>
+        <w:t>.</w:t>
+      </w:r>
+    </w:p>
+    <w:p>
+      <w:pPr>
+        <w:pStyle w:val="Paragraphedeliste"/>
+        <w:numPr>
+          <w:ilvl w:val="0"/>
+          <w:numId w:val="1"/>
+        </w:numPr>
+        <w:spacing w:after="80"/>
+      </w:pPr>
+      <w:r>
+        <w:t>Cet écran montre la liste de toutes les transactions prêtes à être importées.</w:t>
+      </w:r>
+    </w:p>
+    <w:p>
+      <w:pPr>
+        <w:pStyle w:val="Paragraphedeliste"/>
+        <w:numPr>
+          <w:ilvl w:val="0"/>
+          <w:numId w:val="1"/>
+        </w:numPr>
+        <w:spacing w:after="80"/>
+      </w:pPr>
+      <w:r>
+        <w:lastRenderedPageBreak/>
+        <w:t>Les transactions automatiquement catégorisées ont un badge vert. Celles incertaines ont un badge orange ou vide.</w:t>
+      </w:r>
+    </w:p>
+    <w:p>
+      <w:pPr>
+        <w:pStyle w:val="Paragraphedeliste"/>
+        <w:numPr>
+          <w:ilvl w:val="0"/>
+          <w:numId w:val="1"/>
+        </w:numPr>
+        <w:spacing w:after="80"/>
+      </w:pPr>
+      <w:r>
+        <w:rPr>
+          <w:b/>
+          <w:bCs/>
+        </w:rPr>
+        <w:t>Actions de masse (Modification par lot) :</w:t>
+      </w:r>
+    </w:p>
+    <w:p>
+      <w:pPr>
+        <w:pStyle w:val="Paragraphedeliste"/>
+        <w:numPr>
+          <w:ilvl w:val="0"/>
+          <w:numId w:val="1"/>
+        </w:numPr>
+        <w:spacing w:after="80"/>
+      </w:pPr>
+      <w:r>
+        <w:t xml:space="preserve">Des cases à cocher à gauche de chaque ligne permettent d'en sélectionner plusieurs (ou d'utiliser un bouton </w:t>
+      </w:r>
+      <w:r>
+        <w:rPr>
+          <w:i/>
+          <w:iCs/>
+        </w:rPr>
+        <w:t>"Tout sélectionner"</w:t>
+      </w:r>
+      <w:r>
+        <w:t>).</w:t>
+      </w:r>
+    </w:p>
+    <w:p>
+      <w:pPr>
+        <w:pStyle w:val="Paragraphedeliste"/>
+        <w:numPr>
+          <w:ilvl w:val="0"/>
+          <w:numId w:val="1"/>
+        </w:numPr>
+        <w:spacing w:after="80"/>
+      </w:pPr>
+      <w:r>
+        <w:t>Un bandeau d'action rapide apparaît en bas de l'écran dès qu'au moins 2 transactions sont cochées :</w:t>
+      </w:r>
+    </w:p>
+    <w:p>
+      <w:pPr>
+        <w:pStyle w:val="Paragraphedeliste"/>
+        <w:numPr>
+          <w:ilvl w:val="0"/>
+          <w:numId w:val="1"/>
+        </w:numPr>
+        <w:spacing w:after="80"/>
+      </w:pPr>
+      <w:r>
+        <w:rPr>
+          <w:b/>
+          <w:bCs/>
+        </w:rPr>
+        <w:t>"Changer la catégorie"</w:t>
+      </w:r>
+      <w:r>
+        <w:t xml:space="preserve"> </w:t>
+      </w:r>
+      <w:r>
+        <w:rPr>
+          <w:rFonts w:ascii="Segoe UI Emoji" w:hAnsi="Segoe UI Emoji" w:cs="Segoe UI Emoji"/>
+        </w:rPr>
+        <w:t>📂</w:t>
+      </w:r>
+      <w:r>
+        <w:t xml:space="preserve"> (permet d'attribuer </w:t>
+      </w:r>
+      <w:r>
+        <w:rPr>
+          <w:i/>
+          <w:iCs/>
+        </w:rPr>
+        <w:t>Transports</w:t>
+      </w:r>
+      <w:r>
+        <w:t xml:space="preserve"> à 15 lignes de péages ou de billets de train d'un seul coup). </w:t>
+      </w:r>
+    </w:p>
+    <w:p>
+      <w:pPr>
+        <w:pStyle w:val="Paragraphedeliste"/>
+        <w:numPr>
+          <w:ilvl w:val="0"/>
+          <w:numId w:val="1"/>
+        </w:numPr>
+        <w:spacing w:after="80"/>
+      </w:pPr>
+      <w:r>
+        <w:rPr>
+          <w:b/>
+          <w:bCs/>
+        </w:rPr>
+        <w:t>"Changer le compte associé"</w:t>
+      </w:r>
+      <w:r>
+        <w:t xml:space="preserve"> </w:t>
+      </w:r>
+      <w:r>
+        <w:rPr>
+          <w:rFonts w:ascii="Segoe UI Emoji" w:hAnsi="Segoe UI Emoji" w:cs="Segoe UI Emoji"/>
+        </w:rPr>
+        <w:t>💳</w:t>
+      </w:r>
+      <w:r>
+        <w:t>.</w:t>
+      </w:r>
+    </w:p>
+    <w:p>
+      <w:pPr>
+        <w:pStyle w:val="Paragraphedeliste"/>
+        <w:numPr>
+          <w:ilvl w:val="0"/>
+          <w:numId w:val="1"/>
+        </w:numPr>
+        <w:spacing w:after="80"/>
+      </w:pPr>
+      <w:r>
+        <w:rPr>
+          <w:b/>
+          <w:bCs/>
+        </w:rPr>
+        <w:t>"Supprimer de l'import"</w:t>
+      </w:r>
+      <w:r>
+        <w:t xml:space="preserve"> </w:t>
+      </w:r>
+      <w:r>
+        <w:rPr>
+          <w:rFonts w:ascii="Segoe UI Symbol" w:hAnsi="Segoe UI Symbol" w:cs="Segoe UI Symbol"/>
+        </w:rPr>
+        <w:t>🗑</w:t>
+      </w:r>
+      <w:r>
+        <w:t>️ (pour écarter des lignes qu'on ne veut pas importer).</w:t>
+      </w:r>
+    </w:p>
+    <w:p>
+      <w:pPr>
+        <w:pStyle w:val="Paragraphedeliste"/>
+        <w:numPr>
+          <w:ilvl w:val="0"/>
+          <w:numId w:val="1"/>
+        </w:numPr>
+        <w:spacing w:after="80"/>
+      </w:pPr>
+      <w:r>
+        <w:rPr>
+          <w:b/>
+          <w:bCs/>
+        </w:rPr>
+        <w:t>Validation :</w:t>
+      </w:r>
+      <w:r>
+        <w:t xml:space="preserve"> L'utilisateur clique sur </w:t>
+      </w:r>
+      <w:r>
+        <w:rPr>
+          <w:i/>
+          <w:iCs/>
+        </w:rPr>
+        <w:t>"Confirmer l'import de X transactions"</w:t>
+      </w:r>
+      <w:r>
+        <w:t>. Les données sont insérées de manière groupée (Bulk Insert) dans Supabase en une seule requête pour une performance optimale.</w:t>
+      </w:r>
+    </w:p>
+    <w:p>
+      <w:pPr>
+        <w:pStyle w:val="Paragraphedeliste"/>
+        <w:numPr>
+          <w:ilvl w:val="0"/>
+          <w:numId w:val="1"/>
+        </w:numPr>
+        <w:spacing w:after="80"/>
+        <w:rPr>
+          <w:b/>
+          <w:bCs/>
+        </w:rPr>
+      </w:pPr>
+      <w:r>
+        <w:rPr>
+          <w:b/>
+          <w:bCs/>
+        </w:rPr>
+        <w:t>6. Architecture de Base de Données Suggérée (PostgreSQL / Supabase)</w:t>
+      </w:r>
+    </w:p>
+    <w:p>
+      <w:pPr>
+        <w:pStyle w:val="Paragraphedeliste"/>
+        <w:numPr>
+          <w:ilvl w:val="0"/>
+          <w:numId w:val="1"/>
+        </w:numPr>
+        <w:spacing w:after="80"/>
+      </w:pPr>
+      <w:r>
+        <w:t>Pour supporter ces fonctionnalités avancées, voici la structure SQL à déployer dans Supabase :</w:t>
+      </w:r>
+    </w:p>
+    <w:p>
+      <w:pPr>
+        <w:pStyle w:val="Paragraphedeliste"/>
+        <w:numPr>
+          <w:ilvl w:val="0"/>
+          <w:numId w:val="1"/>
+        </w:numPr>
+        <w:spacing w:after="80"/>
+      </w:pPr>
+      <w:r>
+        <w:t>SQL</w:t>
+      </w:r>
+    </w:p>
+    <w:p>
+      <w:pPr>
+        <w:pStyle w:val="Paragraphedeliste"/>
+        <w:numPr>
+          <w:ilvl w:val="0"/>
+          <w:numId w:val="1"/>
+        </w:numPr>
+        <w:spacing w:after="80"/>
+      </w:pPr>
+      <w:r>
+        <w:t>-- Table pour stocker les templates de mapping personnalisés des utilisateurs</w:t>
+      </w:r>
+    </w:p>
+    <w:p>
+      <w:pPr>
+        <w:pStyle w:val="Paragraphedeliste"/>
+        <w:numPr>
+          <w:ilvl w:val="0"/>
+          <w:numId w:val="1"/>
+        </w:numPr>
+        <w:spacing w:after="80"/>
+      </w:pPr>
+      <w:r>
+        <w:t>CREATE TABLE import_templates (</w:t>
+      </w:r>
+    </w:p>
+    <w:p>
+      <w:pPr>
+        <w:pStyle w:val="Paragraphedeliste"/>
+        <w:numPr>
+          <w:ilvl w:val="0"/>
+          <w:numId w:val="1"/>
+        </w:numPr>
+        <w:spacing w:after="80"/>
+      </w:pPr>
+      <w:r>
+        <w:t xml:space="preserve">    id UUID DEFAULT gen_random_uuid() PRIMARY KEY,</w:t>
+      </w:r>
+    </w:p>
+    <w:p>
+      <w:pPr>
+        <w:pStyle w:val="Paragraphedeliste"/>
+        <w:numPr>
+          <w:ilvl w:val="0"/>
+          <w:numId w:val="1"/>
+        </w:numPr>
+        <w:spacing w:after="80"/>
+      </w:pPr>
+      <w:r>
+        <w:t xml:space="preserve">    user_id UUID REFERENCES auth.users(id) ON DELETE CASCADE NOT NULL,</w:t>
+      </w:r>
+    </w:p>
+    <w:p>
+      <w:pPr>
+        <w:pStyle w:val="Paragraphedeliste"/>
+        <w:numPr>
+          <w:ilvl w:val="0"/>
+          <w:numId w:val="1"/>
+        </w:numPr>
+        <w:spacing w:after="80"/>
+      </w:pPr>
+      <w:r>
+        <w:t xml:space="preserve">    nom_template TEXT NOT NULL,</w:t>
+      </w:r>
+    </w:p>
+    <w:p>
+      <w:pPr>
+        <w:pStyle w:val="Paragraphedeliste"/>
+        <w:numPr>
+          <w:ilvl w:val="0"/>
+          <w:numId w:val="1"/>
+        </w:numPr>
+        <w:spacing w:after="80"/>
+      </w:pPr>
+      <w:r>
+        <w:t xml:space="preserve">    -- Stocke la configuration des colonnes : { "date": 0, "libelle": 1, "montant": 2 }</w:t>
+      </w:r>
+    </w:p>
+    <w:p>
+      <w:pPr>
+        <w:pStyle w:val="Paragraphedeliste"/>
+        <w:numPr>
+          <w:ilvl w:val="0"/>
+          <w:numId w:val="1"/>
+        </w:numPr>
+        <w:spacing w:after="80"/>
+      </w:pPr>
+      <w:r>
+        <w:t xml:space="preserve">    mapping_config JSONB NOT NULL,</w:t>
+      </w:r>
+    </w:p>
+    <w:p>
+      <w:pPr>
+        <w:pStyle w:val="Paragraphedeliste"/>
+        <w:numPr>
+          <w:ilvl w:val="0"/>
+          <w:numId w:val="1"/>
+        </w:numPr>
+        <w:spacing w:after="80"/>
+      </w:pPr>
+      <w:r>
+        <w:t xml:space="preserve">    created_at TIMESTAMP WITH TIME ZONE DEFAULT NOW()</w:t>
+      </w:r>
+    </w:p>
+    <w:p>
+      <w:pPr>
+        <w:pStyle w:val="Paragraphedeliste"/>
+        <w:numPr>
+          <w:ilvl w:val="0"/>
+          <w:numId w:val="1"/>
+        </w:numPr>
+        <w:spacing w:after="80"/>
+      </w:pPr>
+      <w:r>
+        <w:t>);</w:t>
+      </w:r>
+    </w:p>
+    <w:p>
+      <w:pPr>
+        <w:pStyle w:val="Paragraphedeliste"/>
+        <w:numPr>
+          <w:ilvl w:val="0"/>
+          <w:numId w:val="1"/>
+        </w:numPr>
+        <w:spacing w:after="80"/>
+      </w:pPr>
+    </w:p>
+    <w:p>
+      <w:pPr>
+        <w:pStyle w:val="Paragraphedeliste"/>
+        <w:numPr>
+          <w:ilvl w:val="0"/>
+          <w:numId w:val="1"/>
+        </w:numPr>
+        <w:spacing w:after="80"/>
+      </w:pPr>
+      <w:r>
+        <w:t>-- Table pour le moteur de catégorisation automatique (Smart Rules)</w:t>
+      </w:r>
+    </w:p>
+    <w:p>
+      <w:pPr>
+        <w:pStyle w:val="Paragraphedeliste"/>
+        <w:numPr>
+          <w:ilvl w:val="0"/>
+          <w:numId w:val="1"/>
+        </w:numPr>
+        <w:spacing w:after="80"/>
+      </w:pPr>
+      <w:r>
+        <w:t>CREATE TABLE smart_rules (</w:t>
+      </w:r>
+    </w:p>
+    <w:p>
+      <w:pPr>
+        <w:pStyle w:val="Paragraphedeliste"/>
+        <w:numPr>
+          <w:ilvl w:val="0"/>
+          <w:numId w:val="1"/>
+        </w:numPr>
+        <w:spacing w:after="80"/>
+      </w:pPr>
+      <w:r>
+        <w:t xml:space="preserve">    id UUID DEFAULT gen_random_uuid() PRIMARY KEY,</w:t>
+      </w:r>
+    </w:p>
+    <w:p>
+      <w:pPr>
+        <w:pStyle w:val="Paragraphedeliste"/>
+        <w:numPr>
+          <w:ilvl w:val="0"/>
+          <w:numId w:val="1"/>
+        </w:numPr>
+        <w:spacing w:after="80"/>
+      </w:pPr>
+      <w:r>
+        <w:t xml:space="preserve">    user_id UUID REFERENCES auth.users(id) ON DELETE CASCADE NOT NULL,</w:t>
+      </w:r>
+    </w:p>
+    <w:p>
+      <w:pPr>
+        <w:pStyle w:val="Paragraphedeliste"/>
+        <w:numPr>
+          <w:ilvl w:val="0"/>
+          <w:numId w:val="1"/>
+        </w:numPr>
+        <w:spacing w:after="80"/>
+      </w:pPr>
+      <w:r>
+        <w:t xml:space="preserve">    pattern TEXT NOT NULL, -- ex: "Spotify", "Uber", "Total"</w:t>
+      </w:r>
+    </w:p>
+    <w:p>
+      <w:pPr>
+        <w:pStyle w:val="Paragraphedeliste"/>
+        <w:numPr>
+          <w:ilvl w:val="0"/>
+          <w:numId w:val="1"/>
+        </w:numPr>
+        <w:spacing w:after="80"/>
+      </w:pPr>
+      <w:r>
+        <w:t xml:space="preserve">    categorie_id UUID REFERENCES categories(id) ON DELETE CASCADE NOT NULL,</w:t>
+      </w:r>
+    </w:p>
+    <w:p>
+      <w:pPr>
+        <w:pStyle w:val="Paragraphedeliste"/>
+        <w:numPr>
+          <w:ilvl w:val="0"/>
+          <w:numId w:val="1"/>
+        </w:numPr>
+        <w:spacing w:after="80"/>
+      </w:pPr>
+      <w:r>
+        <w:t xml:space="preserve">    created_at TIMESTAMP WITH TIME ZONE DEFAULT NOW(),</w:t>
+      </w:r>
+    </w:p>
+    <w:p>
+      <w:pPr>
+        <w:pStyle w:val="Paragraphedeliste"/>
+        <w:numPr>
+          <w:ilvl w:val="0"/>
+          <w:numId w:val="1"/>
+        </w:numPr>
+        <w:spacing w:after="80"/>
+      </w:pPr>
+      <w:r>
+        <w:t xml:space="preserve">    -- Évite les règles redondantes pour un même utilisateur sur un même mot-clé</w:t>
+      </w:r>
+    </w:p>
+    <w:p>
+      <w:pPr>
+        <w:pStyle w:val="Paragraphedeliste"/>
+        <w:numPr>
+          <w:ilvl w:val="0"/>
+          <w:numId w:val="1"/>
+        </w:numPr>
+        <w:spacing w:after="80"/>
+      </w:pPr>
+      <w:r>
+        <w:t xml:space="preserve">    CONSTRAINT unique_user_pattern UNIQUE (user_id, pattern)</w:t>
+      </w:r>
+    </w:p>
+    <w:p>
+      <w:pPr>
+        <w:pStyle w:val="Paragraphedeliste"/>
+        <w:numPr>
+          <w:ilvl w:val="0"/>
+          <w:numId w:val="1"/>
+        </w:numPr>
+        <w:spacing w:after="80"/>
+      </w:pPr>
+      <w:r>
+        <w:t>);</w:t>
+      </w:r>
+    </w:p>
+    <w:p>
+      <w:pPr>
+        <w:pStyle w:val="Paragraphedeliste"/>
+        <w:numPr>
+          <w:ilvl w:val="0"/>
+          <w:numId w:val="1"/>
+        </w:numPr>
+        <w:spacing w:after="80"/>
+      </w:pPr>
+    </w:p>
+    <w:p>
+      <w:pPr>
+        <w:pStyle w:val="Paragraphedeliste"/>
+        <w:numPr>
+          <w:ilvl w:val="0"/>
+          <w:numId w:val="1"/>
+        </w:numPr>
+        <w:spacing w:after="80"/>
+      </w:pPr>
+      <w:r>
+        <w:t>-- Index pour accélérer la recherche des patterns lors du parsing</w:t>
+      </w:r>
+    </w:p>
+    <w:p>
+      <w:pPr>
+        <w:pStyle w:val="Paragraphedeliste"/>
+        <w:numPr>
+          <w:ilvl w:val="0"/>
+          <w:numId w:val="1"/>
+        </w:numPr>
+        <w:spacing w:after="80"/>
+      </w:pPr>
+      <w:r>
+        <w:t>CREATE INDEX idx_smart_rules_pattern ON smart_rules(user_id, pattern);</w:t>
+      </w:r>
+    </w:p>
+    <w:p>
+      <w:pPr>
+        <w:pStyle w:val="Paragraphedeliste"/>
+        <w:numPr>
+          <w:ilvl w:val="0"/>
+          <w:numId w:val="1"/>
+        </w:numPr>
+        <w:spacing w:after="80"/>
+        <w:rPr>
+          <w:b/>
+          <w:bCs/>
+        </w:rPr>
+      </w:pPr>
+      <w:r>
+        <w:rPr>
+          <w:b/>
+          <w:bCs/>
+        </w:rPr>
+        <w:t>Synthèse de l'expérience utilisateur cible (Flow idéal) :</w:t>
+      </w:r>
+    </w:p>
+    <w:p>
+      <w:pPr>
+        <w:pStyle w:val="Paragraphedeliste"/>
+        <w:numPr>
+          <w:ilvl w:val="0"/>
+          <w:numId w:val="1"/>
+        </w:numPr>
+        <w:spacing w:after="80"/>
+      </w:pPr>
+      <w:r>
+        <w:t xml:space="preserve">[Déposer le CSV] </w:t>
+      </w:r>
+    </w:p>
+    <w:p>
+      <w:pPr>
+        <w:pStyle w:val="Paragraphedeliste"/>
+        <w:numPr>
+          <w:ilvl w:val="0"/>
+          <w:numId w:val="1"/>
+        </w:numPr>
+        <w:spacing w:after="80"/>
+      </w:pPr>
+      <w:r>
+        <w:t xml:space="preserve">       │</w:t>
+      </w:r>
+    </w:p>
+    <w:p>
+      <w:pPr>
+        <w:pStyle w:val="Paragraphedeliste"/>
+        <w:numPr>
+          <w:ilvl w:val="0"/>
+          <w:numId w:val="1"/>
+        </w:numPr>
+        <w:spacing w:after="80"/>
+      </w:pPr>
+      <w:r>
+        <w:t xml:space="preserve">       </w:t>
+      </w:r>
+      <w:r>
+        <w:rPr>
+          <w:rFonts w:ascii="Arial" w:hAnsi="Arial" w:cs="Arial"/>
+        </w:rPr>
+        <w:t>▼</w:t>
+      </w:r>
+    </w:p>
+    <w:p>
+      <w:pPr>
+        <w:pStyle w:val="Paragraphedeliste"/>
+        <w:numPr>
+          <w:ilvl w:val="0"/>
+          <w:numId w:val="1"/>
+        </w:numPr>
+        <w:spacing w:after="80"/>
+      </w:pPr>
+      <w:r>
+        <w:t>[Détection Auto de la Banque] ──(Non reconnue)──</w:t>
+      </w:r>
+      <w:r>
+        <w:rPr>
+          <w:rFonts w:ascii="Arial" w:hAnsi="Arial" w:cs="Arial"/>
+        </w:rPr>
+        <w:t>►</w:t>
+      </w:r>
+      <w:r>
+        <w:t xml:space="preserve"> [Mapper Visuel Interactif (3 lignes)]</w:t>
+      </w:r>
+    </w:p>
+    <w:p>
+      <w:pPr>
+        <w:pStyle w:val="Paragraphedeliste"/>
+        <w:numPr>
+          <w:ilvl w:val="0"/>
+          <w:numId w:val="1"/>
+        </w:numPr>
+        <w:spacing w:after="80"/>
+      </w:pPr>
+      <w:r>
+        <w:lastRenderedPageBreak/>
+        <w:t xml:space="preserve">       │                                                    │</w:t>
+      </w:r>
+    </w:p>
+    <w:p>
+      <w:pPr>
+        <w:pStyle w:val="Paragraphedeliste"/>
+        <w:numPr>
+          <w:ilvl w:val="0"/>
+          <w:numId w:val="1"/>
+        </w:numPr>
+        <w:spacing w:after="80"/>
+      </w:pPr>
+      <w:r>
+        <w:t xml:space="preserve">       </w:t>
+      </w:r>
+      <w:r>
+        <w:rPr>
+          <w:rFonts w:ascii="Arial" w:hAnsi="Arial" w:cs="Arial"/>
+        </w:rPr>
+        <w:t>├</w:t>
+      </w:r>
+      <w:r>
+        <w:t>────────────────</w:t>
+      </w:r>
+      <w:r>
+        <w:rPr>
+          <w:rFonts w:ascii="Arial" w:hAnsi="Arial" w:cs="Arial"/>
+        </w:rPr>
+        <w:t>◄</w:t>
+      </w:r>
+      <w:r>
+        <w:t>───────────────────────────────────┘ (Sauvegarde du template)</w:t>
+      </w:r>
+    </w:p>
+    <w:p>
+      <w:pPr>
+        <w:pStyle w:val="Paragraphedeliste"/>
+        <w:numPr>
+          <w:ilvl w:val="0"/>
+          <w:numId w:val="1"/>
+        </w:numPr>
+        <w:spacing w:after="80"/>
+      </w:pPr>
+      <w:r>
+        <w:t xml:space="preserve">       </w:t>
+      </w:r>
+      <w:r>
+        <w:rPr>
+          <w:rFonts w:ascii="Arial" w:hAnsi="Arial" w:cs="Arial"/>
+        </w:rPr>
+        <w:t>▼</w:t>
+      </w:r>
+    </w:p>
+    <w:p>
+      <w:pPr>
+        <w:pStyle w:val="Paragraphedeliste"/>
+        <w:numPr>
+          <w:ilvl w:val="0"/>
+          <w:numId w:val="1"/>
+        </w:numPr>
+        <w:spacing w:after="80"/>
+      </w:pPr>
+      <w:r>
+        <w:t>[Écran de Revue (Simulation)]</w:t>
+      </w:r>
+    </w:p>
+    <w:p>
+      <w:pPr>
+        <w:pStyle w:val="Paragraphedeliste"/>
+        <w:numPr>
+          <w:ilvl w:val="0"/>
+          <w:numId w:val="1"/>
+        </w:numPr>
+        <w:spacing w:after="80"/>
+      </w:pPr>
+      <w:r>
+        <w:t xml:space="preserve">       │</w:t>
+      </w:r>
+    </w:p>
+    <w:p>
+      <w:pPr>
+        <w:pStyle w:val="Paragraphedeliste"/>
+        <w:numPr>
+          <w:ilvl w:val="0"/>
+          <w:numId w:val="1"/>
+        </w:numPr>
+        <w:spacing w:after="80"/>
+      </w:pPr>
+      <w:r>
+        <w:t xml:space="preserve">       </w:t>
+      </w:r>
+      <w:r>
+        <w:rPr>
+          <w:rFonts w:ascii="Arial" w:hAnsi="Arial" w:cs="Arial"/>
+        </w:rPr>
+        <w:t>├</w:t>
+      </w:r>
+      <w:r>
+        <w:t>─</w:t>
+      </w:r>
+      <w:r>
+        <w:rPr>
+          <w:rFonts w:ascii="Arial" w:hAnsi="Arial" w:cs="Arial"/>
+        </w:rPr>
+        <w:t>►</w:t>
+      </w:r>
+      <w:r>
+        <w:t xml:space="preserve"> [Modifier par lot (Catégorisation groupée en 1 clic)]</w:t>
+      </w:r>
+    </w:p>
+    <w:p>
+      <w:pPr>
+        <w:pStyle w:val="Paragraphedeliste"/>
+        <w:numPr>
+          <w:ilvl w:val="0"/>
+          <w:numId w:val="1"/>
+        </w:numPr>
+        <w:spacing w:after="80"/>
+      </w:pPr>
+      <w:r>
+        <w:t xml:space="preserve">       </w:t>
+      </w:r>
+      <w:r>
+        <w:rPr>
+          <w:rFonts w:ascii="Arial" w:hAnsi="Arial" w:cs="Arial"/>
+        </w:rPr>
+        <w:t>├</w:t>
+      </w:r>
+      <w:r>
+        <w:t>─</w:t>
+      </w:r>
+      <w:r>
+        <w:rPr>
+          <w:rFonts w:ascii="Arial" w:hAnsi="Arial" w:cs="Arial"/>
+        </w:rPr>
+        <w:t>►</w:t>
+      </w:r>
+      <w:r>
+        <w:t xml:space="preserve"> [Attribuer les catégories manquantes] ──</w:t>
+      </w:r>
+      <w:r>
+        <w:rPr>
+          <w:rFonts w:ascii="Arial" w:hAnsi="Arial" w:cs="Arial"/>
+        </w:rPr>
+        <w:t>►</w:t>
+      </w:r>
+      <w:r>
+        <w:t xml:space="preserve"> [Popup : "Créer une règle automatique ?"]</w:t>
+      </w:r>
+    </w:p>
+    <w:p>
+      <w:pPr>
+        <w:pStyle w:val="Paragraphedeliste"/>
+        <w:numPr>
+          <w:ilvl w:val="0"/>
+          <w:numId w:val="1"/>
+        </w:numPr>
+        <w:spacing w:after="80"/>
+      </w:pPr>
+      <w:r>
+        <w:t xml:space="preserve">       │</w:t>
+      </w:r>
+    </w:p>
+    <w:p>
+      <w:pPr>
+        <w:pStyle w:val="Paragraphedeliste"/>
+        <w:numPr>
+          <w:ilvl w:val="0"/>
+          <w:numId w:val="1"/>
+        </w:numPr>
+        <w:spacing w:after="80"/>
+      </w:pPr>
+      <w:r>
+        <w:t xml:space="preserve">       </w:t>
+      </w:r>
+      <w:r>
+        <w:rPr>
+          <w:rFonts w:ascii="Arial" w:hAnsi="Arial" w:cs="Arial"/>
+        </w:rPr>
+        <w:t>▼</w:t>
+      </w:r>
+    </w:p>
+    <w:p>
+      <w:pPr>
+        <w:pStyle w:val="Paragraphedeliste"/>
+        <w:numPr>
+          <w:ilvl w:val="0"/>
+          <w:numId w:val="1"/>
+        </w:numPr>
+        <w:spacing w:after="80"/>
+      </w:pPr>
+      <w:r>
+        <w:t>[Bouton : Valider l'importation (Bulk Insert)]</w:t>
+      </w:r>
+    </w:p>
+    <w:p>
+      <w:pPr>
+        <w:pStyle w:val="Paragraphedeliste"/>
+        <w:numPr>
+          <w:ilvl w:val="0"/>
+          <w:numId w:val="1"/>
+        </w:numPr>
+        <w:spacing w:after="80"/>
+      </w:pPr>
     </w:p>
     <w:p>
       <w:pPr>
@@ -10264,6 +11990,24 @@
     </w:p>
     <w:p>
       <w:pPr>
+        <w:pStyle w:val="Paragraphedeliste"/>
+        <w:numPr>
+          <w:ilvl w:val="0"/>
+          <w:numId w:val="1"/>
+        </w:numPr>
+        <w:spacing w:after="80"/>
+      </w:pPr>
+      <w:r>
+        <w:t xml:space="preserve">Calcule automatiques des dividendes avant et après impôts et si on les reinvestit ou va largent et tous </w:t>
+      </w:r>
+      <w:proofErr w:type="gramStart"/>
+      <w:r>
+        <w:t>ca</w:t>
+      </w:r>
+      <w:proofErr w:type="gramEnd"/>
+    </w:p>
+    <w:p>
+      <w:pPr>
         <w:pStyle w:val="Titre2"/>
         <w:spacing w:before="300" w:after="150"/>
       </w:pPr>
@@ -10299,7 +12043,6 @@
         <w:spacing w:after="80"/>
       </w:pPr>
       <w:r>
-        <w:lastRenderedPageBreak/>
         <w:t>P&amp;L Réalisé crypto : méthode PRU au prorata global (règle fiscale française)</w:t>
       </w:r>
     </w:p>
@@ -10327,6 +12070,7 @@
         <w:spacing w:after="80"/>
       </w:pPr>
       <w:r>
+        <w:lastRenderedPageBreak/>
         <w:t>Table asset_prices_cache dans Supabase</w:t>
       </w:r>
     </w:p>
@@ -10871,7 +12615,6 @@
         <w:spacing w:after="120"/>
       </w:pPr>
       <w:r>
-        <w:lastRenderedPageBreak/>
         <w:t>Pour une application fintech, les bugs silencieux sur les calculs financiers peuvent entraîner de mauvaises décisions d'investissement. Ces tests sont non-négociables.</w:t>
       </w:r>
     </w:p>
@@ -10902,6 +12645,7 @@
       </w:pPr>
       <w:proofErr w:type="gramStart"/>
       <w:r>
+        <w:lastRenderedPageBreak/>
         <w:t>getCapitalRestantDu(</w:t>
       </w:r>
       <w:proofErr w:type="gramEnd"/>
@@ -11309,33 +13053,33 @@
           <w:bCs/>
           <w:color w:val="1E3A5F"/>
         </w:rPr>
+        <w:t>Performance</w:t>
+      </w:r>
+    </w:p>
+    <w:p>
+      <w:pPr>
+        <w:pStyle w:val="Paragraphedeliste"/>
+        <w:numPr>
+          <w:ilvl w:val="0"/>
+          <w:numId w:val="1"/>
+        </w:numPr>
+        <w:spacing w:after="80"/>
+      </w:pPr>
+      <w:r>
+        <w:t>Variables Vercel : VITE_SUPABASE_URL et VITE_SUPABASE_ANON_KEY dans Settings → Environment Variables</w:t>
+      </w:r>
+    </w:p>
+    <w:p>
+      <w:pPr>
+        <w:pStyle w:val="Paragraphedeliste"/>
+        <w:numPr>
+          <w:ilvl w:val="0"/>
+          <w:numId w:val="1"/>
+        </w:numPr>
+        <w:spacing w:after="80"/>
+      </w:pPr>
+      <w:r>
         <w:lastRenderedPageBreak/>
-        <w:t>Performance</w:t>
-      </w:r>
-    </w:p>
-    <w:p>
-      <w:pPr>
-        <w:pStyle w:val="Paragraphedeliste"/>
-        <w:numPr>
-          <w:ilvl w:val="0"/>
-          <w:numId w:val="1"/>
-        </w:numPr>
-        <w:spacing w:after="80"/>
-      </w:pPr>
-      <w:r>
-        <w:t>Variables Vercel : VITE_SUPABASE_URL et VITE_SUPABASE_ANON_KEY dans Settings → Environment Variables</w:t>
-      </w:r>
-    </w:p>
-    <w:p>
-      <w:pPr>
-        <w:pStyle w:val="Paragraphedeliste"/>
-        <w:numPr>
-          <w:ilvl w:val="0"/>
-          <w:numId w:val="1"/>
-        </w:numPr>
-        <w:spacing w:after="80"/>
-      </w:pPr>
-      <w:r>
         <w:t>Cache Finnhub via table asset_prices_cache (jamais d'appel direct depuis le front)</w:t>
       </w:r>
     </w:p>
@@ -12314,7 +14058,6 @@
           <w:sz w:val="19"/>
           <w:szCs w:val="19"/>
         </w:rPr>
-        <w:lastRenderedPageBreak/>
         <w:t>Familiarisez-vous avec les procédures de </w:t>
       </w:r>
       <w:hyperlink r:id="rId14" w:history="1">
@@ -12411,6 +14154,7 @@
           <w:sz w:val="19"/>
           <w:szCs w:val="19"/>
         </w:rPr>
+        <w:lastRenderedPageBreak/>
         <w:t>Effectuez une migration sans interruption de service vers </w:t>
       </w:r>
       <w:hyperlink r:id="rId16" w:history="1">
@@ -14081,7 +15825,6 @@
           <w:sz w:val="19"/>
           <w:szCs w:val="19"/>
         </w:rPr>
-        <w:lastRenderedPageBreak/>
         <w:t>Vérifiez votre </w:t>
       </w:r>
       <w:hyperlink r:id="rId63" w:anchor="time-to-first-byte-ttfb" w:history="1">
@@ -14178,6 +15921,7 @@
           <w:sz w:val="19"/>
           <w:szCs w:val="19"/>
         </w:rPr>
+        <w:lastRenderedPageBreak/>
         <w:t>Assurez-vous d'utiliser </w:t>
       </w:r>
       <w:hyperlink r:id="rId65" w:tgtFrame="_blank" w:history="1">
@@ -15045,7 +16789,7 @@
       </w:pPr>
       <w:r>
         <w:pict w14:anchorId="6497E44B">
-          <v:rect id="_x0000_i1037" style="width:0;height:1.5pt" o:hralign="center" o:hrstd="t" o:hr="t" fillcolor="#a0a0a0" stroked="f"/>
+          <v:rect id="_x0000_i1025" style="width:0;height:1.5pt" o:hralign="center" o:hrstd="t" o:hr="t" fillcolor="#a0a0a0" stroked="f"/>
         </w:pict>
       </w:r>
     </w:p>
@@ -15211,59 +16955,59 @@
           <w:b/>
           <w:bCs/>
         </w:rPr>
+        <w:t>Emails</w:t>
+      </w:r>
+      <w:proofErr w:type="gramEnd"/>
+      <w:r>
+        <w:rPr>
+          <w:b/>
+          <w:bCs/>
+        </w:rPr>
+        <w:t xml:space="preserve"> via Resend :</w:t>
+      </w:r>
+    </w:p>
+    <w:p>
+      <w:pPr>
+        <w:numPr>
+          <w:ilvl w:val="0"/>
+          <w:numId w:val="15"/>
+        </w:numPr>
+        <w:spacing w:after="120"/>
+      </w:pPr>
+      <w:proofErr w:type="gramStart"/>
+      <w:r>
+        <w:t>Email</w:t>
+      </w:r>
+      <w:proofErr w:type="gramEnd"/>
+      <w:r>
+        <w:t xml:space="preserve"> 1 : demande de confirmation avec lien</w:t>
+      </w:r>
+    </w:p>
+    <w:p>
+      <w:pPr>
+        <w:numPr>
+          <w:ilvl w:val="0"/>
+          <w:numId w:val="15"/>
+        </w:numPr>
+        <w:spacing w:after="120"/>
+      </w:pPr>
+      <w:proofErr w:type="gramStart"/>
+      <w:r>
         <w:lastRenderedPageBreak/>
-        <w:t>Emails</w:t>
+        <w:t>Email</w:t>
       </w:r>
       <w:proofErr w:type="gramEnd"/>
       <w:r>
-        <w:rPr>
-          <w:b/>
-          <w:bCs/>
-        </w:rPr>
-        <w:t xml:space="preserve"> via Resend :</w:t>
-      </w:r>
-    </w:p>
-    <w:p>
-      <w:pPr>
-        <w:numPr>
-          <w:ilvl w:val="0"/>
-          <w:numId w:val="15"/>
-        </w:numPr>
+        <w:t xml:space="preserve"> 2 : reçu de suppression définitive</w:t>
+      </w:r>
+    </w:p>
+    <w:p>
+      <w:pPr>
         <w:spacing w:after="120"/>
       </w:pPr>
-      <w:proofErr w:type="gramStart"/>
-      <w:r>
-        <w:t>Email</w:t>
-      </w:r>
-      <w:proofErr w:type="gramEnd"/>
-      <w:r>
-        <w:t xml:space="preserve"> 1 : demande de confirmation avec lien</w:t>
-      </w:r>
-    </w:p>
-    <w:p>
-      <w:pPr>
-        <w:numPr>
-          <w:ilvl w:val="0"/>
-          <w:numId w:val="15"/>
-        </w:numPr>
-        <w:spacing w:after="120"/>
-      </w:pPr>
-      <w:proofErr w:type="gramStart"/>
-      <w:r>
-        <w:t>Email</w:t>
-      </w:r>
-      <w:proofErr w:type="gramEnd"/>
-      <w:r>
-        <w:t xml:space="preserve"> 2 : reçu de suppression définitive</w:t>
-      </w:r>
-    </w:p>
-    <w:p>
-      <w:pPr>
-        <w:spacing w:after="120"/>
-      </w:pPr>
       <w:r>
         <w:pict w14:anchorId="321E0D2E">
-          <v:rect id="_x0000_i1038" style="width:0;height:1.5pt" o:hralign="center" o:hrstd="t" o:hr="t" fillcolor="#a0a0a0" stroked="f"/>
+          <v:rect id="_x0000_i1026" style="width:0;height:1.5pt" o:hralign="center" o:hrstd="t" o:hr="t" fillcolor="#a0a0a0" stroked="f"/>
         </w:pict>
       </w:r>
     </w:p>
@@ -16509,6 +18253,155 @@
     </w:lvl>
   </w:abstractNum>
   <w:abstractNum w:abstractNumId="8" w15:restartNumberingAfterBreak="0">
+    <w:nsid w:val="306D0BC5"/>
+    <w:multiLevelType w:val="multilevel"/>
+    <w:tmpl w:val="86001E4C"/>
+    <w:lvl w:ilvl="0">
+      <w:start w:val="1"/>
+      <w:numFmt w:val="bullet"/>
+      <w:lvlText w:val=""/>
+      <w:lvlJc w:val="left"/>
+      <w:pPr>
+        <w:tabs>
+          <w:tab w:val="num" w:pos="720"/>
+        </w:tabs>
+        <w:ind w:left="720" w:hanging="360"/>
+      </w:pPr>
+      <w:rPr>
+        <w:rFonts w:ascii="Symbol" w:hAnsi="Symbol" w:hint="default"/>
+        <w:sz w:val="20"/>
+      </w:rPr>
+    </w:lvl>
+    <w:lvl w:ilvl="1">
+      <w:start w:val="1"/>
+      <w:numFmt w:val="bullet"/>
+      <w:lvlText w:val="o"/>
+      <w:lvlJc w:val="left"/>
+      <w:pPr>
+        <w:tabs>
+          <w:tab w:val="num" w:pos="1440"/>
+        </w:tabs>
+        <w:ind w:left="1440" w:hanging="360"/>
+      </w:pPr>
+      <w:rPr>
+        <w:rFonts w:ascii="Courier New" w:hAnsi="Courier New" w:hint="default"/>
+        <w:sz w:val="20"/>
+      </w:rPr>
+    </w:lvl>
+    <w:lvl w:ilvl="2">
+      <w:start w:val="1"/>
+      <w:numFmt w:val="bullet"/>
+      <w:lvlText w:val=""/>
+      <w:lvlJc w:val="left"/>
+      <w:pPr>
+        <w:tabs>
+          <w:tab w:val="num" w:pos="2160"/>
+        </w:tabs>
+        <w:ind w:left="2160" w:hanging="360"/>
+      </w:pPr>
+      <w:rPr>
+        <w:rFonts w:ascii="Wingdings" w:hAnsi="Wingdings" w:hint="default"/>
+        <w:sz w:val="20"/>
+      </w:rPr>
+    </w:lvl>
+    <w:lvl w:ilvl="3" w:tentative="1">
+      <w:start w:val="1"/>
+      <w:numFmt w:val="bullet"/>
+      <w:lvlText w:val=""/>
+      <w:lvlJc w:val="left"/>
+      <w:pPr>
+        <w:tabs>
+          <w:tab w:val="num" w:pos="2880"/>
+        </w:tabs>
+        <w:ind w:left="2880" w:hanging="360"/>
+      </w:pPr>
+      <w:rPr>
+        <w:rFonts w:ascii="Wingdings" w:hAnsi="Wingdings" w:hint="default"/>
+        <w:sz w:val="20"/>
+      </w:rPr>
+    </w:lvl>
+    <w:lvl w:ilvl="4" w:tentative="1">
+      <w:start w:val="1"/>
+      <w:numFmt w:val="bullet"/>
+      <w:lvlText w:val=""/>
+      <w:lvlJc w:val="left"/>
+      <w:pPr>
+        <w:tabs>
+          <w:tab w:val="num" w:pos="3600"/>
+        </w:tabs>
+        <w:ind w:left="3600" w:hanging="360"/>
+      </w:pPr>
+      <w:rPr>
+        <w:rFonts w:ascii="Wingdings" w:hAnsi="Wingdings" w:hint="default"/>
+        <w:sz w:val="20"/>
+      </w:rPr>
+    </w:lvl>
+    <w:lvl w:ilvl="5" w:tentative="1">
+      <w:start w:val="1"/>
+      <w:numFmt w:val="bullet"/>
+      <w:lvlText w:val=""/>
+      <w:lvlJc w:val="left"/>
+      <w:pPr>
+        <w:tabs>
+          <w:tab w:val="num" w:pos="4320"/>
+        </w:tabs>
+        <w:ind w:left="4320" w:hanging="360"/>
+      </w:pPr>
+      <w:rPr>
+        <w:rFonts w:ascii="Wingdings" w:hAnsi="Wingdings" w:hint="default"/>
+        <w:sz w:val="20"/>
+      </w:rPr>
+    </w:lvl>
+    <w:lvl w:ilvl="6" w:tentative="1">
+      <w:start w:val="1"/>
+      <w:numFmt w:val="bullet"/>
+      <w:lvlText w:val=""/>
+      <w:lvlJc w:val="left"/>
+      <w:pPr>
+        <w:tabs>
+          <w:tab w:val="num" w:pos="5040"/>
+        </w:tabs>
+        <w:ind w:left="5040" w:hanging="360"/>
+      </w:pPr>
+      <w:rPr>
+        <w:rFonts w:ascii="Wingdings" w:hAnsi="Wingdings" w:hint="default"/>
+        <w:sz w:val="20"/>
+      </w:rPr>
+    </w:lvl>
+    <w:lvl w:ilvl="7" w:tentative="1">
+      <w:start w:val="1"/>
+      <w:numFmt w:val="bullet"/>
+      <w:lvlText w:val=""/>
+      <w:lvlJc w:val="left"/>
+      <w:pPr>
+        <w:tabs>
+          <w:tab w:val="num" w:pos="5760"/>
+        </w:tabs>
+        <w:ind w:left="5760" w:hanging="360"/>
+      </w:pPr>
+      <w:rPr>
+        <w:rFonts w:ascii="Wingdings" w:hAnsi="Wingdings" w:hint="default"/>
+        <w:sz w:val="20"/>
+      </w:rPr>
+    </w:lvl>
+    <w:lvl w:ilvl="8" w:tentative="1">
+      <w:start w:val="1"/>
+      <w:numFmt w:val="bullet"/>
+      <w:lvlText w:val=""/>
+      <w:lvlJc w:val="left"/>
+      <w:pPr>
+        <w:tabs>
+          <w:tab w:val="num" w:pos="6480"/>
+        </w:tabs>
+        <w:ind w:left="6480" w:hanging="360"/>
+      </w:pPr>
+      <w:rPr>
+        <w:rFonts w:ascii="Wingdings" w:hAnsi="Wingdings" w:hint="default"/>
+        <w:sz w:val="20"/>
+      </w:rPr>
+    </w:lvl>
+  </w:abstractNum>
+  <w:abstractNum w:abstractNumId="9" w15:restartNumberingAfterBreak="0">
     <w:nsid w:val="379D3EAE"/>
     <w:multiLevelType w:val="multilevel"/>
     <w:tmpl w:val="D25E0358"/>
@@ -16621,7 +18514,7 @@
       </w:pPr>
     </w:lvl>
   </w:abstractNum>
-  <w:abstractNum w:abstractNumId="9" w15:restartNumberingAfterBreak="0">
+  <w:abstractNum w:abstractNumId="10" w15:restartNumberingAfterBreak="0">
     <w:nsid w:val="3CBF2105"/>
     <w:multiLevelType w:val="multilevel"/>
     <w:tmpl w:val="F776EADA"/>
@@ -16770,7 +18663,156 @@
       </w:rPr>
     </w:lvl>
   </w:abstractNum>
-  <w:abstractNum w:abstractNumId="10" w15:restartNumberingAfterBreak="0">
+  <w:abstractNum w:abstractNumId="11" w15:restartNumberingAfterBreak="0">
+    <w:nsid w:val="62DA22AB"/>
+    <w:multiLevelType w:val="multilevel"/>
+    <w:tmpl w:val="783ABB80"/>
+    <w:lvl w:ilvl="0">
+      <w:start w:val="1"/>
+      <w:numFmt w:val="bullet"/>
+      <w:lvlText w:val=""/>
+      <w:lvlJc w:val="left"/>
+      <w:pPr>
+        <w:tabs>
+          <w:tab w:val="num" w:pos="720"/>
+        </w:tabs>
+        <w:ind w:left="720" w:hanging="360"/>
+      </w:pPr>
+      <w:rPr>
+        <w:rFonts w:ascii="Symbol" w:hAnsi="Symbol" w:hint="default"/>
+        <w:sz w:val="20"/>
+      </w:rPr>
+    </w:lvl>
+    <w:lvl w:ilvl="1">
+      <w:start w:val="1"/>
+      <w:numFmt w:val="bullet"/>
+      <w:lvlText w:val="o"/>
+      <w:lvlJc w:val="left"/>
+      <w:pPr>
+        <w:tabs>
+          <w:tab w:val="num" w:pos="1440"/>
+        </w:tabs>
+        <w:ind w:left="1440" w:hanging="360"/>
+      </w:pPr>
+      <w:rPr>
+        <w:rFonts w:ascii="Courier New" w:hAnsi="Courier New" w:hint="default"/>
+        <w:sz w:val="20"/>
+      </w:rPr>
+    </w:lvl>
+    <w:lvl w:ilvl="2" w:tentative="1">
+      <w:start w:val="1"/>
+      <w:numFmt w:val="bullet"/>
+      <w:lvlText w:val=""/>
+      <w:lvlJc w:val="left"/>
+      <w:pPr>
+        <w:tabs>
+          <w:tab w:val="num" w:pos="2160"/>
+        </w:tabs>
+        <w:ind w:left="2160" w:hanging="360"/>
+      </w:pPr>
+      <w:rPr>
+        <w:rFonts w:ascii="Wingdings" w:hAnsi="Wingdings" w:hint="default"/>
+        <w:sz w:val="20"/>
+      </w:rPr>
+    </w:lvl>
+    <w:lvl w:ilvl="3" w:tentative="1">
+      <w:start w:val="1"/>
+      <w:numFmt w:val="bullet"/>
+      <w:lvlText w:val=""/>
+      <w:lvlJc w:val="left"/>
+      <w:pPr>
+        <w:tabs>
+          <w:tab w:val="num" w:pos="2880"/>
+        </w:tabs>
+        <w:ind w:left="2880" w:hanging="360"/>
+      </w:pPr>
+      <w:rPr>
+        <w:rFonts w:ascii="Wingdings" w:hAnsi="Wingdings" w:hint="default"/>
+        <w:sz w:val="20"/>
+      </w:rPr>
+    </w:lvl>
+    <w:lvl w:ilvl="4" w:tentative="1">
+      <w:start w:val="1"/>
+      <w:numFmt w:val="bullet"/>
+      <w:lvlText w:val=""/>
+      <w:lvlJc w:val="left"/>
+      <w:pPr>
+        <w:tabs>
+          <w:tab w:val="num" w:pos="3600"/>
+        </w:tabs>
+        <w:ind w:left="3600" w:hanging="360"/>
+      </w:pPr>
+      <w:rPr>
+        <w:rFonts w:ascii="Wingdings" w:hAnsi="Wingdings" w:hint="default"/>
+        <w:sz w:val="20"/>
+      </w:rPr>
+    </w:lvl>
+    <w:lvl w:ilvl="5" w:tentative="1">
+      <w:start w:val="1"/>
+      <w:numFmt w:val="bullet"/>
+      <w:lvlText w:val=""/>
+      <w:lvlJc w:val="left"/>
+      <w:pPr>
+        <w:tabs>
+          <w:tab w:val="num" w:pos="4320"/>
+        </w:tabs>
+        <w:ind w:left="4320" w:hanging="360"/>
+      </w:pPr>
+      <w:rPr>
+        <w:rFonts w:ascii="Wingdings" w:hAnsi="Wingdings" w:hint="default"/>
+        <w:sz w:val="20"/>
+      </w:rPr>
+    </w:lvl>
+    <w:lvl w:ilvl="6" w:tentative="1">
+      <w:start w:val="1"/>
+      <w:numFmt w:val="bullet"/>
+      <w:lvlText w:val=""/>
+      <w:lvlJc w:val="left"/>
+      <w:pPr>
+        <w:tabs>
+          <w:tab w:val="num" w:pos="5040"/>
+        </w:tabs>
+        <w:ind w:left="5040" w:hanging="360"/>
+      </w:pPr>
+      <w:rPr>
+        <w:rFonts w:ascii="Wingdings" w:hAnsi="Wingdings" w:hint="default"/>
+        <w:sz w:val="20"/>
+      </w:rPr>
+    </w:lvl>
+    <w:lvl w:ilvl="7" w:tentative="1">
+      <w:start w:val="1"/>
+      <w:numFmt w:val="bullet"/>
+      <w:lvlText w:val=""/>
+      <w:lvlJc w:val="left"/>
+      <w:pPr>
+        <w:tabs>
+          <w:tab w:val="num" w:pos="5760"/>
+        </w:tabs>
+        <w:ind w:left="5760" w:hanging="360"/>
+      </w:pPr>
+      <w:rPr>
+        <w:rFonts w:ascii="Wingdings" w:hAnsi="Wingdings" w:hint="default"/>
+        <w:sz w:val="20"/>
+      </w:rPr>
+    </w:lvl>
+    <w:lvl w:ilvl="8" w:tentative="1">
+      <w:start w:val="1"/>
+      <w:numFmt w:val="bullet"/>
+      <w:lvlText w:val=""/>
+      <w:lvlJc w:val="left"/>
+      <w:pPr>
+        <w:tabs>
+          <w:tab w:val="num" w:pos="6480"/>
+        </w:tabs>
+        <w:ind w:left="6480" w:hanging="360"/>
+      </w:pPr>
+      <w:rPr>
+        <w:rFonts w:ascii="Wingdings" w:hAnsi="Wingdings" w:hint="default"/>
+        <w:sz w:val="20"/>
+      </w:rPr>
+    </w:lvl>
+  </w:abstractNum>
+  <w:abstractNum w:abstractNumId="12" w15:restartNumberingAfterBreak="0">
     <w:nsid w:val="66CF62CE"/>
     <w:multiLevelType w:val="multilevel"/>
     <w:tmpl w:val="74289A1C"/>
@@ -16919,7 +18961,128 @@
       </w:rPr>
     </w:lvl>
   </w:abstractNum>
-  <w:abstractNum w:abstractNumId="11" w15:restartNumberingAfterBreak="0">
+  <w:abstractNum w:abstractNumId="13" w15:restartNumberingAfterBreak="0">
+    <w:nsid w:val="6B556E56"/>
+    <w:multiLevelType w:val="multilevel"/>
+    <w:tmpl w:val="31EEFFB6"/>
+    <w:lvl w:ilvl="0">
+      <w:start w:val="1"/>
+      <w:numFmt w:val="decimal"/>
+      <w:lvlText w:val="%1."/>
+      <w:lvlJc w:val="left"/>
+      <w:pPr>
+        <w:tabs>
+          <w:tab w:val="num" w:pos="720"/>
+        </w:tabs>
+        <w:ind w:left="720" w:hanging="360"/>
+      </w:pPr>
+    </w:lvl>
+    <w:lvl w:ilvl="1">
+      <w:start w:val="1"/>
+      <w:numFmt w:val="bullet"/>
+      <w:lvlText w:val="o"/>
+      <w:lvlJc w:val="left"/>
+      <w:pPr>
+        <w:tabs>
+          <w:tab w:val="num" w:pos="1440"/>
+        </w:tabs>
+        <w:ind w:left="1440" w:hanging="360"/>
+      </w:pPr>
+      <w:rPr>
+        <w:rFonts w:ascii="Courier New" w:hAnsi="Courier New" w:hint="default"/>
+        <w:sz w:val="20"/>
+      </w:rPr>
+    </w:lvl>
+    <w:lvl w:ilvl="2">
+      <w:start w:val="1"/>
+      <w:numFmt w:val="bullet"/>
+      <w:lvlText w:val=""/>
+      <w:lvlJc w:val="left"/>
+      <w:pPr>
+        <w:tabs>
+          <w:tab w:val="num" w:pos="2160"/>
+        </w:tabs>
+        <w:ind w:left="2160" w:hanging="360"/>
+      </w:pPr>
+      <w:rPr>
+        <w:rFonts w:ascii="Wingdings" w:hAnsi="Wingdings" w:hint="default"/>
+        <w:sz w:val="20"/>
+      </w:rPr>
+    </w:lvl>
+    <w:lvl w:ilvl="3" w:tentative="1">
+      <w:start w:val="1"/>
+      <w:numFmt w:val="decimal"/>
+      <w:lvlText w:val="%4."/>
+      <w:lvlJc w:val="left"/>
+      <w:pPr>
+        <w:tabs>
+          <w:tab w:val="num" w:pos="2880"/>
+        </w:tabs>
+        <w:ind w:left="2880" w:hanging="360"/>
+      </w:pPr>
+    </w:lvl>
+    <w:lvl w:ilvl="4" w:tentative="1">
+      <w:start w:val="1"/>
+      <w:numFmt w:val="decimal"/>
+      <w:lvlText w:val="%5."/>
+      <w:lvlJc w:val="left"/>
+      <w:pPr>
+        <w:tabs>
+          <w:tab w:val="num" w:pos="3600"/>
+        </w:tabs>
+        <w:ind w:left="3600" w:hanging="360"/>
+      </w:pPr>
+    </w:lvl>
+    <w:lvl w:ilvl="5" w:tentative="1">
+      <w:start w:val="1"/>
+      <w:numFmt w:val="decimal"/>
+      <w:lvlText w:val="%6."/>
+      <w:lvlJc w:val="left"/>
+      <w:pPr>
+        <w:tabs>
+          <w:tab w:val="num" w:pos="4320"/>
+        </w:tabs>
+        <w:ind w:left="4320" w:hanging="360"/>
+      </w:pPr>
+    </w:lvl>
+    <w:lvl w:ilvl="6" w:tentative="1">
+      <w:start w:val="1"/>
+      <w:numFmt w:val="decimal"/>
+      <w:lvlText w:val="%7."/>
+      <w:lvlJc w:val="left"/>
+      <w:pPr>
+        <w:tabs>
+          <w:tab w:val="num" w:pos="5040"/>
+        </w:tabs>
+        <w:ind w:left="5040" w:hanging="360"/>
+      </w:pPr>
+    </w:lvl>
+    <w:lvl w:ilvl="7" w:tentative="1">
+      <w:start w:val="1"/>
+      <w:numFmt w:val="decimal"/>
+      <w:lvlText w:val="%8."/>
+      <w:lvlJc w:val="left"/>
+      <w:pPr>
+        <w:tabs>
+          <w:tab w:val="num" w:pos="5760"/>
+        </w:tabs>
+        <w:ind w:left="5760" w:hanging="360"/>
+      </w:pPr>
+    </w:lvl>
+    <w:lvl w:ilvl="8" w:tentative="1">
+      <w:start w:val="1"/>
+      <w:numFmt w:val="decimal"/>
+      <w:lvlText w:val="%9."/>
+      <w:lvlJc w:val="left"/>
+      <w:pPr>
+        <w:tabs>
+          <w:tab w:val="num" w:pos="6480"/>
+        </w:tabs>
+        <w:ind w:left="6480" w:hanging="360"/>
+      </w:pPr>
+    </w:lvl>
+  </w:abstractNum>
+  <w:abstractNum w:abstractNumId="14" w15:restartNumberingAfterBreak="0">
     <w:nsid w:val="733F1969"/>
     <w:multiLevelType w:val="hybridMultilevel"/>
     <w:tmpl w:val="94D43434"/>
@@ -17008,7 +19171,156 @@
       </w:pPr>
     </w:lvl>
   </w:abstractNum>
-  <w:abstractNum w:abstractNumId="12" w15:restartNumberingAfterBreak="0">
+  <w:abstractNum w:abstractNumId="15" w15:restartNumberingAfterBreak="0">
+    <w:nsid w:val="74680495"/>
+    <w:multiLevelType w:val="multilevel"/>
+    <w:tmpl w:val="E6C6FB6E"/>
+    <w:lvl w:ilvl="0">
+      <w:start w:val="1"/>
+      <w:numFmt w:val="bullet"/>
+      <w:lvlText w:val=""/>
+      <w:lvlJc w:val="left"/>
+      <w:pPr>
+        <w:tabs>
+          <w:tab w:val="num" w:pos="720"/>
+        </w:tabs>
+        <w:ind w:left="720" w:hanging="360"/>
+      </w:pPr>
+      <w:rPr>
+        <w:rFonts w:ascii="Symbol" w:hAnsi="Symbol" w:hint="default"/>
+        <w:sz w:val="20"/>
+      </w:rPr>
+    </w:lvl>
+    <w:lvl w:ilvl="1">
+      <w:start w:val="1"/>
+      <w:numFmt w:val="bullet"/>
+      <w:lvlText w:val="o"/>
+      <w:lvlJc w:val="left"/>
+      <w:pPr>
+        <w:tabs>
+          <w:tab w:val="num" w:pos="1440"/>
+        </w:tabs>
+        <w:ind w:left="1440" w:hanging="360"/>
+      </w:pPr>
+      <w:rPr>
+        <w:rFonts w:ascii="Courier New" w:hAnsi="Courier New" w:hint="default"/>
+        <w:sz w:val="20"/>
+      </w:rPr>
+    </w:lvl>
+    <w:lvl w:ilvl="2" w:tentative="1">
+      <w:start w:val="1"/>
+      <w:numFmt w:val="bullet"/>
+      <w:lvlText w:val=""/>
+      <w:lvlJc w:val="left"/>
+      <w:pPr>
+        <w:tabs>
+          <w:tab w:val="num" w:pos="2160"/>
+        </w:tabs>
+        <w:ind w:left="2160" w:hanging="360"/>
+      </w:pPr>
+      <w:rPr>
+        <w:rFonts w:ascii="Wingdings" w:hAnsi="Wingdings" w:hint="default"/>
+        <w:sz w:val="20"/>
+      </w:rPr>
+    </w:lvl>
+    <w:lvl w:ilvl="3" w:tentative="1">
+      <w:start w:val="1"/>
+      <w:numFmt w:val="bullet"/>
+      <w:lvlText w:val=""/>
+      <w:lvlJc w:val="left"/>
+      <w:pPr>
+        <w:tabs>
+          <w:tab w:val="num" w:pos="2880"/>
+        </w:tabs>
+        <w:ind w:left="2880" w:hanging="360"/>
+      </w:pPr>
+      <w:rPr>
+        <w:rFonts w:ascii="Wingdings" w:hAnsi="Wingdings" w:hint="default"/>
+        <w:sz w:val="20"/>
+      </w:rPr>
+    </w:lvl>
+    <w:lvl w:ilvl="4" w:tentative="1">
+      <w:start w:val="1"/>
+      <w:numFmt w:val="bullet"/>
+      <w:lvlText w:val=""/>
+      <w:lvlJc w:val="left"/>
+      <w:pPr>
+        <w:tabs>
+          <w:tab w:val="num" w:pos="3600"/>
+        </w:tabs>
+        <w:ind w:left="3600" w:hanging="360"/>
+      </w:pPr>
+      <w:rPr>
+        <w:rFonts w:ascii="Wingdings" w:hAnsi="Wingdings" w:hint="default"/>
+        <w:sz w:val="20"/>
+      </w:rPr>
+    </w:lvl>
+    <w:lvl w:ilvl="5" w:tentative="1">
+      <w:start w:val="1"/>
+      <w:numFmt w:val="bullet"/>
+      <w:lvlText w:val=""/>
+      <w:lvlJc w:val="left"/>
+      <w:pPr>
+        <w:tabs>
+          <w:tab w:val="num" w:pos="4320"/>
+        </w:tabs>
+        <w:ind w:left="4320" w:hanging="360"/>
+      </w:pPr>
+      <w:rPr>
+        <w:rFonts w:ascii="Wingdings" w:hAnsi="Wingdings" w:hint="default"/>
+        <w:sz w:val="20"/>
+      </w:rPr>
+    </w:lvl>
+    <w:lvl w:ilvl="6" w:tentative="1">
+      <w:start w:val="1"/>
+      <w:numFmt w:val="bullet"/>
+      <w:lvlText w:val=""/>
+      <w:lvlJc w:val="left"/>
+      <w:pPr>
+        <w:tabs>
+          <w:tab w:val="num" w:pos="5040"/>
+        </w:tabs>
+        <w:ind w:left="5040" w:hanging="360"/>
+      </w:pPr>
+      <w:rPr>
+        <w:rFonts w:ascii="Wingdings" w:hAnsi="Wingdings" w:hint="default"/>
+        <w:sz w:val="20"/>
+      </w:rPr>
+    </w:lvl>
+    <w:lvl w:ilvl="7" w:tentative="1">
+      <w:start w:val="1"/>
+      <w:numFmt w:val="bullet"/>
+      <w:lvlText w:val=""/>
+      <w:lvlJc w:val="left"/>
+      <w:pPr>
+        <w:tabs>
+          <w:tab w:val="num" w:pos="5760"/>
+        </w:tabs>
+        <w:ind w:left="5760" w:hanging="360"/>
+      </w:pPr>
+      <w:rPr>
+        <w:rFonts w:ascii="Wingdings" w:hAnsi="Wingdings" w:hint="default"/>
+        <w:sz w:val="20"/>
+      </w:rPr>
+    </w:lvl>
+    <w:lvl w:ilvl="8" w:tentative="1">
+      <w:start w:val="1"/>
+      <w:numFmt w:val="bullet"/>
+      <w:lvlText w:val=""/>
+      <w:lvlJc w:val="left"/>
+      <w:pPr>
+        <w:tabs>
+          <w:tab w:val="num" w:pos="6480"/>
+        </w:tabs>
+        <w:ind w:left="6480" w:hanging="360"/>
+      </w:pPr>
+      <w:rPr>
+        <w:rFonts w:ascii="Wingdings" w:hAnsi="Wingdings" w:hint="default"/>
+        <w:sz w:val="20"/>
+      </w:rPr>
+    </w:lvl>
+  </w:abstractNum>
+  <w:abstractNum w:abstractNumId="16" w15:restartNumberingAfterBreak="0">
     <w:nsid w:val="7710798E"/>
     <w:multiLevelType w:val="multilevel"/>
     <w:tmpl w:val="3F4A8E4A"/>
@@ -17157,7 +19469,7 @@
       </w:rPr>
     </w:lvl>
   </w:abstractNum>
-  <w:abstractNum w:abstractNumId="13" w15:restartNumberingAfterBreak="0">
+  <w:abstractNum w:abstractNumId="17" w15:restartNumberingAfterBreak="0">
     <w:nsid w:val="79E2309F"/>
     <w:multiLevelType w:val="multilevel"/>
     <w:tmpl w:val="E342E5D6"/>
@@ -17270,11 +19582,156 @@
       </w:pPr>
     </w:lvl>
   </w:abstractNum>
+  <w:abstractNum w:abstractNumId="18" w15:restartNumberingAfterBreak="0">
+    <w:nsid w:val="7A573DDE"/>
+    <w:multiLevelType w:val="multilevel"/>
+    <w:tmpl w:val="5D144C50"/>
+    <w:lvl w:ilvl="0">
+      <w:start w:val="1"/>
+      <w:numFmt w:val="bullet"/>
+      <w:lvlText w:val=""/>
+      <w:lvlJc w:val="left"/>
+      <w:pPr>
+        <w:tabs>
+          <w:tab w:val="num" w:pos="720"/>
+        </w:tabs>
+        <w:ind w:left="720" w:hanging="360"/>
+      </w:pPr>
+      <w:rPr>
+        <w:rFonts w:ascii="Symbol" w:hAnsi="Symbol" w:hint="default"/>
+        <w:sz w:val="20"/>
+      </w:rPr>
+    </w:lvl>
+    <w:lvl w:ilvl="1">
+      <w:start w:val="1"/>
+      <w:numFmt w:val="bullet"/>
+      <w:lvlText w:val="o"/>
+      <w:lvlJc w:val="left"/>
+      <w:pPr>
+        <w:tabs>
+          <w:tab w:val="num" w:pos="1440"/>
+        </w:tabs>
+        <w:ind w:left="1440" w:hanging="360"/>
+      </w:pPr>
+      <w:rPr>
+        <w:rFonts w:ascii="Courier New" w:hAnsi="Courier New" w:hint="default"/>
+        <w:sz w:val="20"/>
+      </w:rPr>
+    </w:lvl>
+    <w:lvl w:ilvl="2">
+      <w:start w:val="1"/>
+      <w:numFmt w:val="decimal"/>
+      <w:lvlText w:val="%3."/>
+      <w:lvlJc w:val="left"/>
+      <w:pPr>
+        <w:tabs>
+          <w:tab w:val="num" w:pos="2160"/>
+        </w:tabs>
+        <w:ind w:left="2160" w:hanging="360"/>
+      </w:pPr>
+    </w:lvl>
+    <w:lvl w:ilvl="3" w:tentative="1">
+      <w:start w:val="1"/>
+      <w:numFmt w:val="bullet"/>
+      <w:lvlText w:val=""/>
+      <w:lvlJc w:val="left"/>
+      <w:pPr>
+        <w:tabs>
+          <w:tab w:val="num" w:pos="2880"/>
+        </w:tabs>
+        <w:ind w:left="2880" w:hanging="360"/>
+      </w:pPr>
+      <w:rPr>
+        <w:rFonts w:ascii="Wingdings" w:hAnsi="Wingdings" w:hint="default"/>
+        <w:sz w:val="20"/>
+      </w:rPr>
+    </w:lvl>
+    <w:lvl w:ilvl="4" w:tentative="1">
+      <w:start w:val="1"/>
+      <w:numFmt w:val="bullet"/>
+      <w:lvlText w:val=""/>
+      <w:lvlJc w:val="left"/>
+      <w:pPr>
+        <w:tabs>
+          <w:tab w:val="num" w:pos="3600"/>
+        </w:tabs>
+        <w:ind w:left="3600" w:hanging="360"/>
+      </w:pPr>
+      <w:rPr>
+        <w:rFonts w:ascii="Wingdings" w:hAnsi="Wingdings" w:hint="default"/>
+        <w:sz w:val="20"/>
+      </w:rPr>
+    </w:lvl>
+    <w:lvl w:ilvl="5" w:tentative="1">
+      <w:start w:val="1"/>
+      <w:numFmt w:val="bullet"/>
+      <w:lvlText w:val=""/>
+      <w:lvlJc w:val="left"/>
+      <w:pPr>
+        <w:tabs>
+          <w:tab w:val="num" w:pos="4320"/>
+        </w:tabs>
+        <w:ind w:left="4320" w:hanging="360"/>
+      </w:pPr>
+      <w:rPr>
+        <w:rFonts w:ascii="Wingdings" w:hAnsi="Wingdings" w:hint="default"/>
+        <w:sz w:val="20"/>
+      </w:rPr>
+    </w:lvl>
+    <w:lvl w:ilvl="6" w:tentative="1">
+      <w:start w:val="1"/>
+      <w:numFmt w:val="bullet"/>
+      <w:lvlText w:val=""/>
+      <w:lvlJc w:val="left"/>
+      <w:pPr>
+        <w:tabs>
+          <w:tab w:val="num" w:pos="5040"/>
+        </w:tabs>
+        <w:ind w:left="5040" w:hanging="360"/>
+      </w:pPr>
+      <w:rPr>
+        <w:rFonts w:ascii="Wingdings" w:hAnsi="Wingdings" w:hint="default"/>
+        <w:sz w:val="20"/>
+      </w:rPr>
+    </w:lvl>
+    <w:lvl w:ilvl="7" w:tentative="1">
+      <w:start w:val="1"/>
+      <w:numFmt w:val="bullet"/>
+      <w:lvlText w:val=""/>
+      <w:lvlJc w:val="left"/>
+      <w:pPr>
+        <w:tabs>
+          <w:tab w:val="num" w:pos="5760"/>
+        </w:tabs>
+        <w:ind w:left="5760" w:hanging="360"/>
+      </w:pPr>
+      <w:rPr>
+        <w:rFonts w:ascii="Wingdings" w:hAnsi="Wingdings" w:hint="default"/>
+        <w:sz w:val="20"/>
+      </w:rPr>
+    </w:lvl>
+    <w:lvl w:ilvl="8" w:tentative="1">
+      <w:start w:val="1"/>
+      <w:numFmt w:val="bullet"/>
+      <w:lvlText w:val=""/>
+      <w:lvlJc w:val="left"/>
+      <w:pPr>
+        <w:tabs>
+          <w:tab w:val="num" w:pos="6480"/>
+        </w:tabs>
+        <w:ind w:left="6480" w:hanging="360"/>
+      </w:pPr>
+      <w:rPr>
+        <w:rFonts w:ascii="Wingdings" w:hAnsi="Wingdings" w:hint="default"/>
+        <w:sz w:val="20"/>
+      </w:rPr>
+    </w:lvl>
+  </w:abstractNum>
   <w:num w:numId="1" w16cid:durableId="1746150151">
-    <w:abstractNumId w:val="11"/>
+    <w:abstractNumId w:val="14"/>
   </w:num>
   <w:num w:numId="2" w16cid:durableId="214004282">
-    <w:abstractNumId w:val="11"/>
+    <w:abstractNumId w:val="14"/>
   </w:num>
   <w:num w:numId="3" w16cid:durableId="1354500463">
     <w:abstractNumId w:val="3"/>
@@ -17283,16 +19740,16 @@
     <w:abstractNumId w:val="7"/>
   </w:num>
   <w:num w:numId="5" w16cid:durableId="2034763612">
-    <w:abstractNumId w:val="13"/>
+    <w:abstractNumId w:val="17"/>
   </w:num>
   <w:num w:numId="6" w16cid:durableId="1637300789">
     <w:abstractNumId w:val="5"/>
   </w:num>
   <w:num w:numId="7" w16cid:durableId="1535074460">
-    <w:abstractNumId w:val="10"/>
+    <w:abstractNumId w:val="12"/>
   </w:num>
   <w:num w:numId="8" w16cid:durableId="718018368">
-    <w:abstractNumId w:val="12"/>
+    <w:abstractNumId w:val="16"/>
   </w:num>
   <w:num w:numId="9" w16cid:durableId="1057171463">
     <w:abstractNumId w:val="0"/>
@@ -17301,10 +19758,10 @@
     <w:abstractNumId w:val="4"/>
   </w:num>
   <w:num w:numId="11" w16cid:durableId="444807078">
-    <w:abstractNumId w:val="9"/>
+    <w:abstractNumId w:val="10"/>
   </w:num>
   <w:num w:numId="12" w16cid:durableId="1531258956">
-    <w:abstractNumId w:val="8"/>
+    <w:abstractNumId w:val="9"/>
   </w:num>
   <w:num w:numId="13" w16cid:durableId="1678538774">
     <w:abstractNumId w:val="2"/>
@@ -17314,6 +19771,21 @@
   </w:num>
   <w:num w:numId="15" w16cid:durableId="1261720356">
     <w:abstractNumId w:val="1"/>
+  </w:num>
+  <w:num w:numId="16" w16cid:durableId="591476444">
+    <w:abstractNumId w:val="15"/>
+  </w:num>
+  <w:num w:numId="17" w16cid:durableId="1462841781">
+    <w:abstractNumId w:val="11"/>
+  </w:num>
+  <w:num w:numId="18" w16cid:durableId="1626766400">
+    <w:abstractNumId w:val="8"/>
+  </w:num>
+  <w:num w:numId="19" w16cid:durableId="4017543">
+    <w:abstractNumId w:val="18"/>
+  </w:num>
+  <w:num w:numId="20" w16cid:durableId="1305116368">
+    <w:abstractNumId w:val="13"/>
   </w:num>
 </w:numbering>
 </file>

</xml_diff>

<commit_message>
Update technical plan document
Update Plan_Fondora_Enrichi.docx with enriched technical details.
</commit_message>
<xml_diff>
--- a/details technique/Plan_Fondora_Enrichi.docx
+++ b/details technique/Plan_Fondora_Enrichi.docx
@@ -10098,7 +10098,15 @@
         <w:t>délimiteur</w:t>
       </w:r>
       <w:r>
-        <w:t xml:space="preserve"> (virgule ,, point-virgule ;, tabulation \t) via une phase de pré-lecture du fichier avec PapaParse (configuration header: false pour analyser la structure initiale).</w:t>
+        <w:t xml:space="preserve"> (</w:t>
+      </w:r>
+      <w:proofErr w:type="gramStart"/>
+      <w:r>
+        <w:t>virgule ,,</w:t>
+      </w:r>
+      <w:proofErr w:type="gramEnd"/>
+      <w:r>
+        <w:t xml:space="preserve"> point-virgule ;, tabulation \t) via une phase de pré-lecture du fichier avec PapaParse (configuration header: false pour analyser la structure initiale).</w:t>
       </w:r>
     </w:p>
     <w:p>
@@ -10225,7 +10233,15 @@
         <w:spacing w:after="80"/>
       </w:pPr>
       <w:r>
-        <w:t xml:space="preserve">Au lieu d'un simple matching de colonnes basique, créez un système de </w:t>
+        <w:t xml:space="preserve">Au lieu d'un simple matching de </w:t>
+      </w:r>
+      <w:proofErr w:type="gramStart"/>
+      <w:r>
+        <w:t>colonnes basique</w:t>
+      </w:r>
+      <w:proofErr w:type="gramEnd"/>
+      <w:r>
+        <w:t xml:space="preserve">, créez un système de </w:t>
       </w:r>
       <w:r>
         <w:rPr>
@@ -10563,255 +10579,311 @@
           <w:i/>
           <w:iCs/>
         </w:rPr>
-        <w:t>"Donnez un nom à ce format (ex: Mon compte pro Crédit Mutuel)"</w:t>
-      </w:r>
-      <w:r>
-        <w:t>.</w:t>
-      </w:r>
-    </w:p>
-    <w:p>
-      <w:pPr>
-        <w:pStyle w:val="Paragraphedeliste"/>
-        <w:numPr>
-          <w:ilvl w:val="0"/>
-          <w:numId w:val="1"/>
-        </w:numPr>
-        <w:spacing w:after="80"/>
-      </w:pPr>
-      <w:r>
-        <w:t xml:space="preserve">Enregistrez ce template dans une nouvelle table Supabase import_templates (id, user_id, nom_template, mapping_json). Lors du prochain import d'un fichier non reconnu, Fondora proposera : </w:t>
-      </w:r>
+        <w:t>"Donnez un nom à ce format (</w:t>
+      </w:r>
+      <w:proofErr w:type="gramStart"/>
       <w:r>
         <w:rPr>
           <w:i/>
           <w:iCs/>
         </w:rPr>
-        <w:t>"Appliquer le format sauvegardé : [Nom du template]"</w:t>
-      </w:r>
-      <w:r>
-        <w:t>.</w:t>
-      </w:r>
-    </w:p>
-    <w:p>
-      <w:pPr>
-        <w:pStyle w:val="Paragraphedeliste"/>
-        <w:numPr>
-          <w:ilvl w:val="0"/>
-          <w:numId w:val="1"/>
-        </w:numPr>
-        <w:spacing w:after="80"/>
-        <w:rPr>
-          <w:b/>
-          <w:bCs/>
-        </w:rPr>
-      </w:pPr>
-      <w:r>
-        <w:rPr>
-          <w:b/>
-          <w:bCs/>
-        </w:rPr>
-        <w:t>4. Moteur de Catégorisation Smart &amp; Apprentissage (Smart Rules)</w:t>
-      </w:r>
-    </w:p>
-    <w:p>
-      <w:pPr>
-        <w:pStyle w:val="Paragraphedeliste"/>
-        <w:numPr>
-          <w:ilvl w:val="0"/>
-          <w:numId w:val="1"/>
-        </w:numPr>
-        <w:spacing w:after="80"/>
-      </w:pPr>
-      <w:r>
-        <w:t>Pour que l'importation soit magique, l'attribution des catégories doit se faire en arrière-plan sans effort :</w:t>
-      </w:r>
-    </w:p>
-    <w:p>
-      <w:pPr>
-        <w:pStyle w:val="Paragraphedeliste"/>
-        <w:numPr>
-          <w:ilvl w:val="0"/>
-          <w:numId w:val="1"/>
-        </w:numPr>
-        <w:spacing w:after="80"/>
-      </w:pPr>
-      <w:r>
-        <w:rPr>
-          <w:b/>
-          <w:bCs/>
-        </w:rPr>
-        <w:t>Les Smart Rules Globales et Utilisateur :</w:t>
-      </w:r>
-    </w:p>
-    <w:p>
-      <w:pPr>
-        <w:pStyle w:val="Paragraphedeliste"/>
-        <w:numPr>
-          <w:ilvl w:val="0"/>
-          <w:numId w:val="1"/>
-        </w:numPr>
-        <w:spacing w:after="80"/>
-      </w:pPr>
-      <w:r>
-        <w:t xml:space="preserve">Créez une table smart_rules (id, user_id, pattern_recherche </w:t>
-      </w:r>
+        <w:t>ex:</w:t>
+      </w:r>
+      <w:proofErr w:type="gramEnd"/>
       <w:r>
         <w:rPr>
           <w:i/>
           <w:iCs/>
         </w:rPr>
-        <w:t>(ex: "NETFLIX")</w:t>
-      </w:r>
-      <w:r>
-        <w:t>, categorie_id).</w:t>
-      </w:r>
-    </w:p>
-    <w:p>
-      <w:pPr>
-        <w:pStyle w:val="Paragraphedeliste"/>
-        <w:numPr>
-          <w:ilvl w:val="0"/>
-          <w:numId w:val="1"/>
-        </w:numPr>
-        <w:spacing w:after="80"/>
-      </w:pPr>
-      <w:r>
-        <w:t>Lors de l'import, le système analyse le libellé de la transaction :</w:t>
-      </w:r>
-    </w:p>
-    <w:p>
-      <w:pPr>
-        <w:pStyle w:val="Paragraphedeliste"/>
-        <w:numPr>
-          <w:ilvl w:val="0"/>
-          <w:numId w:val="1"/>
-        </w:numPr>
-        <w:spacing w:after="80"/>
-      </w:pPr>
-      <w:r>
-        <w:t xml:space="preserve">Si le libellé contient un mot-clé connu de la table globale ou de l'utilisateur, la catégorie est appliquée automatiquement. </w:t>
-      </w:r>
-    </w:p>
-    <w:p>
-      <w:pPr>
-        <w:pStyle w:val="Paragraphedeliste"/>
-        <w:numPr>
-          <w:ilvl w:val="0"/>
-          <w:numId w:val="1"/>
-        </w:numPr>
-        <w:spacing w:after="80"/>
-      </w:pPr>
-      <w:r>
-        <w:rPr>
-          <w:b/>
-          <w:bCs/>
-        </w:rPr>
-        <w:t>Algorithme de similarité textuelle :</w:t>
-      </w:r>
-      <w:r>
-        <w:t xml:space="preserve"> Pour aller plus loin, utilisez un algorithme simple de distance de Levenshtein ou de similarité (par exemple, </w:t>
+        <w:t xml:space="preserve"> Mon compte pro Crédit Mutuel)"</w:t>
+      </w:r>
+      <w:r>
+        <w:t>.</w:t>
+      </w:r>
+    </w:p>
+    <w:p>
+      <w:pPr>
+        <w:pStyle w:val="Paragraphedeliste"/>
+        <w:numPr>
+          <w:ilvl w:val="0"/>
+          <w:numId w:val="1"/>
+        </w:numPr>
+        <w:spacing w:after="80"/>
+      </w:pPr>
+      <w:r>
+        <w:t xml:space="preserve">Enregistrez ce template dans une nouvelle table Supabase import_templates (id, user_id, nom_template, mapping_json). Lors du prochain import d'un fichier non reconnu, Fondora proposera : </w:t>
       </w:r>
       <w:r>
         <w:rPr>
           <w:i/>
           <w:iCs/>
         </w:rPr>
-        <w:t>"Leclerc"</w:t>
-      </w:r>
-      <w:r>
-        <w:t xml:space="preserve">, </w:t>
+        <w:t>"Appliquer le format sauvegardé : [Nom du template]"</w:t>
+      </w:r>
+      <w:r>
+        <w:t>.</w:t>
+      </w:r>
+    </w:p>
+    <w:p>
+      <w:pPr>
+        <w:pStyle w:val="Paragraphedeliste"/>
+        <w:numPr>
+          <w:ilvl w:val="0"/>
+          <w:numId w:val="1"/>
+        </w:numPr>
+        <w:spacing w:after="80"/>
+        <w:rPr>
+          <w:b/>
+          <w:bCs/>
+        </w:rPr>
+      </w:pPr>
+      <w:r>
+        <w:rPr>
+          <w:b/>
+          <w:bCs/>
+        </w:rPr>
+        <w:t>4. Moteur de Catégorisation Smart &amp; Apprentissage (Smart Rules)</w:t>
+      </w:r>
+    </w:p>
+    <w:p>
+      <w:pPr>
+        <w:pStyle w:val="Paragraphedeliste"/>
+        <w:numPr>
+          <w:ilvl w:val="0"/>
+          <w:numId w:val="1"/>
+        </w:numPr>
+        <w:spacing w:after="80"/>
+      </w:pPr>
+      <w:r>
+        <w:t>Pour que l'importation soit magique, l'attribution des catégories doit se faire en arrière-plan sans effort :</w:t>
+      </w:r>
+    </w:p>
+    <w:p>
+      <w:pPr>
+        <w:pStyle w:val="Paragraphedeliste"/>
+        <w:numPr>
+          <w:ilvl w:val="0"/>
+          <w:numId w:val="1"/>
+        </w:numPr>
+        <w:spacing w:after="80"/>
+      </w:pPr>
+      <w:r>
+        <w:rPr>
+          <w:b/>
+          <w:bCs/>
+        </w:rPr>
+        <w:t>Les Smart Rules Globales et Utilisateur :</w:t>
+      </w:r>
+    </w:p>
+    <w:p>
+      <w:pPr>
+        <w:pStyle w:val="Paragraphedeliste"/>
+        <w:numPr>
+          <w:ilvl w:val="0"/>
+          <w:numId w:val="1"/>
+        </w:numPr>
+        <w:spacing w:after="80"/>
+      </w:pPr>
+      <w:r>
+        <w:t xml:space="preserve">Créez une table smart_rules (id, user_id, pattern_recherche </w:t>
       </w:r>
       <w:r>
         <w:rPr>
           <w:i/>
           <w:iCs/>
         </w:rPr>
-        <w:t>"E.Leclerc"</w:t>
-      </w:r>
-      <w:r>
-        <w:t xml:space="preserve">, </w:t>
-      </w:r>
+        <w:t>(</w:t>
+      </w:r>
+      <w:proofErr w:type="gramStart"/>
       <w:r>
         <w:rPr>
           <w:i/>
           <w:iCs/>
         </w:rPr>
-        <w:t>"LECLERC DIS"</w:t>
-      </w:r>
-      <w:r>
-        <w:t xml:space="preserve"> doivent tous être associés à la catégorie </w:t>
-      </w:r>
+        <w:t>ex:</w:t>
+      </w:r>
+      <w:proofErr w:type="gramEnd"/>
       <w:r>
         <w:rPr>
           <w:i/>
           <w:iCs/>
         </w:rPr>
-        <w:t>Alimentation/Supermarché</w:t>
-      </w:r>
-      <w:r>
-        <w:t xml:space="preserve"> si l'utilisateur l'a déjà fait une fois).</w:t>
-      </w:r>
-    </w:p>
-    <w:p>
-      <w:pPr>
-        <w:pStyle w:val="Paragraphedeliste"/>
-        <w:numPr>
-          <w:ilvl w:val="0"/>
-          <w:numId w:val="1"/>
-        </w:numPr>
-        <w:spacing w:after="80"/>
-      </w:pPr>
-      <w:r>
-        <w:rPr>
-          <w:b/>
-          <w:bCs/>
-        </w:rPr>
-        <w:t>Popup d'apprentissage "Quelle catégorie ?" :</w:t>
-      </w:r>
-    </w:p>
-    <w:p>
-      <w:pPr>
-        <w:pStyle w:val="Paragraphedeliste"/>
-        <w:numPr>
-          <w:ilvl w:val="0"/>
-          <w:numId w:val="1"/>
-        </w:numPr>
-        <w:spacing w:after="80"/>
-      </w:pPr>
-      <w:r>
-        <w:t xml:space="preserve">Si une transaction n'est pas reconnue, laissez sa catégorie vide (ou "À catégoriser" avec un badge jaune). </w:t>
-      </w:r>
-    </w:p>
-    <w:p>
-      <w:pPr>
-        <w:pStyle w:val="Paragraphedeliste"/>
-        <w:numPr>
-          <w:ilvl w:val="0"/>
-          <w:numId w:val="1"/>
-        </w:numPr>
-        <w:spacing w:after="80"/>
-      </w:pPr>
-      <w:r>
-        <w:t xml:space="preserve">Lors de la validation de l'import, une modal synthétique ou un panneau latéral liste ces transactions non reconnues. </w:t>
-      </w:r>
-    </w:p>
-    <w:p>
-      <w:pPr>
-        <w:pStyle w:val="Paragraphedeliste"/>
-        <w:numPr>
-          <w:ilvl w:val="0"/>
-          <w:numId w:val="1"/>
-        </w:numPr>
-        <w:spacing w:after="80"/>
-      </w:pPr>
-      <w:r>
-        <w:t xml:space="preserve">Dès que l'utilisateur attribue une catégorie à l'une d'elles, une popup discrète lui demande : </w:t>
+        <w:t xml:space="preserve"> "NETFLIX")</w:t>
+      </w:r>
+      <w:r>
+        <w:t>, categorie_id).</w:t>
+      </w:r>
+    </w:p>
+    <w:p>
+      <w:pPr>
+        <w:pStyle w:val="Paragraphedeliste"/>
+        <w:numPr>
+          <w:ilvl w:val="0"/>
+          <w:numId w:val="1"/>
+        </w:numPr>
+        <w:spacing w:after="80"/>
+      </w:pPr>
+      <w:r>
+        <w:t>Lors de l'import, le système analyse le libellé de la transaction :</w:t>
+      </w:r>
+    </w:p>
+    <w:p>
+      <w:pPr>
+        <w:pStyle w:val="Paragraphedeliste"/>
+        <w:numPr>
+          <w:ilvl w:val="0"/>
+          <w:numId w:val="1"/>
+        </w:numPr>
+        <w:spacing w:after="80"/>
+      </w:pPr>
+      <w:r>
+        <w:t xml:space="preserve">Si le libellé contient un mot-clé connu de la table globale ou de l'utilisateur, la catégorie est appliquée automatiquement. </w:t>
+      </w:r>
+    </w:p>
+    <w:p>
+      <w:pPr>
+        <w:pStyle w:val="Paragraphedeliste"/>
+        <w:numPr>
+          <w:ilvl w:val="0"/>
+          <w:numId w:val="1"/>
+        </w:numPr>
+        <w:spacing w:after="80"/>
+      </w:pPr>
+      <w:r>
+        <w:rPr>
+          <w:b/>
+          <w:bCs/>
+        </w:rPr>
+        <w:t>Algorithme de similarité textuelle :</w:t>
+      </w:r>
+      <w:r>
+        <w:t xml:space="preserve"> Pour aller plus loin, utilisez un algorithme simple de distance de Levenshtein ou de similarité (par exemple, </w:t>
       </w:r>
       <w:r>
         <w:rPr>
           <w:i/>
           <w:iCs/>
         </w:rPr>
+        <w:t>"Leclerc"</w:t>
+      </w:r>
+      <w:r>
+        <w:t xml:space="preserve">, </w:t>
+      </w:r>
+      <w:r>
+        <w:rPr>
+          <w:i/>
+          <w:iCs/>
+        </w:rPr>
+        <w:t>"</w:t>
+      </w:r>
+      <w:proofErr w:type="gramStart"/>
+      <w:r>
+        <w:rPr>
+          <w:i/>
+          <w:iCs/>
+        </w:rPr>
+        <w:t>E.Leclerc</w:t>
+      </w:r>
+      <w:proofErr w:type="gramEnd"/>
+      <w:r>
+        <w:rPr>
+          <w:i/>
+          <w:iCs/>
+        </w:rPr>
+        <w:t>"</w:t>
+      </w:r>
+      <w:r>
+        <w:t xml:space="preserve">, </w:t>
+      </w:r>
+      <w:r>
+        <w:rPr>
+          <w:i/>
+          <w:iCs/>
+        </w:rPr>
+        <w:t>"LECLERC DIS"</w:t>
+      </w:r>
+      <w:r>
+        <w:t xml:space="preserve"> doivent tous être associés à la catégorie </w:t>
+      </w:r>
+      <w:r>
+        <w:rPr>
+          <w:i/>
+          <w:iCs/>
+        </w:rPr>
+        <w:t>Alimentation/Supermarché</w:t>
+      </w:r>
+      <w:r>
+        <w:t xml:space="preserve"> si l'utilisateur l'a déjà fait une fois).</w:t>
+      </w:r>
+    </w:p>
+    <w:p>
+      <w:pPr>
+        <w:pStyle w:val="Paragraphedeliste"/>
+        <w:numPr>
+          <w:ilvl w:val="0"/>
+          <w:numId w:val="1"/>
+        </w:numPr>
+        <w:spacing w:after="80"/>
+      </w:pPr>
+      <w:r>
+        <w:rPr>
+          <w:b/>
+          <w:bCs/>
+        </w:rPr>
+        <w:t>Popup d'apprentissage "Quelle catégorie ?" :</w:t>
+      </w:r>
+    </w:p>
+    <w:p>
+      <w:pPr>
+        <w:pStyle w:val="Paragraphedeliste"/>
+        <w:numPr>
+          <w:ilvl w:val="0"/>
+          <w:numId w:val="1"/>
+        </w:numPr>
+        <w:spacing w:after="80"/>
+      </w:pPr>
+      <w:r>
+        <w:t xml:space="preserve">Si une transaction n'est pas reconnue, laissez sa catégorie vide (ou "À catégoriser" avec un badge jaune). </w:t>
+      </w:r>
+    </w:p>
+    <w:p>
+      <w:pPr>
+        <w:pStyle w:val="Paragraphedeliste"/>
+        <w:numPr>
+          <w:ilvl w:val="0"/>
+          <w:numId w:val="1"/>
+        </w:numPr>
+        <w:spacing w:after="80"/>
+      </w:pPr>
+      <w:r>
+        <w:t xml:space="preserve">Lors de la validation de l'import, une modal synthétique ou un panneau latéral liste ces transactions non reconnues. </w:t>
+      </w:r>
+    </w:p>
+    <w:p>
+      <w:pPr>
+        <w:pStyle w:val="Paragraphedeliste"/>
+        <w:numPr>
+          <w:ilvl w:val="0"/>
+          <w:numId w:val="1"/>
+        </w:numPr>
+        <w:spacing w:after="80"/>
+      </w:pPr>
+      <w:r>
+        <w:t xml:space="preserve">Dès que l'utilisateur attribue une catégorie à l'une d'elles, </w:t>
+      </w:r>
+      <w:proofErr w:type="gramStart"/>
+      <w:r>
+        <w:t>une popup discrète</w:t>
+      </w:r>
+      <w:proofErr w:type="gramEnd"/>
+      <w:r>
+        <w:t xml:space="preserve"> lui demande : </w:t>
+      </w:r>
+      <w:r>
+        <w:rPr>
+          <w:i/>
+          <w:iCs/>
+        </w:rPr>
         <w:t>"Voulez-vous toujours associer les transactions contenant '[Mot-clef]' à la catégorie [Catégorie] ?"</w:t>
       </w:r>
       <w:r>
@@ -11190,8 +11262,216 @@
           <w:numId w:val="1"/>
         </w:numPr>
         <w:spacing w:after="80"/>
-      </w:pPr>
-      <w:r>
+        <w:rPr>
+          <w:lang w:val="en-US"/>
+        </w:rPr>
+      </w:pPr>
+      <w:r>
+        <w:rPr>
+          <w:lang w:val="en-US"/>
+        </w:rPr>
+        <w:t xml:space="preserve">    id UUID DEFAULT gen_random_</w:t>
+      </w:r>
+      <w:proofErr w:type="gramStart"/>
+      <w:r>
+        <w:rPr>
+          <w:lang w:val="en-US"/>
+        </w:rPr>
+        <w:t>uuid(</w:t>
+      </w:r>
+      <w:proofErr w:type="gramEnd"/>
+      <w:r>
+        <w:rPr>
+          <w:lang w:val="en-US"/>
+        </w:rPr>
+        <w:t>) PRIMARY KEY,</w:t>
+      </w:r>
+    </w:p>
+    <w:p>
+      <w:pPr>
+        <w:pStyle w:val="Paragraphedeliste"/>
+        <w:numPr>
+          <w:ilvl w:val="0"/>
+          <w:numId w:val="1"/>
+        </w:numPr>
+        <w:spacing w:after="80"/>
+        <w:rPr>
+          <w:lang w:val="en-US"/>
+        </w:rPr>
+      </w:pPr>
+      <w:r>
+        <w:rPr>
+          <w:lang w:val="en-US"/>
+        </w:rPr>
+        <w:t xml:space="preserve">    user_id UUID REFERENCES </w:t>
+      </w:r>
+      <w:proofErr w:type="gramStart"/>
+      <w:r>
+        <w:rPr>
+          <w:lang w:val="en-US"/>
+        </w:rPr>
+        <w:t>auth.users</w:t>
+      </w:r>
+      <w:proofErr w:type="gramEnd"/>
+      <w:r>
+        <w:rPr>
+          <w:lang w:val="en-US"/>
+        </w:rPr>
+        <w:t>(id) ON DELETE CASCADE NOT NULL,</w:t>
+      </w:r>
+    </w:p>
+    <w:p>
+      <w:pPr>
+        <w:pStyle w:val="Paragraphedeliste"/>
+        <w:numPr>
+          <w:ilvl w:val="0"/>
+          <w:numId w:val="1"/>
+        </w:numPr>
+        <w:spacing w:after="80"/>
+        <w:rPr>
+          <w:lang w:val="en-US"/>
+        </w:rPr>
+      </w:pPr>
+      <w:r>
+        <w:rPr>
+          <w:lang w:val="en-US"/>
+        </w:rPr>
+        <w:t xml:space="preserve">    nom_template TEXT NOT NULL,</w:t>
+      </w:r>
+    </w:p>
+    <w:p>
+      <w:pPr>
+        <w:pStyle w:val="Paragraphedeliste"/>
+        <w:numPr>
+          <w:ilvl w:val="0"/>
+          <w:numId w:val="1"/>
+        </w:numPr>
+        <w:spacing w:after="80"/>
+      </w:pPr>
+      <w:r>
+        <w:rPr>
+          <w:lang w:val="en-US"/>
+        </w:rPr>
+        <w:t xml:space="preserve">    </w:t>
+      </w:r>
+      <w:r>
+        <w:t xml:space="preserve">-- Stocke la configuration des colonnes : </w:t>
+      </w:r>
+      <w:proofErr w:type="gramStart"/>
+      <w:r>
+        <w:t>{ "</w:t>
+      </w:r>
+      <w:proofErr w:type="gramEnd"/>
+      <w:r>
+        <w:t>date": 0, "libelle": 1, "montant": 2 }</w:t>
+      </w:r>
+    </w:p>
+    <w:p>
+      <w:pPr>
+        <w:pStyle w:val="Paragraphedeliste"/>
+        <w:numPr>
+          <w:ilvl w:val="0"/>
+          <w:numId w:val="1"/>
+        </w:numPr>
+        <w:spacing w:after="80"/>
+        <w:rPr>
+          <w:lang w:val="en-US"/>
+        </w:rPr>
+      </w:pPr>
+      <w:r>
+        <w:t xml:space="preserve">    </w:t>
+      </w:r>
+      <w:r>
+        <w:rPr>
+          <w:lang w:val="en-US"/>
+        </w:rPr>
+        <w:t>mapping_config JSONB NOT NULL,</w:t>
+      </w:r>
+    </w:p>
+    <w:p>
+      <w:pPr>
+        <w:pStyle w:val="Paragraphedeliste"/>
+        <w:numPr>
+          <w:ilvl w:val="0"/>
+          <w:numId w:val="1"/>
+        </w:numPr>
+        <w:spacing w:after="80"/>
+        <w:rPr>
+          <w:lang w:val="en-US"/>
+        </w:rPr>
+      </w:pPr>
+      <w:r>
+        <w:rPr>
+          <w:lang w:val="en-US"/>
+        </w:rPr>
+        <w:t xml:space="preserve">    created_at TIMESTAMP WITH TIME ZONE DEFAULT NOW()</w:t>
+      </w:r>
+    </w:p>
+    <w:p>
+      <w:pPr>
+        <w:pStyle w:val="Paragraphedeliste"/>
+        <w:numPr>
+          <w:ilvl w:val="0"/>
+          <w:numId w:val="1"/>
+        </w:numPr>
+        <w:spacing w:after="80"/>
+      </w:pPr>
+      <w:r>
+        <w:t>);</w:t>
+      </w:r>
+    </w:p>
+    <w:p>
+      <w:pPr>
+        <w:pStyle w:val="Paragraphedeliste"/>
+        <w:numPr>
+          <w:ilvl w:val="0"/>
+          <w:numId w:val="1"/>
+        </w:numPr>
+        <w:spacing w:after="80"/>
+      </w:pPr>
+    </w:p>
+    <w:p>
+      <w:pPr>
+        <w:pStyle w:val="Paragraphedeliste"/>
+        <w:numPr>
+          <w:ilvl w:val="0"/>
+          <w:numId w:val="1"/>
+        </w:numPr>
+        <w:spacing w:after="80"/>
+      </w:pPr>
+      <w:r>
+        <w:t>-- Table pour le moteur de catégorisation automatique (Smart Rules)</w:t>
+      </w:r>
+    </w:p>
+    <w:p>
+      <w:pPr>
+        <w:pStyle w:val="Paragraphedeliste"/>
+        <w:numPr>
+          <w:ilvl w:val="0"/>
+          <w:numId w:val="1"/>
+        </w:numPr>
+        <w:spacing w:after="80"/>
+      </w:pPr>
+      <w:r>
+        <w:t>CREATE TABLE smart_rules (</w:t>
+      </w:r>
+    </w:p>
+    <w:p>
+      <w:pPr>
+        <w:pStyle w:val="Paragraphedeliste"/>
+        <w:numPr>
+          <w:ilvl w:val="0"/>
+          <w:numId w:val="1"/>
+        </w:numPr>
+        <w:spacing w:after="80"/>
+        <w:rPr>
+          <w:lang w:val="en-US"/>
+        </w:rPr>
+      </w:pPr>
+      <w:r>
+        <w:rPr>
+          <w:lang w:val="en-US"/>
+        </w:rPr>
         <w:t xml:space="preserve">    id UUID DEFAULT gen_random_uuid() PRIMARY KEY,</w:t>
       </w:r>
     </w:p>
@@ -11203,61 +11483,118 @@
           <w:numId w:val="1"/>
         </w:numPr>
         <w:spacing w:after="80"/>
-      </w:pPr>
-      <w:r>
-        <w:t xml:space="preserve">    user_id UUID REFERENCES auth.users(id) ON DELETE CASCADE NOT NULL,</w:t>
-      </w:r>
-    </w:p>
-    <w:p>
-      <w:pPr>
-        <w:pStyle w:val="Paragraphedeliste"/>
-        <w:numPr>
-          <w:ilvl w:val="0"/>
-          <w:numId w:val="1"/>
-        </w:numPr>
-        <w:spacing w:after="80"/>
-      </w:pPr>
-      <w:r>
-        <w:t xml:space="preserve">    nom_template TEXT NOT NULL,</w:t>
-      </w:r>
-    </w:p>
-    <w:p>
-      <w:pPr>
-        <w:pStyle w:val="Paragraphedeliste"/>
-        <w:numPr>
-          <w:ilvl w:val="0"/>
-          <w:numId w:val="1"/>
-        </w:numPr>
-        <w:spacing w:after="80"/>
-      </w:pPr>
-      <w:r>
-        <w:t xml:space="preserve">    -- Stocke la configuration des colonnes : { "date": 0, "libelle": 1, "montant": 2 }</w:t>
-      </w:r>
-    </w:p>
-    <w:p>
-      <w:pPr>
-        <w:pStyle w:val="Paragraphedeliste"/>
-        <w:numPr>
-          <w:ilvl w:val="0"/>
-          <w:numId w:val="1"/>
-        </w:numPr>
-        <w:spacing w:after="80"/>
-      </w:pPr>
-      <w:r>
-        <w:t xml:space="preserve">    mapping_config JSONB NOT NULL,</w:t>
-      </w:r>
-    </w:p>
-    <w:p>
-      <w:pPr>
-        <w:pStyle w:val="Paragraphedeliste"/>
-        <w:numPr>
-          <w:ilvl w:val="0"/>
-          <w:numId w:val="1"/>
-        </w:numPr>
-        <w:spacing w:after="80"/>
-      </w:pPr>
-      <w:r>
-        <w:t xml:space="preserve">    created_at TIMESTAMP WITH TIME ZONE DEFAULT NOW()</w:t>
+        <w:rPr>
+          <w:lang w:val="en-US"/>
+        </w:rPr>
+      </w:pPr>
+      <w:r>
+        <w:rPr>
+          <w:lang w:val="en-US"/>
+        </w:rPr>
+        <w:t xml:space="preserve">    user_id UUID REFERENCES </w:t>
+      </w:r>
+      <w:proofErr w:type="gramStart"/>
+      <w:r>
+        <w:rPr>
+          <w:lang w:val="en-US"/>
+        </w:rPr>
+        <w:t>auth.users</w:t>
+      </w:r>
+      <w:proofErr w:type="gramEnd"/>
+      <w:r>
+        <w:rPr>
+          <w:lang w:val="en-US"/>
+        </w:rPr>
+        <w:t>(id) ON DELETE CASCADE NOT NULL,</w:t>
+      </w:r>
+    </w:p>
+    <w:p>
+      <w:pPr>
+        <w:pStyle w:val="Paragraphedeliste"/>
+        <w:numPr>
+          <w:ilvl w:val="0"/>
+          <w:numId w:val="1"/>
+        </w:numPr>
+        <w:spacing w:after="80"/>
+        <w:rPr>
+          <w:lang w:val="en-US"/>
+        </w:rPr>
+      </w:pPr>
+      <w:r>
+        <w:rPr>
+          <w:lang w:val="en-US"/>
+        </w:rPr>
+        <w:t xml:space="preserve">    pattern TEXT NOT NULL, -- ex: "Spotify", "Uber", "Total"</w:t>
+      </w:r>
+    </w:p>
+    <w:p>
+      <w:pPr>
+        <w:pStyle w:val="Paragraphedeliste"/>
+        <w:numPr>
+          <w:ilvl w:val="0"/>
+          <w:numId w:val="1"/>
+        </w:numPr>
+        <w:spacing w:after="80"/>
+        <w:rPr>
+          <w:lang w:val="en-US"/>
+        </w:rPr>
+      </w:pPr>
+      <w:r>
+        <w:rPr>
+          <w:lang w:val="en-US"/>
+        </w:rPr>
+        <w:t xml:space="preserve">    categorie_id UUID REFERENCES categories(id) ON DELETE CASCADE NOT NULL,</w:t>
+      </w:r>
+    </w:p>
+    <w:p>
+      <w:pPr>
+        <w:pStyle w:val="Paragraphedeliste"/>
+        <w:numPr>
+          <w:ilvl w:val="0"/>
+          <w:numId w:val="1"/>
+        </w:numPr>
+        <w:spacing w:after="80"/>
+        <w:rPr>
+          <w:lang w:val="en-US"/>
+        </w:rPr>
+      </w:pPr>
+      <w:r>
+        <w:rPr>
+          <w:lang w:val="en-US"/>
+        </w:rPr>
+        <w:t xml:space="preserve">    created_at TIMESTAMP WITH TIME ZONE DEFAULT NOW(),</w:t>
+      </w:r>
+    </w:p>
+    <w:p>
+      <w:pPr>
+        <w:pStyle w:val="Paragraphedeliste"/>
+        <w:numPr>
+          <w:ilvl w:val="0"/>
+          <w:numId w:val="1"/>
+        </w:numPr>
+        <w:spacing w:after="80"/>
+      </w:pPr>
+      <w:r>
+        <w:rPr>
+          <w:lang w:val="en-US"/>
+        </w:rPr>
+        <w:t xml:space="preserve">    </w:t>
+      </w:r>
+      <w:r>
+        <w:t>-- Évite les règles redondantes pour un même utilisateur sur un même mot-clé</w:t>
+      </w:r>
+    </w:p>
+    <w:p>
+      <w:pPr>
+        <w:pStyle w:val="Paragraphedeliste"/>
+        <w:numPr>
+          <w:ilvl w:val="0"/>
+          <w:numId w:val="1"/>
+        </w:numPr>
+        <w:spacing w:after="80"/>
+      </w:pPr>
+      <w:r>
+        <w:t xml:space="preserve">    CONSTRAINT unique_user_pattern UNIQUE (user_id, pattern)</w:t>
       </w:r>
     </w:p>
     <w:p>
@@ -11293,146 +11630,6 @@
         <w:spacing w:after="80"/>
       </w:pPr>
       <w:r>
-        <w:t>-- Table pour le moteur de catégorisation automatique (Smart Rules)</w:t>
-      </w:r>
-    </w:p>
-    <w:p>
-      <w:pPr>
-        <w:pStyle w:val="Paragraphedeliste"/>
-        <w:numPr>
-          <w:ilvl w:val="0"/>
-          <w:numId w:val="1"/>
-        </w:numPr>
-        <w:spacing w:after="80"/>
-      </w:pPr>
-      <w:r>
-        <w:t>CREATE TABLE smart_rules (</w:t>
-      </w:r>
-    </w:p>
-    <w:p>
-      <w:pPr>
-        <w:pStyle w:val="Paragraphedeliste"/>
-        <w:numPr>
-          <w:ilvl w:val="0"/>
-          <w:numId w:val="1"/>
-        </w:numPr>
-        <w:spacing w:after="80"/>
-      </w:pPr>
-      <w:r>
-        <w:t xml:space="preserve">    id UUID DEFAULT gen_random_uuid() PRIMARY KEY,</w:t>
-      </w:r>
-    </w:p>
-    <w:p>
-      <w:pPr>
-        <w:pStyle w:val="Paragraphedeliste"/>
-        <w:numPr>
-          <w:ilvl w:val="0"/>
-          <w:numId w:val="1"/>
-        </w:numPr>
-        <w:spacing w:after="80"/>
-      </w:pPr>
-      <w:r>
-        <w:t xml:space="preserve">    user_id UUID REFERENCES auth.users(id) ON DELETE CASCADE NOT NULL,</w:t>
-      </w:r>
-    </w:p>
-    <w:p>
-      <w:pPr>
-        <w:pStyle w:val="Paragraphedeliste"/>
-        <w:numPr>
-          <w:ilvl w:val="0"/>
-          <w:numId w:val="1"/>
-        </w:numPr>
-        <w:spacing w:after="80"/>
-      </w:pPr>
-      <w:r>
-        <w:t xml:space="preserve">    pattern TEXT NOT NULL, -- ex: "Spotify", "Uber", "Total"</w:t>
-      </w:r>
-    </w:p>
-    <w:p>
-      <w:pPr>
-        <w:pStyle w:val="Paragraphedeliste"/>
-        <w:numPr>
-          <w:ilvl w:val="0"/>
-          <w:numId w:val="1"/>
-        </w:numPr>
-        <w:spacing w:after="80"/>
-      </w:pPr>
-      <w:r>
-        <w:t xml:space="preserve">    categorie_id UUID REFERENCES categories(id) ON DELETE CASCADE NOT NULL,</w:t>
-      </w:r>
-    </w:p>
-    <w:p>
-      <w:pPr>
-        <w:pStyle w:val="Paragraphedeliste"/>
-        <w:numPr>
-          <w:ilvl w:val="0"/>
-          <w:numId w:val="1"/>
-        </w:numPr>
-        <w:spacing w:after="80"/>
-      </w:pPr>
-      <w:r>
-        <w:t xml:space="preserve">    created_at TIMESTAMP WITH TIME ZONE DEFAULT NOW(),</w:t>
-      </w:r>
-    </w:p>
-    <w:p>
-      <w:pPr>
-        <w:pStyle w:val="Paragraphedeliste"/>
-        <w:numPr>
-          <w:ilvl w:val="0"/>
-          <w:numId w:val="1"/>
-        </w:numPr>
-        <w:spacing w:after="80"/>
-      </w:pPr>
-      <w:r>
-        <w:t xml:space="preserve">    -- Évite les règles redondantes pour un même utilisateur sur un même mot-clé</w:t>
-      </w:r>
-    </w:p>
-    <w:p>
-      <w:pPr>
-        <w:pStyle w:val="Paragraphedeliste"/>
-        <w:numPr>
-          <w:ilvl w:val="0"/>
-          <w:numId w:val="1"/>
-        </w:numPr>
-        <w:spacing w:after="80"/>
-      </w:pPr>
-      <w:r>
-        <w:t xml:space="preserve">    CONSTRAINT unique_user_pattern UNIQUE (user_id, pattern)</w:t>
-      </w:r>
-    </w:p>
-    <w:p>
-      <w:pPr>
-        <w:pStyle w:val="Paragraphedeliste"/>
-        <w:numPr>
-          <w:ilvl w:val="0"/>
-          <w:numId w:val="1"/>
-        </w:numPr>
-        <w:spacing w:after="80"/>
-      </w:pPr>
-      <w:r>
-        <w:t>);</w:t>
-      </w:r>
-    </w:p>
-    <w:p>
-      <w:pPr>
-        <w:pStyle w:val="Paragraphedeliste"/>
-        <w:numPr>
-          <w:ilvl w:val="0"/>
-          <w:numId w:val="1"/>
-        </w:numPr>
-        <w:spacing w:after="80"/>
-      </w:pPr>
-    </w:p>
-    <w:p>
-      <w:pPr>
-        <w:pStyle w:val="Paragraphedeliste"/>
-        <w:numPr>
-          <w:ilvl w:val="0"/>
-          <w:numId w:val="1"/>
-        </w:numPr>
-        <w:spacing w:after="80"/>
-      </w:pPr>
-      <w:r>
         <w:t>-- Index pour accélérer la recherche des patterns lors du parsing</w:t>
       </w:r>
     </w:p>
@@ -11444,8 +11641,14 @@
           <w:numId w:val="1"/>
         </w:numPr>
         <w:spacing w:after="80"/>
-      </w:pPr>
-      <w:r>
+        <w:rPr>
+          <w:lang w:val="en-US"/>
+        </w:rPr>
+      </w:pPr>
+      <w:r>
+        <w:rPr>
+          <w:lang w:val="en-US"/>
+        </w:rPr>
         <w:t>CREATE INDEX idx_smart_rules_pattern ON smart_rules(user_id, pattern);</w:t>
       </w:r>
     </w:p>
@@ -11525,7 +11728,15 @@
         <w:spacing w:after="80"/>
       </w:pPr>
       <w:r>
-        <w:t>[Détection Auto de la Banque] ──(Non reconnue)──</w:t>
+        <w:t>[Détection Auto de la Banque] ─</w:t>
+      </w:r>
+      <w:proofErr w:type="gramStart"/>
+      <w:r>
+        <w:t>─(</w:t>
+      </w:r>
+      <w:proofErr w:type="gramEnd"/>
+      <w:r>
+        <w:t>Non reconnue)──</w:t>
       </w:r>
       <w:r>
         <w:rPr>
@@ -17046,6 +17257,2779 @@
     <w:p>
       <w:pPr>
         <w:spacing w:after="120"/>
+        <w:rPr>
+          <w:b/>
+          <w:bCs/>
+        </w:rPr>
+      </w:pPr>
+      <w:r>
+        <w:br/>
+      </w:r>
+      <w:r>
+        <w:rPr>
+          <w:b/>
+          <w:bCs/>
+        </w:rPr>
+        <w:t>MODULE BUDGET ENRICHI (FONDORA PRO)</w:t>
+      </w:r>
+    </w:p>
+    <w:p>
+      <w:pPr>
+        <w:spacing w:after="120"/>
+        <w:rPr>
+          <w:b/>
+          <w:bCs/>
+        </w:rPr>
+      </w:pPr>
+      <w:r>
+        <w:rPr>
+          <w:b/>
+          <w:bCs/>
+        </w:rPr>
+        <w:t>Phase 1 : Base de Données &amp; Modèles Locaux (Les Fondations)</w:t>
+      </w:r>
+    </w:p>
+    <w:p>
+      <w:pPr>
+        <w:spacing w:after="120"/>
+      </w:pPr>
+      <w:r>
+        <w:rPr>
+          <w:i/>
+          <w:iCs/>
+        </w:rPr>
+        <w:t>Objectif : Structurer les données dans Supabase et configurer les fichiers de référence locaux sans surcharger ton serveur.</w:t>
+      </w:r>
+    </w:p>
+    <w:p>
+      <w:pPr>
+        <w:spacing w:after="120"/>
+        <w:rPr>
+          <w:b/>
+          <w:bCs/>
+        </w:rPr>
+      </w:pPr>
+      <w:r>
+        <w:rPr>
+          <w:b/>
+          <w:bCs/>
+        </w:rPr>
+        <w:t>Étape 1.1 : Mise à jour du Schéma SQL (Supabase)</w:t>
+      </w:r>
+    </w:p>
+    <w:p>
+      <w:pPr>
+        <w:spacing w:after="120"/>
+      </w:pPr>
+      <w:r>
+        <w:t>Exécute ce script de migration pour lier les abonnements, mémoriser les règles de catégorisation locales et connecter tes modules.</w:t>
+      </w:r>
+    </w:p>
+    <w:p>
+      <w:pPr>
+        <w:spacing w:after="120"/>
+      </w:pPr>
+      <w:r>
+        <w:t>SQL</w:t>
+      </w:r>
+    </w:p>
+    <w:p>
+      <w:pPr>
+        <w:spacing w:after="120"/>
+      </w:pPr>
+      <w:r>
+        <w:t>-- Extension pour la génération d'UUID si non présente</w:t>
+      </w:r>
+    </w:p>
+    <w:p>
+      <w:pPr>
+        <w:spacing w:after="120"/>
+      </w:pPr>
+      <w:r>
+        <w:t>CREATE EXTENSION IF NOT EXISTS "uuid-ossp";</w:t>
+      </w:r>
+    </w:p>
+    <w:p>
+      <w:pPr>
+        <w:spacing w:after="120"/>
+      </w:pPr>
+    </w:p>
+    <w:p>
+      <w:pPr>
+        <w:spacing w:after="120"/>
+      </w:pPr>
+      <w:r>
+        <w:t>-- Table pour les alertes d'abonnements et rappels d'essais gratuits</w:t>
+      </w:r>
+    </w:p>
+    <w:p>
+      <w:pPr>
+        <w:spacing w:after="120"/>
+      </w:pPr>
+      <w:r>
+        <w:t>CREATE TABLE IF NOT EXISTS abonnements_suivi (</w:t>
+      </w:r>
+    </w:p>
+    <w:p>
+      <w:pPr>
+        <w:spacing w:after="120"/>
+      </w:pPr>
+      <w:r>
+        <w:t xml:space="preserve">    id UUID DEFAULT gen_random_uuid() PRIMARY KEY,</w:t>
+      </w:r>
+    </w:p>
+    <w:p>
+      <w:pPr>
+        <w:spacing w:after="120"/>
+      </w:pPr>
+      <w:r>
+        <w:t xml:space="preserve">    user_id UUID REFERENCES auth.users(id) ON DELETE CASCADE NOT NULL,</w:t>
+      </w:r>
+    </w:p>
+    <w:p>
+      <w:pPr>
+        <w:spacing w:after="120"/>
+      </w:pPr>
+      <w:r>
+        <w:t xml:space="preserve">    nom_abonnement TEXT NOT NULL,</w:t>
+      </w:r>
+    </w:p>
+    <w:p>
+      <w:pPr>
+        <w:spacing w:after="120"/>
+      </w:pPr>
+      <w:r>
+        <w:t xml:space="preserve">    montant NUMERIC(10, 2) NOT NULL,</w:t>
+      </w:r>
+    </w:p>
+    <w:p>
+      <w:pPr>
+        <w:spacing w:after="120"/>
+      </w:pPr>
+      <w:r>
+        <w:t xml:space="preserve">    date_prochain_prelevement DATE NOT NULL,</w:t>
+      </w:r>
+    </w:p>
+    <w:p>
+      <w:pPr>
+        <w:spacing w:after="120"/>
+      </w:pPr>
+      <w:r>
+        <w:t xml:space="preserve">    frequence TEXT DEFAULT 'mensuel', -- 'mensuel', 'annuel'</w:t>
+      </w:r>
+    </w:p>
+    <w:p>
+      <w:pPr>
+        <w:spacing w:after="120"/>
+      </w:pPr>
+      <w:r>
+        <w:t xml:space="preserve">    est_periode_essai BOOLEAN DEFAULT FALSE,</w:t>
+      </w:r>
+    </w:p>
+    <w:p>
+      <w:pPr>
+        <w:spacing w:after="120"/>
+      </w:pPr>
+      <w:r>
+        <w:t xml:space="preserve">    date_fin_essai DATE,</w:t>
+      </w:r>
+    </w:p>
+    <w:p>
+      <w:pPr>
+        <w:spacing w:after="120"/>
+      </w:pPr>
+      <w:r>
+        <w:t xml:space="preserve">    created_at TIMESTAMP WITH TIME ZONE DEFAULT NOW()</w:t>
+      </w:r>
+    </w:p>
+    <w:p>
+      <w:pPr>
+        <w:spacing w:after="120"/>
+      </w:pPr>
+      <w:r>
+        <w:t>);</w:t>
+      </w:r>
+    </w:p>
+    <w:p>
+      <w:pPr>
+        <w:spacing w:after="120"/>
+      </w:pPr>
+    </w:p>
+    <w:p>
+      <w:pPr>
+        <w:spacing w:after="120"/>
+      </w:pPr>
+      <w:r>
+        <w:t>-- Index pour accélérer les requêtes d'abonnements par utilisateur</w:t>
+      </w:r>
+    </w:p>
+    <w:p>
+      <w:pPr>
+        <w:spacing w:after="120"/>
+      </w:pPr>
+      <w:r>
+        <w:t>CREATE INDEX IF NOT EXISTS idx_abonnements_user ON abonnements_suivi(user_id);</w:t>
+      </w:r>
+    </w:p>
+    <w:p>
+      <w:pPr>
+        <w:spacing w:after="120"/>
+        <w:rPr>
+          <w:b/>
+          <w:bCs/>
+        </w:rPr>
+      </w:pPr>
+      <w:r>
+        <w:rPr>
+          <w:b/>
+          <w:bCs/>
+        </w:rPr>
+        <w:t>Étape 1.2 : Création du Dictionnaire de Mots-Clés Locaux (config/categories_dictionary.json)</w:t>
+      </w:r>
+    </w:p>
+    <w:p>
+      <w:pPr>
+        <w:spacing w:after="120"/>
+      </w:pPr>
+      <w:r>
+        <w:t xml:space="preserve">Crée un fichier de configuration statique dans ton projet React. Ce fichier servira au </w:t>
+      </w:r>
+      <w:r>
+        <w:rPr>
+          <w:b/>
+          <w:bCs/>
+        </w:rPr>
+        <w:t>Moteur Zéro-IA</w:t>
+      </w:r>
+      <w:r>
+        <w:t xml:space="preserve"> pour catégoriser instantanément les transactions à l'import sans appeler d'API payante.</w:t>
+      </w:r>
+    </w:p>
+    <w:p>
+      <w:pPr>
+        <w:spacing w:after="120"/>
+      </w:pPr>
+      <w:r>
+        <w:t>JSON</w:t>
+      </w:r>
+    </w:p>
+    <w:p>
+      <w:pPr>
+        <w:spacing w:after="120"/>
+      </w:pPr>
+      <w:r>
+        <w:t>{</w:t>
+      </w:r>
+    </w:p>
+    <w:p>
+      <w:pPr>
+        <w:spacing w:after="120"/>
+      </w:pPr>
+      <w:r>
+        <w:t xml:space="preserve">  "Alimentation": ["LECLERC", "CARREFOUR", "LIDL", "AUCHAN", "MONOPRIX", "ALDI", "SUPER U", "INTERMARCHE"],</w:t>
+      </w:r>
+    </w:p>
+    <w:p>
+      <w:pPr>
+        <w:spacing w:after="120"/>
+      </w:pPr>
+      <w:r>
+        <w:lastRenderedPageBreak/>
+        <w:t xml:space="preserve">  "Restauration": ["MCDONALD", "UBER EATS", "DELIVEROO", "BURGER KING", "KFC", "STARBUCKS", "FOUQUETS", "RESTAURANT", "BISTROT"],</w:t>
+      </w:r>
+    </w:p>
+    <w:p>
+      <w:pPr>
+        <w:spacing w:after="120"/>
+      </w:pPr>
+      <w:r>
+        <w:t xml:space="preserve">  "Logement / Charges": ["EDF", "ENGIE", "TOTALENERGIES", "VEOLIA", "LOYER", "SYNDIC", "COPROPRIETE"],</w:t>
+      </w:r>
+    </w:p>
+    <w:p>
+      <w:pPr>
+        <w:spacing w:after="120"/>
+      </w:pPr>
+      <w:r>
+        <w:t xml:space="preserve">  "Abonnements / Loisirs": ["NETFLIX", "SPOTIFY", "AMAZON PRIME", "DEEZER", "CANAL+", "DISNEYPLUS", "GYM", "BASIC FIT"],</w:t>
+      </w:r>
+    </w:p>
+    <w:p>
+      <w:pPr>
+        <w:spacing w:after="120"/>
+      </w:pPr>
+      <w:r>
+        <w:t xml:space="preserve">  "Transports": ["SNCF", "RATP", "TOTAL STATION", "SHELL", "UBER TRIP", "PÉAGE", "APRR", "VINCI AUTOROUTES"],</w:t>
+      </w:r>
+    </w:p>
+    <w:p>
+      <w:pPr>
+        <w:spacing w:after="120"/>
+      </w:pPr>
+      <w:r>
+        <w:t xml:space="preserve">  "Frais Bancaires": ["AGIOS", "COMMISSION D'INTERVENTION", "FRAIS DE TENUE DE COMPTE", "COTISATION CARTE"]</w:t>
+      </w:r>
+    </w:p>
+    <w:p>
+      <w:pPr>
+        <w:spacing w:after="120"/>
+      </w:pPr>
+      <w:r>
+        <w:t>}</w:t>
+      </w:r>
+    </w:p>
+    <w:p>
+      <w:pPr>
+        <w:spacing w:after="120"/>
+        <w:rPr>
+          <w:b/>
+          <w:bCs/>
+        </w:rPr>
+      </w:pPr>
+      <w:r>
+        <w:rPr>
+          <w:b/>
+          <w:bCs/>
+        </w:rPr>
+        <w:t>Phase 2 : Le Moteur d'Importation &amp; Analyseur "Zéro-IA" (Regex Local)</w:t>
+      </w:r>
+    </w:p>
+    <w:p>
+      <w:pPr>
+        <w:spacing w:after="120"/>
+      </w:pPr>
+      <w:r>
+        <w:rPr>
+          <w:i/>
+          <w:iCs/>
+        </w:rPr>
+        <w:t>Objectif : Rendre le traitement de l'import CSV (Étape 14.1) instantané et intelligent.</w:t>
+      </w:r>
+    </w:p>
+    <w:p>
+      <w:pPr>
+        <w:spacing w:after="120"/>
+        <w:rPr>
+          <w:b/>
+          <w:bCs/>
+        </w:rPr>
+      </w:pPr>
+      <w:r>
+        <w:rPr>
+          <w:b/>
+          <w:bCs/>
+        </w:rPr>
+        <w:t>Étape 2.1 : Hook de Catégorisation hooks/useCategoryPredictor.js</w:t>
+      </w:r>
+    </w:p>
+    <w:p>
+      <w:pPr>
+        <w:spacing w:after="120"/>
+      </w:pPr>
+      <w:r>
+        <w:t>Ce hook va analyser le libellé de la transaction importée à l'aide de regex basées sur le dictionnaire et les smart_rules personnalisées de l'utilisateur stockées en base de données.</w:t>
+      </w:r>
+    </w:p>
+    <w:p>
+      <w:pPr>
+        <w:spacing w:after="120"/>
+      </w:pPr>
+      <w:r>
+        <w:t>JavaScript</w:t>
+      </w:r>
+    </w:p>
+    <w:p>
+      <w:pPr>
+        <w:spacing w:after="120"/>
+      </w:pPr>
+      <w:r>
+        <w:t>import { useCallback } from 'react';</w:t>
+      </w:r>
+    </w:p>
+    <w:p>
+      <w:pPr>
+        <w:spacing w:after="120"/>
+      </w:pPr>
+      <w:r>
+        <w:t>import categoriesDict from '../config/categories_dictionary.json';</w:t>
+      </w:r>
+    </w:p>
+    <w:p>
+      <w:pPr>
+        <w:spacing w:after="120"/>
+      </w:pPr>
+    </w:p>
+    <w:p>
+      <w:pPr>
+        <w:spacing w:after="120"/>
+      </w:pPr>
+      <w:r>
+        <w:t>export function useCategoryPredictor() {</w:t>
+      </w:r>
+    </w:p>
+    <w:p>
+      <w:pPr>
+        <w:spacing w:after="120"/>
+      </w:pPr>
+      <w:r>
+        <w:t xml:space="preserve">  const predictCategory = useCallback((libelle, userSmartRules = []) =&gt; {</w:t>
+      </w:r>
+    </w:p>
+    <w:p>
+      <w:pPr>
+        <w:spacing w:after="120"/>
+      </w:pPr>
+      <w:r>
+        <w:t xml:space="preserve">    const cleanLibelle = libelle.toUpperCase();</w:t>
+      </w:r>
+    </w:p>
+    <w:p>
+      <w:pPr>
+        <w:spacing w:after="120"/>
+      </w:pPr>
+    </w:p>
+    <w:p>
+      <w:pPr>
+        <w:spacing w:after="120"/>
+      </w:pPr>
+      <w:r>
+        <w:t xml:space="preserve">    // 1. Tester d'abord les règles personnalisées de l'utilisateur (Priorité haute)</w:t>
+      </w:r>
+    </w:p>
+    <w:p>
+      <w:pPr>
+        <w:spacing w:after="120"/>
+      </w:pPr>
+      <w:r>
+        <w:t xml:space="preserve">    const matchedUserRule = userSmartRules.find(rule =&gt; </w:t>
+      </w:r>
+    </w:p>
+    <w:p>
+      <w:pPr>
+        <w:spacing w:after="120"/>
+      </w:pPr>
+      <w:r>
+        <w:t xml:space="preserve">      cleanLibelle.includes(rule.pattern.toUpperCase())</w:t>
+      </w:r>
+    </w:p>
+    <w:p>
+      <w:pPr>
+        <w:spacing w:after="120"/>
+      </w:pPr>
+      <w:r>
+        <w:t xml:space="preserve">    );</w:t>
+      </w:r>
+    </w:p>
+    <w:p>
+      <w:pPr>
+        <w:spacing w:after="120"/>
+      </w:pPr>
+      <w:r>
+        <w:t xml:space="preserve">    if (matchedUserRule) return matchedUserRule.categorie_id;</w:t>
+      </w:r>
+    </w:p>
+    <w:p>
+      <w:pPr>
+        <w:spacing w:after="120"/>
+      </w:pPr>
+    </w:p>
+    <w:p>
+      <w:pPr>
+        <w:spacing w:after="120"/>
+      </w:pPr>
+      <w:r>
+        <w:t xml:space="preserve">    // 2. Tester le dictionnaire local standard</w:t>
+      </w:r>
+    </w:p>
+    <w:p>
+      <w:pPr>
+        <w:spacing w:after="120"/>
+      </w:pPr>
+      <w:r>
+        <w:t xml:space="preserve">    for (const [category, keywords] of Object.entries(categoriesDict)) {</w:t>
+      </w:r>
+    </w:p>
+    <w:p>
+      <w:pPr>
+        <w:spacing w:after="120"/>
+      </w:pPr>
+      <w:r>
+        <w:t xml:space="preserve">      for (const keyword of keywords) {</w:t>
+      </w:r>
+    </w:p>
+    <w:p>
+      <w:pPr>
+        <w:spacing w:after="120"/>
+      </w:pPr>
+      <w:r>
+        <w:t xml:space="preserve">        if (cleanLibelle.includes(keyword)) {</w:t>
+      </w:r>
+    </w:p>
+    <w:p>
+      <w:pPr>
+        <w:spacing w:after="120"/>
+      </w:pPr>
+      <w:r>
+        <w:t xml:space="preserve">          return category; // Retourne le nom ou l'ID de la catégorie prédéfinie</w:t>
+      </w:r>
+    </w:p>
+    <w:p>
+      <w:pPr>
+        <w:spacing w:after="120"/>
+      </w:pPr>
+      <w:r>
+        <w:t xml:space="preserve">        }</w:t>
+      </w:r>
+    </w:p>
+    <w:p>
+      <w:pPr>
+        <w:spacing w:after="120"/>
+      </w:pPr>
+      <w:r>
+        <w:t xml:space="preserve">      }</w:t>
+      </w:r>
+    </w:p>
+    <w:p>
+      <w:pPr>
+        <w:spacing w:after="120"/>
+      </w:pPr>
+      <w:r>
+        <w:t xml:space="preserve">    }</w:t>
+      </w:r>
+    </w:p>
+    <w:p>
+      <w:pPr>
+        <w:spacing w:after="120"/>
+      </w:pPr>
+    </w:p>
+    <w:p>
+      <w:pPr>
+        <w:spacing w:after="120"/>
+      </w:pPr>
+      <w:r>
+        <w:t xml:space="preserve">    return null; // Non identifié -&gt; catégorie par défaut "À classer"</w:t>
+      </w:r>
+    </w:p>
+    <w:p>
+      <w:pPr>
+        <w:spacing w:after="120"/>
+      </w:pPr>
+      <w:r>
+        <w:t xml:space="preserve">  }, []);</w:t>
+      </w:r>
+    </w:p>
+    <w:p>
+      <w:pPr>
+        <w:spacing w:after="120"/>
+      </w:pPr>
+    </w:p>
+    <w:p>
+      <w:pPr>
+        <w:spacing w:after="120"/>
+      </w:pPr>
+      <w:r>
+        <w:t xml:space="preserve">  return { predictCategory };</w:t>
+      </w:r>
+    </w:p>
+    <w:p>
+      <w:pPr>
+        <w:spacing w:after="120"/>
+      </w:pPr>
+      <w:r>
+        <w:t>}</w:t>
+      </w:r>
+    </w:p>
+    <w:p>
+      <w:pPr>
+        <w:spacing w:after="120"/>
+        <w:rPr>
+          <w:b/>
+          <w:bCs/>
+        </w:rPr>
+      </w:pPr>
+      <w:r>
+        <w:rPr>
+          <w:b/>
+          <w:bCs/>
+        </w:rPr>
+        <w:t>Phase 3 : Le Widget "Restant à Vivre" Réel et Prédictif (Calcul Front-End)</w:t>
+      </w:r>
+    </w:p>
+    <w:p>
+      <w:pPr>
+        <w:spacing w:after="120"/>
+      </w:pPr>
+      <w:r>
+        <w:rPr>
+          <w:i/>
+          <w:iCs/>
+        </w:rPr>
+        <w:t>Objectif : Rassurer l'utilisateur en calculant en temps réel son pouvoir d'achat restant.</w:t>
+      </w:r>
+    </w:p>
+    <w:p>
+      <w:pPr>
+        <w:spacing w:after="120"/>
+        <w:rPr>
+          <w:b/>
+          <w:bCs/>
+        </w:rPr>
+      </w:pPr>
+      <w:r>
+        <w:rPr>
+          <w:b/>
+          <w:bCs/>
+        </w:rPr>
+        <w:t>Étape 3.1 : Logique de Calcul du "Restant à Vivre"</w:t>
+      </w:r>
+    </w:p>
+    <w:p>
+      <w:pPr>
+        <w:spacing w:after="120"/>
+      </w:pPr>
+      <w:r>
+        <w:t>Créer un utilitaire de calcul utils/budgetCalculator.js :</w:t>
+      </w:r>
+    </w:p>
+    <w:p>
+      <w:pPr>
+        <w:spacing w:after="120"/>
+      </w:pPr>
+      <w:r>
+        <w:t>JavaScript</w:t>
+      </w:r>
+    </w:p>
+    <w:p>
+      <w:pPr>
+        <w:spacing w:after="120"/>
+      </w:pPr>
+      <w:r>
+        <w:t>export function calculerRestantAVivre({</w:t>
+      </w:r>
+    </w:p>
+    <w:p>
+      <w:pPr>
+        <w:spacing w:after="120"/>
+      </w:pPr>
+      <w:r>
+        <w:t xml:space="preserve">  soldeComptesCourants,</w:t>
+      </w:r>
+    </w:p>
+    <w:p>
+      <w:pPr>
+        <w:spacing w:after="120"/>
+      </w:pPr>
+      <w:r>
+        <w:t xml:space="preserve">  transactionsDuMois,</w:t>
+      </w:r>
+    </w:p>
+    <w:p>
+      <w:pPr>
+        <w:spacing w:after="120"/>
+      </w:pPr>
+      <w:r>
+        <w:t xml:space="preserve">  depensesRecurrentes,</w:t>
+      </w:r>
+    </w:p>
+    <w:p>
+      <w:pPr>
+        <w:spacing w:after="120"/>
+      </w:pPr>
+      <w:r>
+        <w:t xml:space="preserve">  objectifsEpargneMois</w:t>
+      </w:r>
+    </w:p>
+    <w:p>
+      <w:pPr>
+        <w:spacing w:after="120"/>
+      </w:pPr>
+      <w:r>
+        <w:t>}) {</w:t>
+      </w:r>
+    </w:p>
+    <w:p>
+      <w:pPr>
+        <w:spacing w:after="120"/>
+      </w:pPr>
+      <w:r>
+        <w:t xml:space="preserve">  const date = new Date();</w:t>
+      </w:r>
+    </w:p>
+    <w:p>
+      <w:pPr>
+        <w:spacing w:after="120"/>
+      </w:pPr>
+      <w:r>
+        <w:t xml:space="preserve">  const jourActuel = date.getDate();</w:t>
+      </w:r>
+    </w:p>
+    <w:p>
+      <w:pPr>
+        <w:spacing w:after="120"/>
+      </w:pPr>
+      <w:r>
+        <w:t xml:space="preserve">  const dernierJourDuMois = new Date(date.getFullYear(), date.getMonth() + 1, 0).getDate();</w:t>
+      </w:r>
+    </w:p>
+    <w:p>
+      <w:pPr>
+        <w:spacing w:after="120"/>
+      </w:pPr>
+    </w:p>
+    <w:p>
+      <w:pPr>
+        <w:spacing w:after="120"/>
+      </w:pPr>
+      <w:r>
+        <w:t xml:space="preserve">  // 1. Calculer les dépenses récurrentes encore à venir ce mois-ci</w:t>
+      </w:r>
+    </w:p>
+    <w:p>
+      <w:pPr>
+        <w:spacing w:after="120"/>
+      </w:pPr>
+      <w:r>
+        <w:t xml:space="preserve">  const depensesAvenir = depensesRecurrentes.filter(dep =&gt; {</w:t>
+      </w:r>
+    </w:p>
+    <w:p>
+      <w:pPr>
+        <w:spacing w:after="120"/>
+      </w:pPr>
+      <w:r>
+        <w:t xml:space="preserve">    // Si le jour de prélèvement est supérieur au jour actuel du mois</w:t>
+      </w:r>
+    </w:p>
+    <w:p>
+      <w:pPr>
+        <w:spacing w:after="120"/>
+      </w:pPr>
+      <w:r>
+        <w:t xml:space="preserve">    return dep.jour_prelevement &gt; jourActuel;</w:t>
+      </w:r>
+    </w:p>
+    <w:p>
+      <w:pPr>
+        <w:spacing w:after="120"/>
+      </w:pPr>
+      <w:r>
+        <w:t xml:space="preserve">  }).reduce((sum, dep) =&gt; sum + parseFloat(dep.montant), 0);</w:t>
+      </w:r>
+    </w:p>
+    <w:p>
+      <w:pPr>
+        <w:spacing w:after="120"/>
+      </w:pPr>
+    </w:p>
+    <w:p>
+      <w:pPr>
+        <w:spacing w:after="120"/>
+      </w:pPr>
+      <w:r>
+        <w:t xml:space="preserve">  // 2. Calculer le montant déjà dépensé ce mois-ci</w:t>
+      </w:r>
+    </w:p>
+    <w:p>
+      <w:pPr>
+        <w:spacing w:after="120"/>
+      </w:pPr>
+      <w:r>
+        <w:t xml:space="preserve">  const totalDepenseCeMois = transactionsDuMois</w:t>
+      </w:r>
+    </w:p>
+    <w:p>
+      <w:pPr>
+        <w:spacing w:after="120"/>
+      </w:pPr>
+      <w:r>
+        <w:t xml:space="preserve">    .filter(t =&gt; t.montant &lt; 0)</w:t>
+      </w:r>
+    </w:p>
+    <w:p>
+      <w:pPr>
+        <w:spacing w:after="120"/>
+      </w:pPr>
+      <w:r>
+        <w:t xml:space="preserve">    .reduce((sum, t) =&gt; sum + Math.abs(parseFloat(t.montant)), 0);</w:t>
+      </w:r>
+    </w:p>
+    <w:p>
+      <w:pPr>
+        <w:spacing w:after="120"/>
+      </w:pPr>
+    </w:p>
+    <w:p>
+      <w:pPr>
+        <w:spacing w:after="120"/>
+      </w:pPr>
+      <w:r>
+        <w:t xml:space="preserve">  // 3. Calculer le restant à vivre réel</w:t>
+      </w:r>
+    </w:p>
+    <w:p>
+      <w:pPr>
+        <w:spacing w:after="120"/>
+      </w:pPr>
+      <w:r>
+        <w:t xml:space="preserve">  const restantAVivreReel = soldeComptesCourants - depensesAvenir - objectifsEpargneMois;</w:t>
+      </w:r>
+    </w:p>
+    <w:p>
+      <w:pPr>
+        <w:spacing w:after="120"/>
+      </w:pPr>
+    </w:p>
+    <w:p>
+      <w:pPr>
+        <w:spacing w:after="120"/>
+      </w:pPr>
+      <w:r>
+        <w:t xml:space="preserve">  // 4. Calculer le restant à vivre journalier (lissage)</w:t>
+      </w:r>
+    </w:p>
+    <w:p>
+      <w:pPr>
+        <w:spacing w:after="120"/>
+      </w:pPr>
+      <w:r>
+        <w:t xml:space="preserve">  const joursRestants = (dernierJourDuMois - jourActuel) || 1;</w:t>
+      </w:r>
+    </w:p>
+    <w:p>
+      <w:pPr>
+        <w:spacing w:after="120"/>
+      </w:pPr>
+      <w:r>
+        <w:t xml:space="preserve">  const budgetQuotidienConseille = Math.max(0, restantAVivreReel / joursRestants);</w:t>
+      </w:r>
+    </w:p>
+    <w:p>
+      <w:pPr>
+        <w:spacing w:after="120"/>
+      </w:pPr>
+    </w:p>
+    <w:p>
+      <w:pPr>
+        <w:spacing w:after="120"/>
+      </w:pPr>
+      <w:r>
+        <w:t xml:space="preserve">  return {</w:t>
+      </w:r>
+    </w:p>
+    <w:p>
+      <w:pPr>
+        <w:spacing w:after="120"/>
+      </w:pPr>
+      <w:r>
+        <w:t xml:space="preserve">    restantAVivreReel,</w:t>
+      </w:r>
+    </w:p>
+    <w:p>
+      <w:pPr>
+        <w:spacing w:after="120"/>
+      </w:pPr>
+      <w:r>
+        <w:lastRenderedPageBreak/>
+        <w:t xml:space="preserve">    depensesAvenir,</w:t>
+      </w:r>
+    </w:p>
+    <w:p>
+      <w:pPr>
+        <w:spacing w:after="120"/>
+      </w:pPr>
+      <w:r>
+        <w:t xml:space="preserve">    budgetQuotidienConseille,</w:t>
+      </w:r>
+    </w:p>
+    <w:p>
+      <w:pPr>
+        <w:spacing w:after="120"/>
+      </w:pPr>
+      <w:r>
+        <w:t xml:space="preserve">    joursRestants</w:t>
+      </w:r>
+    </w:p>
+    <w:p>
+      <w:pPr>
+        <w:spacing w:after="120"/>
+      </w:pPr>
+      <w:r>
+        <w:t xml:space="preserve">  };</w:t>
+      </w:r>
+    </w:p>
+    <w:p>
+      <w:pPr>
+        <w:spacing w:after="120"/>
+      </w:pPr>
+      <w:r>
+        <w:t>}</w:t>
+      </w:r>
+    </w:p>
+    <w:p>
+      <w:pPr>
+        <w:spacing w:after="120"/>
+        <w:rPr>
+          <w:b/>
+          <w:bCs/>
+        </w:rPr>
+      </w:pPr>
+      <w:r>
+        <w:rPr>
+          <w:b/>
+          <w:bCs/>
+        </w:rPr>
+        <w:t>Étape 3.2 : Intégration Visuelle (Widget UI)</w:t>
+      </w:r>
+    </w:p>
+    <w:p>
+      <w:pPr>
+        <w:spacing w:after="120"/>
+      </w:pPr>
+      <w:r>
+        <w:t xml:space="preserve">Affiche ce widget sous forme de carte interactive en haut de la page </w:t>
+      </w:r>
+      <w:r>
+        <w:rPr>
+          <w:b/>
+          <w:bCs/>
+        </w:rPr>
+        <w:t>Budget</w:t>
+      </w:r>
+      <w:r>
+        <w:t>.</w:t>
+      </w:r>
+    </w:p>
+    <w:p>
+      <w:pPr>
+        <w:spacing w:after="120"/>
+      </w:pPr>
+      <w:r>
+        <w:t>JavaScript</w:t>
+      </w:r>
+    </w:p>
+    <w:p>
+      <w:pPr>
+        <w:spacing w:after="120"/>
+      </w:pPr>
+      <w:r>
+        <w:t>// Dans ton composant Budget.jsx</w:t>
+      </w:r>
+    </w:p>
+    <w:p>
+      <w:pPr>
+        <w:spacing w:after="120"/>
+      </w:pPr>
+      <w:r>
+        <w:t>import { Sparkles, HelpCircle } from 'lucide-react';</w:t>
+      </w:r>
+    </w:p>
+    <w:p>
+      <w:pPr>
+        <w:spacing w:after="120"/>
+      </w:pPr>
+    </w:p>
+    <w:p>
+      <w:pPr>
+        <w:spacing w:after="120"/>
+      </w:pPr>
+      <w:r>
+        <w:t>export function WidgetRestantAVivre({ data }) {</w:t>
+      </w:r>
+    </w:p>
+    <w:p>
+      <w:pPr>
+        <w:spacing w:after="120"/>
+      </w:pPr>
+      <w:r>
+        <w:t xml:space="preserve">  const { restantAVivreReel, budgetQuotidienConseille, joursRestants, depensesAvenir } = data;</w:t>
+      </w:r>
+    </w:p>
+    <w:p>
+      <w:pPr>
+        <w:spacing w:after="120"/>
+      </w:pPr>
+    </w:p>
+    <w:p>
+      <w:pPr>
+        <w:spacing w:after="120"/>
+      </w:pPr>
+      <w:r>
+        <w:t xml:space="preserve">  return (</w:t>
+      </w:r>
+    </w:p>
+    <w:p>
+      <w:pPr>
+        <w:spacing w:after="120"/>
+      </w:pPr>
+      <w:r>
+        <w:t xml:space="preserve">    &lt;div className="bg-gradient-to-br from-slate-900 to-slate-800 text-white p-6 rounded-2xl shadow-xl border border-slate-700"&gt;</w:t>
+      </w:r>
+    </w:p>
+    <w:p>
+      <w:pPr>
+        <w:spacing w:after="120"/>
+      </w:pPr>
+      <w:r>
+        <w:t xml:space="preserve">      &lt;div className="flex justify-between items-center mb-4"&gt;</w:t>
+      </w:r>
+    </w:p>
+    <w:p>
+      <w:pPr>
+        <w:spacing w:after="120"/>
+      </w:pPr>
+      <w:r>
+        <w:t xml:space="preserve">        &lt;h3 className="text-sm font-semibold tracking-wide text-slate-400 uppercase flex items-center gap-2"&gt;</w:t>
+      </w:r>
+    </w:p>
+    <w:p>
+      <w:pPr>
+        <w:spacing w:after="120"/>
+      </w:pPr>
+      <w:r>
+        <w:t xml:space="preserve">          Restant à Vivre Réel &lt;Sparkles className="w-4 h-4 text-emerald-400" /&gt;</w:t>
+      </w:r>
+    </w:p>
+    <w:p>
+      <w:pPr>
+        <w:spacing w:after="120"/>
+      </w:pPr>
+      <w:r>
+        <w:t xml:space="preserve">        &lt;/h3&gt;</w:t>
+      </w:r>
+    </w:p>
+    <w:p>
+      <w:pPr>
+        <w:spacing w:after="120"/>
+      </w:pPr>
+      <w:r>
+        <w:t xml:space="preserve">        &lt;span className="bg-emerald-500/10 text-emerald-400 text-xs px-2.5 py-1 rounded-full font-medium"&gt;</w:t>
+      </w:r>
+    </w:p>
+    <w:p>
+      <w:pPr>
+        <w:spacing w:after="120"/>
+      </w:pPr>
+      <w:r>
+        <w:t xml:space="preserve">          {joursRestants} jours restants</w:t>
+      </w:r>
+    </w:p>
+    <w:p>
+      <w:pPr>
+        <w:spacing w:after="120"/>
+      </w:pPr>
+      <w:r>
+        <w:t xml:space="preserve">        &lt;/span&gt;</w:t>
+      </w:r>
+    </w:p>
+    <w:p>
+      <w:pPr>
+        <w:spacing w:after="120"/>
+      </w:pPr>
+      <w:r>
+        <w:t xml:space="preserve">      &lt;/div&gt;</w:t>
+      </w:r>
+    </w:p>
+    <w:p>
+      <w:pPr>
+        <w:spacing w:after="120"/>
+      </w:pPr>
+      <w:r>
+        <w:t xml:space="preserve">      &lt;div className="text-3xl font-bold tracking-tight mb-2"&gt;</w:t>
+      </w:r>
+    </w:p>
+    <w:p>
+      <w:pPr>
+        <w:spacing w:after="120"/>
+      </w:pPr>
+      <w:r>
+        <w:t xml:space="preserve">        {restantAVivreReel.toLocaleString('fr-FR')} €</w:t>
+      </w:r>
+    </w:p>
+    <w:p>
+      <w:pPr>
+        <w:spacing w:after="120"/>
+      </w:pPr>
+      <w:r>
+        <w:t xml:space="preserve">      &lt;/div&gt;</w:t>
+      </w:r>
+    </w:p>
+    <w:p>
+      <w:pPr>
+        <w:spacing w:after="120"/>
+      </w:pPr>
+      <w:r>
+        <w:t xml:space="preserve">      &lt;p className="text-slate-400 text-xs mb-4"&gt;</w:t>
+      </w:r>
+    </w:p>
+    <w:p>
+      <w:pPr>
+        <w:spacing w:after="120"/>
+      </w:pPr>
+      <w:r>
+        <w:t xml:space="preserve">        Solde actuel diminué de &lt;span className="text-red-400 font-semibold"&gt;{depensesAvenir} €&lt;/span&gt; de charges prévues d'ici la fin du mois.</w:t>
+      </w:r>
+    </w:p>
+    <w:p>
+      <w:pPr>
+        <w:spacing w:after="120"/>
+      </w:pPr>
+      <w:r>
+        <w:t xml:space="preserve">      &lt;/p&gt;</w:t>
+      </w:r>
+    </w:p>
+    <w:p>
+      <w:pPr>
+        <w:spacing w:after="120"/>
+      </w:pPr>
+      <w:r>
+        <w:t xml:space="preserve">      &lt;div className="border-t border-slate-700/50 pt-4 flex justify-between items-center"&gt;</w:t>
+      </w:r>
+    </w:p>
+    <w:p>
+      <w:pPr>
+        <w:spacing w:after="120"/>
+      </w:pPr>
+      <w:r>
+        <w:t xml:space="preserve">        &lt;div&gt;</w:t>
+      </w:r>
+    </w:p>
+    <w:p>
+      <w:pPr>
+        <w:spacing w:after="120"/>
+      </w:pPr>
+      <w:r>
+        <w:t xml:space="preserve">          &lt;span className="text-slate-400 text-xs block"&gt;Budget quotidien conseillé&lt;/span&gt;</w:t>
+      </w:r>
+    </w:p>
+    <w:p>
+      <w:pPr>
+        <w:spacing w:after="120"/>
+      </w:pPr>
+      <w:r>
+        <w:t xml:space="preserve">          &lt;span className="text-lg font-semibold text-emerald-400"&gt;</w:t>
+      </w:r>
+    </w:p>
+    <w:p>
+      <w:pPr>
+        <w:spacing w:after="120"/>
+      </w:pPr>
+      <w:r>
+        <w:t xml:space="preserve">            {budgetQuotidienConseille.toFixed(2)} € &lt;span className="text-xs text-slate-400"&gt;/ jour&lt;/span&gt;</w:t>
+      </w:r>
+    </w:p>
+    <w:p>
+      <w:pPr>
+        <w:spacing w:after="120"/>
+      </w:pPr>
+      <w:r>
+        <w:t xml:space="preserve">          &lt;/span&gt;</w:t>
+      </w:r>
+    </w:p>
+    <w:p>
+      <w:pPr>
+        <w:spacing w:after="120"/>
+      </w:pPr>
+      <w:r>
+        <w:t xml:space="preserve">        &lt;/div&gt;</w:t>
+      </w:r>
+    </w:p>
+    <w:p>
+      <w:pPr>
+        <w:spacing w:after="120"/>
+      </w:pPr>
+      <w:r>
+        <w:lastRenderedPageBreak/>
+        <w:t xml:space="preserve">      &lt;/div&gt;</w:t>
+      </w:r>
+    </w:p>
+    <w:p>
+      <w:pPr>
+        <w:spacing w:after="120"/>
+      </w:pPr>
+      <w:r>
+        <w:t xml:space="preserve">    &lt;/div&gt;</w:t>
+      </w:r>
+    </w:p>
+    <w:p>
+      <w:pPr>
+        <w:spacing w:after="120"/>
+      </w:pPr>
+      <w:r>
+        <w:t xml:space="preserve">  );</w:t>
+      </w:r>
+    </w:p>
+    <w:p>
+      <w:pPr>
+        <w:spacing w:after="120"/>
+      </w:pPr>
+      <w:r>
+        <w:t>}</w:t>
+      </w:r>
+    </w:p>
+    <w:p>
+      <w:pPr>
+        <w:spacing w:after="120"/>
+        <w:rPr>
+          <w:b/>
+          <w:bCs/>
+        </w:rPr>
+      </w:pPr>
+      <w:r>
+        <w:rPr>
+          <w:b/>
+          <w:bCs/>
+        </w:rPr>
+        <w:t>Phase 4 : Le "Nettoyeur d'Abonnements" &amp; "Chasse aux Frais"</w:t>
+      </w:r>
+    </w:p>
+    <w:p>
+      <w:pPr>
+        <w:spacing w:after="120"/>
+      </w:pPr>
+      <w:r>
+        <w:rPr>
+          <w:i/>
+          <w:iCs/>
+        </w:rPr>
+        <w:t>Objectif : Détecter et isoler automatiquement les abonnements et les frais bancaires abusifs.</w:t>
+      </w:r>
+    </w:p>
+    <w:p>
+      <w:pPr>
+        <w:spacing w:after="120"/>
+        <w:rPr>
+          <w:b/>
+          <w:bCs/>
+        </w:rPr>
+      </w:pPr>
+      <w:r>
+        <w:rPr>
+          <w:b/>
+          <w:bCs/>
+        </w:rPr>
+        <w:t>Étape 4.1 : Algorithme de Détection Locale</w:t>
+      </w:r>
+    </w:p>
+    <w:p>
+      <w:pPr>
+        <w:spacing w:after="120"/>
+      </w:pPr>
+      <w:r>
+        <w:t>À chaque nouvel import de transactions ou de manière périodique, lance cette routine locale en JS :</w:t>
+      </w:r>
+    </w:p>
+    <w:p>
+      <w:pPr>
+        <w:spacing w:after="120"/>
+      </w:pPr>
+      <w:r>
+        <w:t>JavaScript</w:t>
+      </w:r>
+    </w:p>
+    <w:p>
+      <w:pPr>
+        <w:spacing w:after="120"/>
+      </w:pPr>
+      <w:r>
+        <w:t>export function detecterAbonnementsEtFrais(transactions) {</w:t>
+      </w:r>
+    </w:p>
+    <w:p>
+      <w:pPr>
+        <w:spacing w:after="120"/>
+      </w:pPr>
+      <w:r>
+        <w:t xml:space="preserve">  const abonnementsDetectes = [];</w:t>
+      </w:r>
+    </w:p>
+    <w:p>
+      <w:pPr>
+        <w:spacing w:after="120"/>
+      </w:pPr>
+      <w:r>
+        <w:t xml:space="preserve">  const fraisBancairesDetectes = [];</w:t>
+      </w:r>
+    </w:p>
+    <w:p>
+      <w:pPr>
+        <w:spacing w:after="120"/>
+      </w:pPr>
+    </w:p>
+    <w:p>
+      <w:pPr>
+        <w:spacing w:after="120"/>
+      </w:pPr>
+      <w:r>
+        <w:t xml:space="preserve">  // Mots-clés de frais bancaires standardisés</w:t>
+      </w:r>
+    </w:p>
+    <w:p>
+      <w:pPr>
+        <w:spacing w:after="120"/>
+      </w:pPr>
+      <w:r>
+        <w:t xml:space="preserve">  const motsClesFrais = ["AGIOS", "FRAIS DE TENUE DE COMPTE", "COMMISSION D'INTERVENTION", "COTISATION CARTE", "FRAIS BANCAIRES"];</w:t>
+      </w:r>
+    </w:p>
+    <w:p>
+      <w:pPr>
+        <w:spacing w:after="120"/>
+      </w:pPr>
+    </w:p>
+    <w:p>
+      <w:pPr>
+        <w:spacing w:after="120"/>
+      </w:pPr>
+      <w:r>
+        <w:t xml:space="preserve">  transactions.forEach(t =&gt; {</w:t>
+      </w:r>
+    </w:p>
+    <w:p>
+      <w:pPr>
+        <w:spacing w:after="120"/>
+      </w:pPr>
+      <w:r>
+        <w:t xml:space="preserve">    const desc = t.libelle.toUpperCase();</w:t>
+      </w:r>
+    </w:p>
+    <w:p>
+      <w:pPr>
+        <w:spacing w:after="120"/>
+      </w:pPr>
+      <w:r>
+        <w:t xml:space="preserve">    const montant = Math.abs(parseFloat(t.montant));</w:t>
+      </w:r>
+    </w:p>
+    <w:p>
+      <w:pPr>
+        <w:spacing w:after="120"/>
+      </w:pPr>
+    </w:p>
+    <w:p>
+      <w:pPr>
+        <w:spacing w:after="120"/>
+      </w:pPr>
+      <w:r>
+        <w:t xml:space="preserve">    // 1. Détection des frais bancaires</w:t>
+      </w:r>
+    </w:p>
+    <w:p>
+      <w:pPr>
+        <w:spacing w:after="120"/>
+      </w:pPr>
+      <w:r>
+        <w:t xml:space="preserve">    const estUnFrais = motsClesFrais.some(mot =&gt; desc.includes(mot));</w:t>
+      </w:r>
+    </w:p>
+    <w:p>
+      <w:pPr>
+        <w:spacing w:after="120"/>
+      </w:pPr>
+      <w:r>
+        <w:t xml:space="preserve">    if (estUnFrais &amp;&amp; t.montant &lt; 0) {</w:t>
+      </w:r>
+    </w:p>
+    <w:p>
+      <w:pPr>
+        <w:spacing w:after="120"/>
+      </w:pPr>
+      <w:r>
+        <w:t xml:space="preserve">      fraisBancairesDetectes.push({</w:t>
+      </w:r>
+    </w:p>
+    <w:p>
+      <w:pPr>
+        <w:spacing w:after="120"/>
+      </w:pPr>
+      <w:r>
+        <w:t xml:space="preserve">        id: t.id,</w:t>
+      </w:r>
+    </w:p>
+    <w:p>
+      <w:pPr>
+        <w:spacing w:after="120"/>
+      </w:pPr>
+      <w:r>
+        <w:t xml:space="preserve">        date: t.date,</w:t>
+      </w:r>
+    </w:p>
+    <w:p>
+      <w:pPr>
+        <w:spacing w:after="120"/>
+      </w:pPr>
+      <w:r>
+        <w:t xml:space="preserve">        libelle: t.libelle,</w:t>
+      </w:r>
+    </w:p>
+    <w:p>
+      <w:pPr>
+        <w:spacing w:after="120"/>
+      </w:pPr>
+      <w:r>
+        <w:t xml:space="preserve">        montant: montant</w:t>
+      </w:r>
+    </w:p>
+    <w:p>
+      <w:pPr>
+        <w:spacing w:after="120"/>
+      </w:pPr>
+      <w:r>
+        <w:t xml:space="preserve">      });</w:t>
+      </w:r>
+    </w:p>
+    <w:p>
+      <w:pPr>
+        <w:spacing w:after="120"/>
+      </w:pPr>
+      <w:r>
+        <w:t xml:space="preserve">    }</w:t>
+      </w:r>
+    </w:p>
+    <w:p>
+      <w:pPr>
+        <w:spacing w:after="120"/>
+      </w:pPr>
+    </w:p>
+    <w:p>
+      <w:pPr>
+        <w:spacing w:after="120"/>
+      </w:pPr>
+      <w:r>
+        <w:t xml:space="preserve">    // 2. Détection d'abonnements potentiels (ex: mots-clés d'abonnements connus)</w:t>
+      </w:r>
+    </w:p>
+    <w:p>
+      <w:pPr>
+        <w:spacing w:after="120"/>
+      </w:pPr>
+      <w:r>
+        <w:t xml:space="preserve">    const motsClesAbonnements = ["NETFLIX", "SPOTIFY", "AMAZON PRIME", "DEEZER", "CANAL+", "DISNEYPLUS", "GYM", "BASIC FIT", "ICLOUD"];</w:t>
+      </w:r>
+    </w:p>
+    <w:p>
+      <w:pPr>
+        <w:spacing w:after="120"/>
+      </w:pPr>
+      <w:r>
+        <w:t xml:space="preserve">    const estUnAbonnement = motsClesAbonnements.some(mot =&gt; desc.includes(mot));</w:t>
+      </w:r>
+    </w:p>
+    <w:p>
+      <w:pPr>
+        <w:spacing w:after="120"/>
+      </w:pPr>
+      <w:r>
+        <w:t xml:space="preserve">    if (estUnAbonnement &amp;&amp; t.montant &lt; 0) {</w:t>
+      </w:r>
+    </w:p>
+    <w:p>
+      <w:pPr>
+        <w:spacing w:after="120"/>
+      </w:pPr>
+      <w:r>
+        <w:t xml:space="preserve">      abonnementsDetectes.push({</w:t>
+      </w:r>
+    </w:p>
+    <w:p>
+      <w:pPr>
+        <w:spacing w:after="120"/>
+      </w:pPr>
+      <w:r>
+        <w:t xml:space="preserve">        nom: t.libelle,</w:t>
+      </w:r>
+    </w:p>
+    <w:p>
+      <w:pPr>
+        <w:spacing w:after="120"/>
+      </w:pPr>
+      <w:r>
+        <w:lastRenderedPageBreak/>
+        <w:t xml:space="preserve">        montant: montant,</w:t>
+      </w:r>
+    </w:p>
+    <w:p>
+      <w:pPr>
+        <w:spacing w:after="120"/>
+      </w:pPr>
+      <w:r>
+        <w:t xml:space="preserve">        date: t.date</w:t>
+      </w:r>
+    </w:p>
+    <w:p>
+      <w:pPr>
+        <w:spacing w:after="120"/>
+      </w:pPr>
+      <w:r>
+        <w:t xml:space="preserve">      });</w:t>
+      </w:r>
+    </w:p>
+    <w:p>
+      <w:pPr>
+        <w:spacing w:after="120"/>
+      </w:pPr>
+      <w:r>
+        <w:t xml:space="preserve">    }</w:t>
+      </w:r>
+    </w:p>
+    <w:p>
+      <w:pPr>
+        <w:spacing w:after="120"/>
+      </w:pPr>
+      <w:r>
+        <w:t xml:space="preserve">  });</w:t>
+      </w:r>
+    </w:p>
+    <w:p>
+      <w:pPr>
+        <w:spacing w:after="120"/>
+      </w:pPr>
+    </w:p>
+    <w:p>
+      <w:pPr>
+        <w:spacing w:after="120"/>
+      </w:pPr>
+      <w:r>
+        <w:t xml:space="preserve">  return { abonnementsDetectes, fraisBancairesDetectes };</w:t>
+      </w:r>
+    </w:p>
+    <w:p>
+      <w:pPr>
+        <w:spacing w:after="120"/>
+      </w:pPr>
+      <w:r>
+        <w:t>}</w:t>
+      </w:r>
+    </w:p>
+    <w:p>
+      <w:pPr>
+        <w:spacing w:after="120"/>
+        <w:rPr>
+          <w:b/>
+          <w:bCs/>
+        </w:rPr>
+      </w:pPr>
+      <w:r>
+        <w:rPr>
+          <w:b/>
+          <w:bCs/>
+        </w:rPr>
+        <w:t>Étape 4.2 : Module UI "Nettoyeur d'Abonnements" (Subscription Card)</w:t>
+      </w:r>
+    </w:p>
+    <w:p>
+      <w:pPr>
+        <w:spacing w:after="120"/>
+      </w:pPr>
+      <w:r>
+        <w:t>Affiche un tableau interactif où l'utilisateur peut cocher ses abonnements pour planifier une alerte d'annulation (surtout s'il s'agit de périodes d'essai gratuites) :</w:t>
+      </w:r>
+    </w:p>
+    <w:p>
+      <w:pPr>
+        <w:spacing w:after="120"/>
+      </w:pPr>
+      <w:r>
+        <w:t>JavaScript</w:t>
+      </w:r>
+    </w:p>
+    <w:p>
+      <w:pPr>
+        <w:spacing w:after="120"/>
+      </w:pPr>
+      <w:r>
+        <w:t>export function SubscriptionCleaner({ abonnements }) {</w:t>
+      </w:r>
+    </w:p>
+    <w:p>
+      <w:pPr>
+        <w:spacing w:after="120"/>
+      </w:pPr>
+      <w:r>
+        <w:t xml:space="preserve">  const totalMensuel = abonnements.reduce((sum, ab) =&gt; sum + ab.montant, 0);</w:t>
+      </w:r>
+    </w:p>
+    <w:p>
+      <w:pPr>
+        <w:spacing w:after="120"/>
+      </w:pPr>
+      <w:r>
+        <w:t xml:space="preserve">  const economieAnnuelle = totalMensuel * 12;</w:t>
+      </w:r>
+    </w:p>
+    <w:p>
+      <w:pPr>
+        <w:spacing w:after="120"/>
+      </w:pPr>
+    </w:p>
+    <w:p>
+      <w:pPr>
+        <w:spacing w:after="120"/>
+      </w:pPr>
+      <w:r>
+        <w:t xml:space="preserve">  return (</w:t>
+      </w:r>
+    </w:p>
+    <w:p>
+      <w:pPr>
+        <w:spacing w:after="120"/>
+      </w:pPr>
+      <w:r>
+        <w:t xml:space="preserve">    &lt;div className="bg-white dark:bg-slate-900 border border-slate-200 dark:border-slate-800 p-6 rounded-2xl shadow-sm"&gt;</w:t>
+      </w:r>
+    </w:p>
+    <w:p>
+      <w:pPr>
+        <w:spacing w:after="120"/>
+      </w:pPr>
+      <w:r>
+        <w:t xml:space="preserve">      &lt;h3 className="text-lg font-bold text-slate-900 dark:text-white mb-2 flex items-center gap-2"&gt;</w:t>
+      </w:r>
+    </w:p>
+    <w:p>
+      <w:pPr>
+        <w:spacing w:after="120"/>
+      </w:pPr>
+      <w:r>
+        <w:t xml:space="preserve">        </w:t>
+      </w:r>
+      <w:r>
+        <w:rPr>
+          <w:rFonts w:ascii="Segoe UI Symbol" w:hAnsi="Segoe UI Symbol" w:cs="Segoe UI Symbol"/>
+        </w:rPr>
+        <w:t>🛡</w:t>
+      </w:r>
+      <w:r>
+        <w:t>️ Nettoyeur d'Abonnements</w:t>
+      </w:r>
+    </w:p>
+    <w:p>
+      <w:pPr>
+        <w:spacing w:after="120"/>
+      </w:pPr>
+      <w:r>
+        <w:t xml:space="preserve">      &lt;/h3&gt;</w:t>
+      </w:r>
+    </w:p>
+    <w:p>
+      <w:pPr>
+        <w:spacing w:after="120"/>
+      </w:pPr>
+      <w:r>
+        <w:t xml:space="preserve">      &lt;p className="text-sm text-slate-500 mb-4"&gt;</w:t>
+      </w:r>
+    </w:p>
+    <w:p>
+      <w:pPr>
+        <w:spacing w:after="120"/>
+      </w:pPr>
+      <w:r>
+        <w:t xml:space="preserve">        Vous dépensez &lt;span className="font-bold text-red-500"&gt;{totalMensuel} €&lt;/span&gt;/mois dans des services récurrents.</w:t>
+      </w:r>
+    </w:p>
+    <w:p>
+      <w:pPr>
+        <w:spacing w:after="120"/>
+      </w:pPr>
+      <w:r>
+        <w:t xml:space="preserve">      &lt;/p&gt;</w:t>
+      </w:r>
+    </w:p>
+    <w:p>
+      <w:pPr>
+        <w:spacing w:after="120"/>
+      </w:pPr>
+    </w:p>
+    <w:p>
+      <w:pPr>
+        <w:spacing w:after="120"/>
+      </w:pPr>
+      <w:r>
+        <w:t xml:space="preserve">      {economieAnnuelle &gt; 100 &amp;&amp; (</w:t>
+      </w:r>
+    </w:p>
+    <w:p>
+      <w:pPr>
+        <w:spacing w:after="120"/>
+      </w:pPr>
+      <w:r>
+        <w:t xml:space="preserve">        &lt;div className="bg-emerald-500/10 border border-emerald-500/20 text-emerald-700 dark:text-emerald-400 p-3.5 rounded-xl text-xs mb-4"&gt;</w:t>
+      </w:r>
+    </w:p>
+    <w:p>
+      <w:pPr>
+        <w:spacing w:after="120"/>
+      </w:pPr>
+      <w:r>
+        <w:t xml:space="preserve">          </w:t>
+      </w:r>
+      <w:r>
+        <w:rPr>
+          <w:rFonts w:ascii="Segoe UI Emoji" w:hAnsi="Segoe UI Emoji" w:cs="Segoe UI Emoji"/>
+        </w:rPr>
+        <w:t>💡</w:t>
+      </w:r>
+      <w:r>
+        <w:t xml:space="preserve"> En moyenne, nos utilisateurs économisent &lt;strong&gt;350 €/an&lt;/strong&gt; en résiliant leurs abonnements inutilisés.</w:t>
+      </w:r>
+    </w:p>
+    <w:p>
+      <w:pPr>
+        <w:spacing w:after="120"/>
+      </w:pPr>
+      <w:r>
+        <w:t xml:space="preserve">        &lt;/div&gt;</w:t>
+      </w:r>
+    </w:p>
+    <w:p>
+      <w:pPr>
+        <w:spacing w:after="120"/>
+      </w:pPr>
+      <w:r>
+        <w:t xml:space="preserve">      )}</w:t>
+      </w:r>
+    </w:p>
+    <w:p>
+      <w:pPr>
+        <w:spacing w:after="120"/>
+      </w:pPr>
+    </w:p>
+    <w:p>
+      <w:pPr>
+        <w:spacing w:after="120"/>
+      </w:pPr>
+      <w:r>
+        <w:t xml:space="preserve">      {/* Liste des abonnements avec un bouton de rappel local */}</w:t>
+      </w:r>
+    </w:p>
+    <w:p>
+      <w:pPr>
+        <w:spacing w:after="120"/>
+      </w:pPr>
+      <w:r>
+        <w:t xml:space="preserve">      &lt;div className="space-y-3"&gt;</w:t>
+      </w:r>
+    </w:p>
+    <w:p>
+      <w:pPr>
+        <w:spacing w:after="120"/>
+      </w:pPr>
+      <w:r>
+        <w:t xml:space="preserve">        {abonnements.map((ab, idx) =&gt; (</w:t>
+      </w:r>
+    </w:p>
+    <w:p>
+      <w:pPr>
+        <w:spacing w:after="120"/>
+      </w:pPr>
+      <w:r>
+        <w:t xml:space="preserve">          &lt;div key={idx} className="flex justify-between items-center p-3 bg-slate-50 dark:bg-slate-800/50 rounded-xl"&gt;</w:t>
+      </w:r>
+    </w:p>
+    <w:p>
+      <w:pPr>
+        <w:spacing w:after="120"/>
+      </w:pPr>
+      <w:r>
+        <w:lastRenderedPageBreak/>
+        <w:t xml:space="preserve">            &lt;div&gt;</w:t>
+      </w:r>
+    </w:p>
+    <w:p>
+      <w:pPr>
+        <w:spacing w:after="120"/>
+      </w:pPr>
+      <w:r>
+        <w:t xml:space="preserve">              &lt;span className="font-semibold text-sm text-slate-800 dark:text-white"&gt;{ab.nom}&lt;/span&gt;</w:t>
+      </w:r>
+    </w:p>
+    <w:p>
+      <w:pPr>
+        <w:spacing w:after="120"/>
+      </w:pPr>
+      <w:r>
+        <w:t xml:space="preserve">              &lt;span className="text-slate-400 text-xs block"&gt;Dernier paiement : {ab.date}&lt;/span&gt;</w:t>
+      </w:r>
+    </w:p>
+    <w:p>
+      <w:pPr>
+        <w:spacing w:after="120"/>
+      </w:pPr>
+      <w:r>
+        <w:t xml:space="preserve">            &lt;/div&gt;</w:t>
+      </w:r>
+    </w:p>
+    <w:p>
+      <w:pPr>
+        <w:spacing w:after="120"/>
+      </w:pPr>
+      <w:r>
+        <w:t xml:space="preserve">            &lt;div className="text-right"&gt;</w:t>
+      </w:r>
+    </w:p>
+    <w:p>
+      <w:pPr>
+        <w:spacing w:after="120"/>
+      </w:pPr>
+      <w:r>
+        <w:t xml:space="preserve">              &lt;span className="font-bold text-red-500 text-sm"&gt;-{ab.montant} €&lt;/span&gt;</w:t>
+      </w:r>
+    </w:p>
+    <w:p>
+      <w:pPr>
+        <w:spacing w:after="120"/>
+      </w:pPr>
+      <w:r>
+        <w:t xml:space="preserve">              &lt;button </w:t>
+      </w:r>
+    </w:p>
+    <w:p>
+      <w:pPr>
+        <w:spacing w:after="120"/>
+      </w:pPr>
+      <w:r>
+        <w:t xml:space="preserve">                onClick={() =&gt; alert(`Rappel configuré pour : ${ab.nom} (3 jours avant le prochain prélèvement)`)}</w:t>
+      </w:r>
+    </w:p>
+    <w:p>
+      <w:pPr>
+        <w:spacing w:after="120"/>
+      </w:pPr>
+      <w:r>
+        <w:t xml:space="preserve">                className="text-xs text-emerald-600 block hover:underline"</w:t>
+      </w:r>
+    </w:p>
+    <w:p>
+      <w:pPr>
+        <w:spacing w:after="120"/>
+      </w:pPr>
+      <w:r>
+        <w:t xml:space="preserve">              &gt;</w:t>
+      </w:r>
+    </w:p>
+    <w:p>
+      <w:pPr>
+        <w:spacing w:after="120"/>
+      </w:pPr>
+      <w:r>
+        <w:t xml:space="preserve">                </w:t>
+      </w:r>
+      <w:r>
+        <w:rPr>
+          <w:rFonts w:ascii="Segoe UI Emoji" w:hAnsi="Segoe UI Emoji" w:cs="Segoe UI Emoji"/>
+        </w:rPr>
+        <w:t>🔔</w:t>
+      </w:r>
+      <w:r>
+        <w:t xml:space="preserve"> Alerte d'essai</w:t>
+      </w:r>
+    </w:p>
+    <w:p>
+      <w:pPr>
+        <w:spacing w:after="120"/>
+      </w:pPr>
+      <w:r>
+        <w:t xml:space="preserve">              &lt;/button&gt;</w:t>
+      </w:r>
+    </w:p>
+    <w:p>
+      <w:pPr>
+        <w:spacing w:after="120"/>
+      </w:pPr>
+      <w:r>
+        <w:t xml:space="preserve">            &lt;/div&gt;</w:t>
+      </w:r>
+    </w:p>
+    <w:p>
+      <w:pPr>
+        <w:spacing w:after="120"/>
+      </w:pPr>
+      <w:r>
+        <w:t xml:space="preserve">          &lt;/div&gt;</w:t>
+      </w:r>
+    </w:p>
+    <w:p>
+      <w:pPr>
+        <w:spacing w:after="120"/>
+      </w:pPr>
+      <w:r>
+        <w:t xml:space="preserve">        ))}</w:t>
+      </w:r>
+    </w:p>
+    <w:p>
+      <w:pPr>
+        <w:spacing w:after="120"/>
+      </w:pPr>
+      <w:r>
+        <w:t xml:space="preserve">      &lt;/div&gt;</w:t>
+      </w:r>
+    </w:p>
+    <w:p>
+      <w:pPr>
+        <w:spacing w:after="120"/>
+      </w:pPr>
+      <w:r>
+        <w:t xml:space="preserve">    &lt;/div&gt;</w:t>
+      </w:r>
+    </w:p>
+    <w:p>
+      <w:pPr>
+        <w:spacing w:after="120"/>
+      </w:pPr>
+      <w:r>
+        <w:t xml:space="preserve">  );</w:t>
+      </w:r>
+    </w:p>
+    <w:p>
+      <w:pPr>
+        <w:spacing w:after="120"/>
+      </w:pPr>
+      <w:r>
+        <w:t>}</w:t>
+      </w:r>
+    </w:p>
+    <w:p>
+      <w:pPr>
+        <w:spacing w:after="120"/>
+        <w:rPr>
+          <w:b/>
+          <w:bCs/>
+        </w:rPr>
+      </w:pPr>
+      <w:r>
+        <w:rPr>
+          <w:b/>
+          <w:bCs/>
+        </w:rPr>
+        <w:t>Phase 5 : Le Simulateur d'Impact "What-If" (Couplage Prévisions)</w:t>
+      </w:r>
+    </w:p>
+    <w:p>
+      <w:pPr>
+        <w:spacing w:after="120"/>
+      </w:pPr>
+      <w:r>
+        <w:rPr>
+          <w:i/>
+          <w:iCs/>
+        </w:rPr>
+        <w:t>Objectif : Créer un pont addictif entre les sacrifices d'aujourd'hui et la richesse de demain.</w:t>
+      </w:r>
+    </w:p>
+    <w:p>
+      <w:pPr>
+        <w:spacing w:after="120"/>
+        <w:rPr>
+          <w:b/>
+          <w:bCs/>
+        </w:rPr>
+      </w:pPr>
+      <w:r>
+        <w:rPr>
+          <w:b/>
+          <w:bCs/>
+        </w:rPr>
+        <w:t>Étape 5.1 : Algorithme d'Intérêts Composés en JS</w:t>
+      </w:r>
+    </w:p>
+    <w:p>
+      <w:pPr>
+        <w:spacing w:after="120"/>
+      </w:pPr>
+      <w:r>
+        <w:t>Ce script calcule l'équivalence d'une économie mensuelle placée en bourse sur plusieurs horizons de temps :</w:t>
+      </w:r>
+    </w:p>
+    <w:p>
+      <w:pPr>
+        <w:spacing w:after="120"/>
+      </w:pPr>
+      <w:r>
+        <w:t>JavaScript</w:t>
+      </w:r>
+    </w:p>
+    <w:p>
+      <w:pPr>
+        <w:spacing w:after="120"/>
+      </w:pPr>
+      <w:r>
+        <w:t>export function calculerImpactWhatIf(economieMensuelle, tauxRendementAnnuel = 0.07, inflation = 0.02) {</w:t>
+      </w:r>
+    </w:p>
+    <w:p>
+      <w:pPr>
+        <w:spacing w:after="120"/>
+      </w:pPr>
+      <w:r>
+        <w:t xml:space="preserve">  const horizons = [5, 10, 20, 30];</w:t>
+      </w:r>
+    </w:p>
+    <w:p>
+      <w:pPr>
+        <w:spacing w:after="120"/>
+      </w:pPr>
+      <w:r>
+        <w:t xml:space="preserve">  const resultats = {};</w:t>
+      </w:r>
+    </w:p>
+    <w:p>
+      <w:pPr>
+        <w:spacing w:after="120"/>
+      </w:pPr>
+    </w:p>
+    <w:p>
+      <w:pPr>
+        <w:spacing w:after="120"/>
+      </w:pPr>
+      <w:r>
+        <w:t xml:space="preserve">  const tauxReel = tauxRendementAnnuel - inflation; // Rendement net d'inflation</w:t>
+      </w:r>
+    </w:p>
+    <w:p>
+      <w:pPr>
+        <w:spacing w:after="120"/>
+      </w:pPr>
+    </w:p>
+    <w:p>
+      <w:pPr>
+        <w:spacing w:after="120"/>
+      </w:pPr>
+      <w:r>
+        <w:t xml:space="preserve">  horizons.forEach(ans =&gt; {</w:t>
+      </w:r>
+    </w:p>
+    <w:p>
+      <w:pPr>
+        <w:spacing w:after="120"/>
+      </w:pPr>
+      <w:r>
+        <w:t xml:space="preserve">    const mois = ans * 12;</w:t>
+      </w:r>
+    </w:p>
+    <w:p>
+      <w:pPr>
+        <w:spacing w:after="120"/>
+      </w:pPr>
+      <w:r>
+        <w:t xml:space="preserve">    // Formule classique des intérêts composés pour versements mensuels (Finary-style)</w:t>
+      </w:r>
+    </w:p>
+    <w:p>
+      <w:pPr>
+        <w:spacing w:after="120"/>
+      </w:pPr>
+      <w:r>
+        <w:t xml:space="preserve">    const capitalCumule = economieMensuelle * ((Math.pow(1 + tauxReel / 12, mois) - 1) / (tauxReel / 12));</w:t>
+      </w:r>
+    </w:p>
+    <w:p>
+      <w:pPr>
+        <w:spacing w:after="120"/>
+      </w:pPr>
+      <w:r>
+        <w:t xml:space="preserve">    resultats[`ans_${ans}`] = Math.round(capitalCumule);</w:t>
+      </w:r>
+    </w:p>
+    <w:p>
+      <w:pPr>
+        <w:spacing w:after="120"/>
+      </w:pPr>
+      <w:r>
+        <w:t xml:space="preserve">  });</w:t>
+      </w:r>
+    </w:p>
+    <w:p>
+      <w:pPr>
+        <w:spacing w:after="120"/>
+      </w:pPr>
+    </w:p>
+    <w:p>
+      <w:pPr>
+        <w:spacing w:after="120"/>
+      </w:pPr>
+      <w:r>
+        <w:t xml:space="preserve">  return resultats;</w:t>
+      </w:r>
+    </w:p>
+    <w:p>
+      <w:pPr>
+        <w:spacing w:after="120"/>
+      </w:pPr>
+      <w:r>
+        <w:lastRenderedPageBreak/>
+        <w:t>}</w:t>
+      </w:r>
+    </w:p>
+    <w:p>
+      <w:pPr>
+        <w:spacing w:after="120"/>
+        <w:rPr>
+          <w:b/>
+          <w:bCs/>
+        </w:rPr>
+      </w:pPr>
+      <w:r>
+        <w:rPr>
+          <w:b/>
+          <w:bCs/>
+        </w:rPr>
+        <w:t>Étape 5.2 : Interface UI Interactive (What-If Card)</w:t>
+      </w:r>
+    </w:p>
+    <w:p>
+      <w:pPr>
+        <w:spacing w:after="120"/>
+      </w:pPr>
+      <w:r>
+        <w:t>Un widget avec un curseur (Slider) de réduction budgétaire pour simuler l'impact instantanément.</w:t>
+      </w:r>
+    </w:p>
+    <w:p>
+      <w:pPr>
+        <w:spacing w:after="120"/>
+      </w:pPr>
+      <w:r>
+        <w:t>JavaScript</w:t>
+      </w:r>
+    </w:p>
+    <w:p>
+      <w:pPr>
+        <w:spacing w:after="120"/>
+      </w:pPr>
+      <w:r>
+        <w:t>import React, { useState, useEffect } from 'react';</w:t>
+      </w:r>
+    </w:p>
+    <w:p>
+      <w:pPr>
+        <w:spacing w:after="120"/>
+      </w:pPr>
+      <w:r>
+        <w:t>import { calculerImpactWhatIf } from '../utils/budgetCalculator';</w:t>
+      </w:r>
+    </w:p>
+    <w:p>
+      <w:pPr>
+        <w:spacing w:after="120"/>
+      </w:pPr>
+    </w:p>
+    <w:p>
+      <w:pPr>
+        <w:spacing w:after="120"/>
+      </w:pPr>
+      <w:r>
+        <w:t>export function WidgetWhatIf() {</w:t>
+      </w:r>
+    </w:p>
+    <w:p>
+      <w:pPr>
+        <w:spacing w:after="120"/>
+      </w:pPr>
+      <w:r>
+        <w:t xml:space="preserve">  const [economie, setEconomie] = useState(50);</w:t>
+      </w:r>
+    </w:p>
+    <w:p>
+      <w:pPr>
+        <w:spacing w:after="120"/>
+      </w:pPr>
+      <w:r>
+        <w:t xml:space="preserve">  const [taux, setTaux] = useState(7); // Rendement moyen estimé (PEA/ETF)</w:t>
+      </w:r>
+    </w:p>
+    <w:p>
+      <w:pPr>
+        <w:spacing w:after="120"/>
+      </w:pPr>
+      <w:r>
+        <w:t xml:space="preserve">  const [impacts, setImpacts] = useState({});</w:t>
+      </w:r>
+    </w:p>
+    <w:p>
+      <w:pPr>
+        <w:spacing w:after="120"/>
+      </w:pPr>
+    </w:p>
+    <w:p>
+      <w:pPr>
+        <w:spacing w:after="120"/>
+      </w:pPr>
+      <w:r>
+        <w:t xml:space="preserve">  useEffect(() =&gt; {</w:t>
+      </w:r>
+    </w:p>
+    <w:p>
+      <w:pPr>
+        <w:spacing w:after="120"/>
+      </w:pPr>
+      <w:r>
+        <w:t xml:space="preserve">    const res = calculerImpactWhatIf(economie, taux / 100);</w:t>
+      </w:r>
+    </w:p>
+    <w:p>
+      <w:pPr>
+        <w:spacing w:after="120"/>
+      </w:pPr>
+      <w:r>
+        <w:t xml:space="preserve">    setImpacts(res);</w:t>
+      </w:r>
+    </w:p>
+    <w:p>
+      <w:pPr>
+        <w:spacing w:after="120"/>
+      </w:pPr>
+      <w:r>
+        <w:t xml:space="preserve">  }, [economie, taux]);</w:t>
+      </w:r>
+    </w:p>
+    <w:p>
+      <w:pPr>
+        <w:spacing w:after="120"/>
+      </w:pPr>
+    </w:p>
+    <w:p>
+      <w:pPr>
+        <w:spacing w:after="120"/>
+      </w:pPr>
+      <w:r>
+        <w:t xml:space="preserve">  return (</w:t>
+      </w:r>
+    </w:p>
+    <w:p>
+      <w:pPr>
+        <w:spacing w:after="120"/>
+      </w:pPr>
+      <w:r>
+        <w:t xml:space="preserve">    &lt;div className="bg-gradient-to-tr from-[#0a192f] to-[#172a45] text-white p-6 rounded-2xl shadow-xl"&gt;</w:t>
+      </w:r>
+    </w:p>
+    <w:p>
+      <w:pPr>
+        <w:spacing w:after="120"/>
+      </w:pPr>
+      <w:r>
+        <w:t xml:space="preserve">      &lt;h3 className="text-base font-bold text-emerald-400 mb-2 flex items-center gap-2"&gt;</w:t>
+      </w:r>
+    </w:p>
+    <w:p>
+      <w:pPr>
+        <w:spacing w:after="120"/>
+      </w:pPr>
+      <w:r>
+        <w:t xml:space="preserve">        </w:t>
+      </w:r>
+      <w:r>
+        <w:rPr>
+          <w:rFonts w:ascii="Segoe UI Emoji" w:hAnsi="Segoe UI Emoji" w:cs="Segoe UI Emoji"/>
+        </w:rPr>
+        <w:t>🔮</w:t>
+      </w:r>
+      <w:r>
+        <w:t xml:space="preserve"> Simulateur d'Impact "Et Si ?"</w:t>
+      </w:r>
+    </w:p>
+    <w:p>
+      <w:pPr>
+        <w:spacing w:after="120"/>
+      </w:pPr>
+      <w:r>
+        <w:t xml:space="preserve">      &lt;/h3&gt;</w:t>
+      </w:r>
+    </w:p>
+    <w:p>
+      <w:pPr>
+        <w:spacing w:after="120"/>
+      </w:pPr>
+      <w:r>
+        <w:t xml:space="preserve">      &lt;p className="text-xs text-slate-400 mb-6"&gt;</w:t>
+      </w:r>
+    </w:p>
+    <w:p>
+      <w:pPr>
+        <w:spacing w:after="120"/>
+      </w:pPr>
+      <w:r>
+        <w:t xml:space="preserve">        Et si vous réduisiez vos dépenses superflues pour les investir ?</w:t>
+      </w:r>
+    </w:p>
+    <w:p>
+      <w:pPr>
+        <w:spacing w:after="120"/>
+      </w:pPr>
+      <w:r>
+        <w:t xml:space="preserve">      &lt;/p&gt;</w:t>
+      </w:r>
+    </w:p>
+    <w:p>
+      <w:pPr>
+        <w:spacing w:after="120"/>
+      </w:pPr>
+    </w:p>
+    <w:p>
+      <w:pPr>
+        <w:spacing w:after="120"/>
+      </w:pPr>
+      <w:r>
+        <w:t xml:space="preserve">      {/* Slider Économies */}</w:t>
+      </w:r>
+    </w:p>
+    <w:p>
+      <w:pPr>
+        <w:spacing w:after="120"/>
+      </w:pPr>
+      <w:r>
+        <w:t xml:space="preserve">      &lt;div className="space-y-4 mb-6"&gt;</w:t>
+      </w:r>
+    </w:p>
+    <w:p>
+      <w:pPr>
+        <w:spacing w:after="120"/>
+      </w:pPr>
+      <w:r>
+        <w:t xml:space="preserve">        &lt;div&gt;</w:t>
+      </w:r>
+    </w:p>
+    <w:p>
+      <w:pPr>
+        <w:spacing w:after="120"/>
+      </w:pPr>
+      <w:r>
+        <w:t xml:space="preserve">          &lt;div className="flex justify-between text-xs mb-1"&gt;</w:t>
+      </w:r>
+    </w:p>
+    <w:p>
+      <w:pPr>
+        <w:spacing w:after="120"/>
+      </w:pPr>
+      <w:r>
+        <w:t xml:space="preserve">            &lt;span className="text-slate-400"&gt;Économie mensuelle&lt;/span&gt;</w:t>
+      </w:r>
+    </w:p>
+    <w:p>
+      <w:pPr>
+        <w:spacing w:after="120"/>
+      </w:pPr>
+      <w:r>
+        <w:t xml:space="preserve">            &lt;span className="font-bold text-emerald-400"&gt;{economie} €/mois&lt;/span&gt;</w:t>
+      </w:r>
+    </w:p>
+    <w:p>
+      <w:pPr>
+        <w:spacing w:after="120"/>
+      </w:pPr>
+      <w:r>
+        <w:t xml:space="preserve">          &lt;/div&gt;</w:t>
+      </w:r>
+    </w:p>
+    <w:p>
+      <w:pPr>
+        <w:spacing w:after="120"/>
+      </w:pPr>
+      <w:r>
+        <w:t xml:space="preserve">          &lt;input </w:t>
+      </w:r>
+    </w:p>
+    <w:p>
+      <w:pPr>
+        <w:spacing w:after="120"/>
+      </w:pPr>
+      <w:r>
+        <w:t xml:space="preserve">            type="range" min="10" max="500" step="10"</w:t>
+      </w:r>
+    </w:p>
+    <w:p>
+      <w:pPr>
+        <w:spacing w:after="120"/>
+      </w:pPr>
+      <w:r>
+        <w:t xml:space="preserve">            value={economie} onChange={(e) =&gt; setEconomie(Number(e.target.value))}</w:t>
+      </w:r>
+    </w:p>
+    <w:p>
+      <w:pPr>
+        <w:spacing w:after="120"/>
+      </w:pPr>
+      <w:r>
+        <w:t xml:space="preserve">            className="w-full h-1.5 bg-slate-700 rounded-lg appearance-none cursor-pointer accent-emerald-400"</w:t>
+      </w:r>
+    </w:p>
+    <w:p>
+      <w:pPr>
+        <w:spacing w:after="120"/>
+      </w:pPr>
+      <w:r>
+        <w:t xml:space="preserve">          /&gt;</w:t>
+      </w:r>
+    </w:p>
+    <w:p>
+      <w:pPr>
+        <w:spacing w:after="120"/>
+      </w:pPr>
+      <w:r>
+        <w:lastRenderedPageBreak/>
+        <w:t xml:space="preserve">        &lt;/div&gt;</w:t>
+      </w:r>
+    </w:p>
+    <w:p>
+      <w:pPr>
+        <w:spacing w:after="120"/>
+      </w:pPr>
+      <w:r>
+        <w:t xml:space="preserve">      &lt;/div&gt;</w:t>
+      </w:r>
+    </w:p>
+    <w:p>
+      <w:pPr>
+        <w:spacing w:after="120"/>
+      </w:pPr>
+    </w:p>
+    <w:p>
+      <w:pPr>
+        <w:spacing w:after="120"/>
+      </w:pPr>
+      <w:r>
+        <w:t xml:space="preserve">      {/* Affichage de la projection */}</w:t>
+      </w:r>
+    </w:p>
+    <w:p>
+      <w:pPr>
+        <w:spacing w:after="120"/>
+      </w:pPr>
+      <w:r>
+        <w:t xml:space="preserve">      &lt;div className="grid grid-cols-2 gap-3 text-center"&gt;</w:t>
+      </w:r>
+    </w:p>
+    <w:p>
+      <w:pPr>
+        <w:spacing w:after="120"/>
+      </w:pPr>
+      <w:r>
+        <w:t xml:space="preserve">        &lt;div className="bg-slate-800/40 p-3 rounded-xl"&gt;</w:t>
+      </w:r>
+    </w:p>
+    <w:p>
+      <w:pPr>
+        <w:spacing w:after="120"/>
+      </w:pPr>
+      <w:r>
+        <w:t xml:space="preserve">          &lt;span className="text-[10px] text-slate-400 uppercase block"&gt;Dans 10 ans&lt;/span&gt;</w:t>
+      </w:r>
+    </w:p>
+    <w:p>
+      <w:pPr>
+        <w:spacing w:after="120"/>
+      </w:pPr>
+      <w:r>
+        <w:t xml:space="preserve">          &lt;span className="text-lg font-bold text-white"&gt;+{impacts.ans_10?.toLocaleString('fr-FR')} €&lt;/span&gt;</w:t>
+      </w:r>
+    </w:p>
+    <w:p>
+      <w:pPr>
+        <w:spacing w:after="120"/>
+      </w:pPr>
+      <w:r>
+        <w:t xml:space="preserve">        &lt;/div&gt;</w:t>
+      </w:r>
+    </w:p>
+    <w:p>
+      <w:pPr>
+        <w:spacing w:after="120"/>
+      </w:pPr>
+      <w:r>
+        <w:t xml:space="preserve">        &lt;div className="bg-slate-800/40 p-3 rounded-xl"&gt;</w:t>
+      </w:r>
+    </w:p>
+    <w:p>
+      <w:pPr>
+        <w:spacing w:after="120"/>
+      </w:pPr>
+      <w:r>
+        <w:t xml:space="preserve">          &lt;span className="text-[10px] text-slate-400 uppercase block"&gt;Dans 20 ans&lt;/span&gt;</w:t>
+      </w:r>
+    </w:p>
+    <w:p>
+      <w:pPr>
+        <w:spacing w:after="120"/>
+      </w:pPr>
+      <w:r>
+        <w:t xml:space="preserve">          &lt;span className="text-lg font-bold text-emerald-400"&gt;+{impacts.ans_20?.toLocaleString('fr-FR')} €&lt;/span&gt;</w:t>
+      </w:r>
+    </w:p>
+    <w:p>
+      <w:pPr>
+        <w:spacing w:after="120"/>
+      </w:pPr>
+      <w:r>
+        <w:t xml:space="preserve">        &lt;/div&gt;</w:t>
+      </w:r>
+    </w:p>
+    <w:p>
+      <w:pPr>
+        <w:spacing w:after="120"/>
+      </w:pPr>
+      <w:r>
+        <w:t xml:space="preserve">        &lt;div className="col-span-2 bg-emerald-500/10 border border-emerald-500/20 p-3 rounded-xl"&gt;</w:t>
+      </w:r>
+    </w:p>
+    <w:p>
+      <w:pPr>
+        <w:spacing w:after="120"/>
+      </w:pPr>
+      <w:r>
+        <w:t xml:space="preserve">          &lt;span className="text-[10px] text-emerald-400 uppercase block font-semibold"&gt;Projections retraite (30 ans)&lt;/span&gt;</w:t>
+      </w:r>
+    </w:p>
+    <w:p>
+      <w:pPr>
+        <w:spacing w:after="120"/>
+      </w:pPr>
+      <w:r>
+        <w:t xml:space="preserve">          &lt;span className="text-2xl font-black text-emerald-400"&gt;+{impacts.ans_30?.toLocaleString('fr-FR')} €&lt;/span&gt;</w:t>
+      </w:r>
+    </w:p>
+    <w:p>
+      <w:pPr>
+        <w:spacing w:after="120"/>
+      </w:pPr>
+      <w:r>
+        <w:t xml:space="preserve">        &lt;/div&gt;</w:t>
+      </w:r>
+    </w:p>
+    <w:p>
+      <w:pPr>
+        <w:spacing w:after="120"/>
+      </w:pPr>
+      <w:r>
+        <w:t xml:space="preserve">      &lt;/div&gt;</w:t>
+      </w:r>
+    </w:p>
+    <w:p>
+      <w:pPr>
+        <w:spacing w:after="120"/>
+      </w:pPr>
+      <w:r>
+        <w:t xml:space="preserve">    &lt;/div&gt;</w:t>
+      </w:r>
+    </w:p>
+    <w:p>
+      <w:pPr>
+        <w:spacing w:after="120"/>
+      </w:pPr>
+      <w:r>
+        <w:t xml:space="preserve">  );</w:t>
+      </w:r>
+    </w:p>
+    <w:p>
+      <w:pPr>
+        <w:spacing w:after="120"/>
+      </w:pPr>
+      <w:r>
+        <w:t>}</w:t>
+      </w:r>
+    </w:p>
+    <w:p>
+      <w:pPr>
+        <w:spacing w:after="120"/>
+        <w:rPr>
+          <w:b/>
+          <w:bCs/>
+        </w:rPr>
+      </w:pPr>
+      <w:r>
+        <w:rPr>
+          <w:b/>
+          <w:bCs/>
+        </w:rPr>
+        <w:t>Phase 6 : Le Diagramme de Sankey Interactif (Glisser-Déposer &amp; Filtres)</w:t>
+      </w:r>
+    </w:p>
+    <w:p>
+      <w:pPr>
+        <w:spacing w:after="120"/>
+      </w:pPr>
+      <w:r>
+        <w:rPr>
+          <w:i/>
+          <w:iCs/>
+        </w:rPr>
+        <w:t>Objectif : Rendre la visualisation des flux d'argent amusante et dynamique.</w:t>
+      </w:r>
+    </w:p>
+    <w:p>
+      <w:pPr>
+        <w:spacing w:after="120"/>
+        <w:rPr>
+          <w:b/>
+          <w:bCs/>
+        </w:rPr>
+      </w:pPr>
+      <w:r>
+        <w:rPr>
+          <w:b/>
+          <w:bCs/>
+        </w:rPr>
+        <w:t>Étape 6.1 : Choix de la Librairie Graphique</w:t>
+      </w:r>
+    </w:p>
+    <w:p>
+      <w:pPr>
+        <w:spacing w:after="120"/>
+      </w:pPr>
+      <w:r>
+        <w:t>Pour avoir un Sankey interactif sans alourdir le projet et gratuitement :</w:t>
+      </w:r>
+    </w:p>
+    <w:p>
+      <w:pPr>
+        <w:numPr>
+          <w:ilvl w:val="0"/>
+          <w:numId w:val="21"/>
+        </w:numPr>
+        <w:spacing w:after="120"/>
+      </w:pPr>
+      <w:r>
+        <w:t>Utilisez @nivo/sankey (très robuste pour l'interactivité, gratuit) ou étends ton intégration de Recharts avec le composant natif &lt;Sankey /&gt;.</w:t>
+      </w:r>
+    </w:p>
+    <w:p>
+      <w:pPr>
+        <w:spacing w:after="120"/>
+        <w:rPr>
+          <w:b/>
+          <w:bCs/>
+        </w:rPr>
+      </w:pPr>
+      <w:r>
+        <w:rPr>
+          <w:b/>
+          <w:bCs/>
+        </w:rPr>
+        <w:t>Étape 6.2 : Logique d'Interactivité (Exemple Recharts/Nivo)</w:t>
+      </w:r>
+    </w:p>
+    <w:p>
+      <w:pPr>
+        <w:numPr>
+          <w:ilvl w:val="0"/>
+          <w:numId w:val="22"/>
+        </w:numPr>
+        <w:spacing w:after="120"/>
+      </w:pPr>
+      <w:r>
+        <w:rPr>
+          <w:b/>
+          <w:bCs/>
+        </w:rPr>
+        <w:t>Événement OnClick sur un Nœud :</w:t>
+      </w:r>
+      <w:r>
+        <w:t xml:space="preserve"> Dès que l'utilisateur clique sur une catégorie (ex: "Restauration"), le système déclenche un filtre sur le tableau inférieur pour n'afficher que les transactions de cette catégorie.</w:t>
+      </w:r>
+    </w:p>
+    <w:p>
+      <w:pPr>
+        <w:numPr>
+          <w:ilvl w:val="0"/>
+          <w:numId w:val="22"/>
+        </w:numPr>
+        <w:spacing w:after="120"/>
+      </w:pPr>
+      <w:r>
+        <w:rPr>
+          <w:b/>
+          <w:bCs/>
+        </w:rPr>
+        <w:t>Glisser-Déposer (Drag and Drop) :</w:t>
+      </w:r>
+      <w:r>
+        <w:t xml:space="preserve"> Si l'utilisateur clique sur un flux et le fait glisser vers un autre nœud de catégorie, déclenche une popup de confirmation en bas :</w:t>
+      </w:r>
+    </w:p>
+    <w:p>
+      <w:pPr>
+        <w:numPr>
+          <w:ilvl w:val="1"/>
+          <w:numId w:val="22"/>
+        </w:numPr>
+        <w:spacing w:after="120"/>
+      </w:pPr>
+      <w:r>
+        <w:rPr>
+          <w:i/>
+          <w:iCs/>
+        </w:rPr>
+        <w:t>"Voulez-vous re-catégoriser ces transactions de [Catégorie A] à [Catégorie B] ?"</w:t>
+      </w:r>
+    </w:p>
+    <w:p>
+      <w:pPr>
+        <w:numPr>
+          <w:ilvl w:val="1"/>
+          <w:numId w:val="22"/>
+        </w:numPr>
+        <w:spacing w:after="120"/>
+      </w:pPr>
+      <w:r>
+        <w:t>En cas de validation, une requête SQL UPDATE de groupe est envoyée à Supabase sur toutes les transactions ciblées.</w:t>
+      </w:r>
+    </w:p>
+    <w:p>
+      <w:pPr>
+        <w:spacing w:after="120"/>
+        <w:rPr>
+          <w:b/>
+          <w:bCs/>
+        </w:rPr>
+      </w:pPr>
+      <w:r>
+        <w:rPr>
+          <w:b/>
+          <w:bCs/>
+        </w:rPr>
+        <w:t>Phase 7 : Recette, Déploiement &amp; Tests (0 €)</w:t>
+      </w:r>
+    </w:p>
+    <w:p>
+      <w:pPr>
+        <w:numPr>
+          <w:ilvl w:val="0"/>
+          <w:numId w:val="23"/>
+        </w:numPr>
+        <w:spacing w:after="120"/>
+      </w:pPr>
+      <w:r>
+        <w:rPr>
+          <w:b/>
+          <w:bCs/>
+        </w:rPr>
+        <w:lastRenderedPageBreak/>
+        <w:t>Zéro Appel API :</w:t>
+      </w:r>
+      <w:r>
+        <w:t xml:space="preserve"> Tous les calculs s'effectuent sur le processeur du client (navigateur). Les API Supabase ne sont requêtées qu'à la lecture et lors de la confirmation finale de la sauvegarde.</w:t>
+      </w:r>
+    </w:p>
+    <w:p>
+      <w:pPr>
+        <w:numPr>
+          <w:ilvl w:val="0"/>
+          <w:numId w:val="23"/>
+        </w:numPr>
+        <w:spacing w:after="120"/>
+      </w:pPr>
+      <w:r>
+        <w:rPr>
+          <w:b/>
+          <w:bCs/>
+        </w:rPr>
+        <w:t>Tests de Performance :</w:t>
+      </w:r>
+      <w:r>
+        <w:t xml:space="preserve"> Lance des tests d'import CSV volumineux (jusqu'à 1000 transactions) avec console.time('parsing') pour t'assurer que le Moteur Regex local traite le fichier en moins de 100 millisecondes.</w:t>
+      </w:r>
+    </w:p>
+    <w:p>
+      <w:pPr>
+        <w:spacing w:after="120"/>
       </w:pPr>
     </w:p>
     <w:sectPr>
@@ -17508,6 +20492,119 @@
     </w:lvl>
   </w:abstractNum>
   <w:abstractNum w:abstractNumId="3" w15:restartNumberingAfterBreak="0">
+    <w:nsid w:val="1D9464F5"/>
+    <w:multiLevelType w:val="multilevel"/>
+    <w:tmpl w:val="8A10EB54"/>
+    <w:lvl w:ilvl="0">
+      <w:start w:val="1"/>
+      <w:numFmt w:val="decimal"/>
+      <w:lvlText w:val="%1."/>
+      <w:lvlJc w:val="left"/>
+      <w:pPr>
+        <w:tabs>
+          <w:tab w:val="num" w:pos="720"/>
+        </w:tabs>
+        <w:ind w:left="720" w:hanging="360"/>
+      </w:pPr>
+    </w:lvl>
+    <w:lvl w:ilvl="1" w:tentative="1">
+      <w:start w:val="1"/>
+      <w:numFmt w:val="decimal"/>
+      <w:lvlText w:val="%2."/>
+      <w:lvlJc w:val="left"/>
+      <w:pPr>
+        <w:tabs>
+          <w:tab w:val="num" w:pos="1440"/>
+        </w:tabs>
+        <w:ind w:left="1440" w:hanging="360"/>
+      </w:pPr>
+    </w:lvl>
+    <w:lvl w:ilvl="2" w:tentative="1">
+      <w:start w:val="1"/>
+      <w:numFmt w:val="decimal"/>
+      <w:lvlText w:val="%3."/>
+      <w:lvlJc w:val="left"/>
+      <w:pPr>
+        <w:tabs>
+          <w:tab w:val="num" w:pos="2160"/>
+        </w:tabs>
+        <w:ind w:left="2160" w:hanging="360"/>
+      </w:pPr>
+    </w:lvl>
+    <w:lvl w:ilvl="3" w:tentative="1">
+      <w:start w:val="1"/>
+      <w:numFmt w:val="decimal"/>
+      <w:lvlText w:val="%4."/>
+      <w:lvlJc w:val="left"/>
+      <w:pPr>
+        <w:tabs>
+          <w:tab w:val="num" w:pos="2880"/>
+        </w:tabs>
+        <w:ind w:left="2880" w:hanging="360"/>
+      </w:pPr>
+    </w:lvl>
+    <w:lvl w:ilvl="4" w:tentative="1">
+      <w:start w:val="1"/>
+      <w:numFmt w:val="decimal"/>
+      <w:lvlText w:val="%5."/>
+      <w:lvlJc w:val="left"/>
+      <w:pPr>
+        <w:tabs>
+          <w:tab w:val="num" w:pos="3600"/>
+        </w:tabs>
+        <w:ind w:left="3600" w:hanging="360"/>
+      </w:pPr>
+    </w:lvl>
+    <w:lvl w:ilvl="5" w:tentative="1">
+      <w:start w:val="1"/>
+      <w:numFmt w:val="decimal"/>
+      <w:lvlText w:val="%6."/>
+      <w:lvlJc w:val="left"/>
+      <w:pPr>
+        <w:tabs>
+          <w:tab w:val="num" w:pos="4320"/>
+        </w:tabs>
+        <w:ind w:left="4320" w:hanging="360"/>
+      </w:pPr>
+    </w:lvl>
+    <w:lvl w:ilvl="6" w:tentative="1">
+      <w:start w:val="1"/>
+      <w:numFmt w:val="decimal"/>
+      <w:lvlText w:val="%7."/>
+      <w:lvlJc w:val="left"/>
+      <w:pPr>
+        <w:tabs>
+          <w:tab w:val="num" w:pos="5040"/>
+        </w:tabs>
+        <w:ind w:left="5040" w:hanging="360"/>
+      </w:pPr>
+    </w:lvl>
+    <w:lvl w:ilvl="7" w:tentative="1">
+      <w:start w:val="1"/>
+      <w:numFmt w:val="decimal"/>
+      <w:lvlText w:val="%8."/>
+      <w:lvlJc w:val="left"/>
+      <w:pPr>
+        <w:tabs>
+          <w:tab w:val="num" w:pos="5760"/>
+        </w:tabs>
+        <w:ind w:left="5760" w:hanging="360"/>
+      </w:pPr>
+    </w:lvl>
+    <w:lvl w:ilvl="8" w:tentative="1">
+      <w:start w:val="1"/>
+      <w:numFmt w:val="decimal"/>
+      <w:lvlText w:val="%9."/>
+      <w:lvlJc w:val="left"/>
+      <w:pPr>
+        <w:tabs>
+          <w:tab w:val="num" w:pos="6480"/>
+        </w:tabs>
+        <w:ind w:left="6480" w:hanging="360"/>
+      </w:pPr>
+    </w:lvl>
+  </w:abstractNum>
+  <w:abstractNum w:abstractNumId="4" w15:restartNumberingAfterBreak="0">
     <w:nsid w:val="1DEE7345"/>
     <w:multiLevelType w:val="multilevel"/>
     <w:tmpl w:val="FBF0D136"/>
@@ -17656,7 +20753,7 @@
       </w:rPr>
     </w:lvl>
   </w:abstractNum>
-  <w:abstractNum w:abstractNumId="4" w15:restartNumberingAfterBreak="0">
+  <w:abstractNum w:abstractNumId="5" w15:restartNumberingAfterBreak="0">
     <w:nsid w:val="1F97232B"/>
     <w:multiLevelType w:val="multilevel"/>
     <w:tmpl w:val="A17ECD42"/>
@@ -17805,7 +20902,124 @@
       </w:rPr>
     </w:lvl>
   </w:abstractNum>
-  <w:abstractNum w:abstractNumId="5" w15:restartNumberingAfterBreak="0">
+  <w:abstractNum w:abstractNumId="6" w15:restartNumberingAfterBreak="0">
+    <w:nsid w:val="253E7D6F"/>
+    <w:multiLevelType w:val="multilevel"/>
+    <w:tmpl w:val="D6F2C24C"/>
+    <w:lvl w:ilvl="0">
+      <w:start w:val="1"/>
+      <w:numFmt w:val="decimal"/>
+      <w:lvlText w:val="%1."/>
+      <w:lvlJc w:val="left"/>
+      <w:pPr>
+        <w:tabs>
+          <w:tab w:val="num" w:pos="720"/>
+        </w:tabs>
+        <w:ind w:left="720" w:hanging="360"/>
+      </w:pPr>
+    </w:lvl>
+    <w:lvl w:ilvl="1">
+      <w:start w:val="1"/>
+      <w:numFmt w:val="bullet"/>
+      <w:lvlText w:val="o"/>
+      <w:lvlJc w:val="left"/>
+      <w:pPr>
+        <w:tabs>
+          <w:tab w:val="num" w:pos="1440"/>
+        </w:tabs>
+        <w:ind w:left="1440" w:hanging="360"/>
+      </w:pPr>
+      <w:rPr>
+        <w:rFonts w:ascii="Courier New" w:hAnsi="Courier New" w:hint="default"/>
+        <w:sz w:val="20"/>
+      </w:rPr>
+    </w:lvl>
+    <w:lvl w:ilvl="2" w:tentative="1">
+      <w:start w:val="1"/>
+      <w:numFmt w:val="decimal"/>
+      <w:lvlText w:val="%3."/>
+      <w:lvlJc w:val="left"/>
+      <w:pPr>
+        <w:tabs>
+          <w:tab w:val="num" w:pos="2160"/>
+        </w:tabs>
+        <w:ind w:left="2160" w:hanging="360"/>
+      </w:pPr>
+    </w:lvl>
+    <w:lvl w:ilvl="3" w:tentative="1">
+      <w:start w:val="1"/>
+      <w:numFmt w:val="decimal"/>
+      <w:lvlText w:val="%4."/>
+      <w:lvlJc w:val="left"/>
+      <w:pPr>
+        <w:tabs>
+          <w:tab w:val="num" w:pos="2880"/>
+        </w:tabs>
+        <w:ind w:left="2880" w:hanging="360"/>
+      </w:pPr>
+    </w:lvl>
+    <w:lvl w:ilvl="4" w:tentative="1">
+      <w:start w:val="1"/>
+      <w:numFmt w:val="decimal"/>
+      <w:lvlText w:val="%5."/>
+      <w:lvlJc w:val="left"/>
+      <w:pPr>
+        <w:tabs>
+          <w:tab w:val="num" w:pos="3600"/>
+        </w:tabs>
+        <w:ind w:left="3600" w:hanging="360"/>
+      </w:pPr>
+    </w:lvl>
+    <w:lvl w:ilvl="5" w:tentative="1">
+      <w:start w:val="1"/>
+      <w:numFmt w:val="decimal"/>
+      <w:lvlText w:val="%6."/>
+      <w:lvlJc w:val="left"/>
+      <w:pPr>
+        <w:tabs>
+          <w:tab w:val="num" w:pos="4320"/>
+        </w:tabs>
+        <w:ind w:left="4320" w:hanging="360"/>
+      </w:pPr>
+    </w:lvl>
+    <w:lvl w:ilvl="6" w:tentative="1">
+      <w:start w:val="1"/>
+      <w:numFmt w:val="decimal"/>
+      <w:lvlText w:val="%7."/>
+      <w:lvlJc w:val="left"/>
+      <w:pPr>
+        <w:tabs>
+          <w:tab w:val="num" w:pos="5040"/>
+        </w:tabs>
+        <w:ind w:left="5040" w:hanging="360"/>
+      </w:pPr>
+    </w:lvl>
+    <w:lvl w:ilvl="7" w:tentative="1">
+      <w:start w:val="1"/>
+      <w:numFmt w:val="decimal"/>
+      <w:lvlText w:val="%8."/>
+      <w:lvlJc w:val="left"/>
+      <w:pPr>
+        <w:tabs>
+          <w:tab w:val="num" w:pos="5760"/>
+        </w:tabs>
+        <w:ind w:left="5760" w:hanging="360"/>
+      </w:pPr>
+    </w:lvl>
+    <w:lvl w:ilvl="8" w:tentative="1">
+      <w:start w:val="1"/>
+      <w:numFmt w:val="decimal"/>
+      <w:lvlText w:val="%9."/>
+      <w:lvlJc w:val="left"/>
+      <w:pPr>
+        <w:tabs>
+          <w:tab w:val="num" w:pos="6480"/>
+        </w:tabs>
+        <w:ind w:left="6480" w:hanging="360"/>
+      </w:pPr>
+    </w:lvl>
+  </w:abstractNum>
+  <w:abstractNum w:abstractNumId="7" w15:restartNumberingAfterBreak="0">
     <w:nsid w:val="255B54CE"/>
     <w:multiLevelType w:val="multilevel"/>
     <w:tmpl w:val="41BAFA58"/>
@@ -17954,7 +21168,7 @@
       </w:rPr>
     </w:lvl>
   </w:abstractNum>
-  <w:abstractNum w:abstractNumId="6" w15:restartNumberingAfterBreak="0">
+  <w:abstractNum w:abstractNumId="8" w15:restartNumberingAfterBreak="0">
     <w:nsid w:val="25C35C4F"/>
     <w:multiLevelType w:val="multilevel"/>
     <w:tmpl w:val="1AEE6F44"/>
@@ -18103,7 +21317,7 @@
       </w:rPr>
     </w:lvl>
   </w:abstractNum>
-  <w:abstractNum w:abstractNumId="7" w15:restartNumberingAfterBreak="0">
+  <w:abstractNum w:abstractNumId="9" w15:restartNumberingAfterBreak="0">
     <w:nsid w:val="2E9A0E7B"/>
     <w:multiLevelType w:val="multilevel"/>
     <w:tmpl w:val="6A1C1706"/>
@@ -18252,7 +21466,7 @@
       </w:rPr>
     </w:lvl>
   </w:abstractNum>
-  <w:abstractNum w:abstractNumId="8" w15:restartNumberingAfterBreak="0">
+  <w:abstractNum w:abstractNumId="10" w15:restartNumberingAfterBreak="0">
     <w:nsid w:val="306D0BC5"/>
     <w:multiLevelType w:val="multilevel"/>
     <w:tmpl w:val="86001E4C"/>
@@ -18401,7 +21615,7 @@
       </w:rPr>
     </w:lvl>
   </w:abstractNum>
-  <w:abstractNum w:abstractNumId="9" w15:restartNumberingAfterBreak="0">
+  <w:abstractNum w:abstractNumId="11" w15:restartNumberingAfterBreak="0">
     <w:nsid w:val="379D3EAE"/>
     <w:multiLevelType w:val="multilevel"/>
     <w:tmpl w:val="D25E0358"/>
@@ -18514,7 +21728,7 @@
       </w:pPr>
     </w:lvl>
   </w:abstractNum>
-  <w:abstractNum w:abstractNumId="10" w15:restartNumberingAfterBreak="0">
+  <w:abstractNum w:abstractNumId="12" w15:restartNumberingAfterBreak="0">
     <w:nsid w:val="3CBF2105"/>
     <w:multiLevelType w:val="multilevel"/>
     <w:tmpl w:val="F776EADA"/>
@@ -18663,7 +21877,156 @@
       </w:rPr>
     </w:lvl>
   </w:abstractNum>
-  <w:abstractNum w:abstractNumId="11" w15:restartNumberingAfterBreak="0">
+  <w:abstractNum w:abstractNumId="13" w15:restartNumberingAfterBreak="0">
+    <w:nsid w:val="57802284"/>
+    <w:multiLevelType w:val="multilevel"/>
+    <w:tmpl w:val="B2D8A7B6"/>
+    <w:lvl w:ilvl="0">
+      <w:start w:val="1"/>
+      <w:numFmt w:val="bullet"/>
+      <w:lvlText w:val=""/>
+      <w:lvlJc w:val="left"/>
+      <w:pPr>
+        <w:tabs>
+          <w:tab w:val="num" w:pos="720"/>
+        </w:tabs>
+        <w:ind w:left="720" w:hanging="360"/>
+      </w:pPr>
+      <w:rPr>
+        <w:rFonts w:ascii="Symbol" w:hAnsi="Symbol" w:hint="default"/>
+        <w:sz w:val="20"/>
+      </w:rPr>
+    </w:lvl>
+    <w:lvl w:ilvl="1" w:tentative="1">
+      <w:start w:val="1"/>
+      <w:numFmt w:val="bullet"/>
+      <w:lvlText w:val="o"/>
+      <w:lvlJc w:val="left"/>
+      <w:pPr>
+        <w:tabs>
+          <w:tab w:val="num" w:pos="1440"/>
+        </w:tabs>
+        <w:ind w:left="1440" w:hanging="360"/>
+      </w:pPr>
+      <w:rPr>
+        <w:rFonts w:ascii="Courier New" w:hAnsi="Courier New" w:hint="default"/>
+        <w:sz w:val="20"/>
+      </w:rPr>
+    </w:lvl>
+    <w:lvl w:ilvl="2" w:tentative="1">
+      <w:start w:val="1"/>
+      <w:numFmt w:val="bullet"/>
+      <w:lvlText w:val=""/>
+      <w:lvlJc w:val="left"/>
+      <w:pPr>
+        <w:tabs>
+          <w:tab w:val="num" w:pos="2160"/>
+        </w:tabs>
+        <w:ind w:left="2160" w:hanging="360"/>
+      </w:pPr>
+      <w:rPr>
+        <w:rFonts w:ascii="Wingdings" w:hAnsi="Wingdings" w:hint="default"/>
+        <w:sz w:val="20"/>
+      </w:rPr>
+    </w:lvl>
+    <w:lvl w:ilvl="3" w:tentative="1">
+      <w:start w:val="1"/>
+      <w:numFmt w:val="bullet"/>
+      <w:lvlText w:val=""/>
+      <w:lvlJc w:val="left"/>
+      <w:pPr>
+        <w:tabs>
+          <w:tab w:val="num" w:pos="2880"/>
+        </w:tabs>
+        <w:ind w:left="2880" w:hanging="360"/>
+      </w:pPr>
+      <w:rPr>
+        <w:rFonts w:ascii="Wingdings" w:hAnsi="Wingdings" w:hint="default"/>
+        <w:sz w:val="20"/>
+      </w:rPr>
+    </w:lvl>
+    <w:lvl w:ilvl="4" w:tentative="1">
+      <w:start w:val="1"/>
+      <w:numFmt w:val="bullet"/>
+      <w:lvlText w:val=""/>
+      <w:lvlJc w:val="left"/>
+      <w:pPr>
+        <w:tabs>
+          <w:tab w:val="num" w:pos="3600"/>
+        </w:tabs>
+        <w:ind w:left="3600" w:hanging="360"/>
+      </w:pPr>
+      <w:rPr>
+        <w:rFonts w:ascii="Wingdings" w:hAnsi="Wingdings" w:hint="default"/>
+        <w:sz w:val="20"/>
+      </w:rPr>
+    </w:lvl>
+    <w:lvl w:ilvl="5" w:tentative="1">
+      <w:start w:val="1"/>
+      <w:numFmt w:val="bullet"/>
+      <w:lvlText w:val=""/>
+      <w:lvlJc w:val="left"/>
+      <w:pPr>
+        <w:tabs>
+          <w:tab w:val="num" w:pos="4320"/>
+        </w:tabs>
+        <w:ind w:left="4320" w:hanging="360"/>
+      </w:pPr>
+      <w:rPr>
+        <w:rFonts w:ascii="Wingdings" w:hAnsi="Wingdings" w:hint="default"/>
+        <w:sz w:val="20"/>
+      </w:rPr>
+    </w:lvl>
+    <w:lvl w:ilvl="6" w:tentative="1">
+      <w:start w:val="1"/>
+      <w:numFmt w:val="bullet"/>
+      <w:lvlText w:val=""/>
+      <w:lvlJc w:val="left"/>
+      <w:pPr>
+        <w:tabs>
+          <w:tab w:val="num" w:pos="5040"/>
+        </w:tabs>
+        <w:ind w:left="5040" w:hanging="360"/>
+      </w:pPr>
+      <w:rPr>
+        <w:rFonts w:ascii="Wingdings" w:hAnsi="Wingdings" w:hint="default"/>
+        <w:sz w:val="20"/>
+      </w:rPr>
+    </w:lvl>
+    <w:lvl w:ilvl="7" w:tentative="1">
+      <w:start w:val="1"/>
+      <w:numFmt w:val="bullet"/>
+      <w:lvlText w:val=""/>
+      <w:lvlJc w:val="left"/>
+      <w:pPr>
+        <w:tabs>
+          <w:tab w:val="num" w:pos="5760"/>
+        </w:tabs>
+        <w:ind w:left="5760" w:hanging="360"/>
+      </w:pPr>
+      <w:rPr>
+        <w:rFonts w:ascii="Wingdings" w:hAnsi="Wingdings" w:hint="default"/>
+        <w:sz w:val="20"/>
+      </w:rPr>
+    </w:lvl>
+    <w:lvl w:ilvl="8" w:tentative="1">
+      <w:start w:val="1"/>
+      <w:numFmt w:val="bullet"/>
+      <w:lvlText w:val=""/>
+      <w:lvlJc w:val="left"/>
+      <w:pPr>
+        <w:tabs>
+          <w:tab w:val="num" w:pos="6480"/>
+        </w:tabs>
+        <w:ind w:left="6480" w:hanging="360"/>
+      </w:pPr>
+      <w:rPr>
+        <w:rFonts w:ascii="Wingdings" w:hAnsi="Wingdings" w:hint="default"/>
+        <w:sz w:val="20"/>
+      </w:rPr>
+    </w:lvl>
+  </w:abstractNum>
+  <w:abstractNum w:abstractNumId="14" w15:restartNumberingAfterBreak="0">
     <w:nsid w:val="62DA22AB"/>
     <w:multiLevelType w:val="multilevel"/>
     <w:tmpl w:val="783ABB80"/>
@@ -18812,7 +22175,7 @@
       </w:rPr>
     </w:lvl>
   </w:abstractNum>
-  <w:abstractNum w:abstractNumId="12" w15:restartNumberingAfterBreak="0">
+  <w:abstractNum w:abstractNumId="15" w15:restartNumberingAfterBreak="0">
     <w:nsid w:val="66CF62CE"/>
     <w:multiLevelType w:val="multilevel"/>
     <w:tmpl w:val="74289A1C"/>
@@ -18961,7 +22324,7 @@
       </w:rPr>
     </w:lvl>
   </w:abstractNum>
-  <w:abstractNum w:abstractNumId="13" w15:restartNumberingAfterBreak="0">
+  <w:abstractNum w:abstractNumId="16" w15:restartNumberingAfterBreak="0">
     <w:nsid w:val="6B556E56"/>
     <w:multiLevelType w:val="multilevel"/>
     <w:tmpl w:val="31EEFFB6"/>
@@ -19082,7 +22445,7 @@
       </w:pPr>
     </w:lvl>
   </w:abstractNum>
-  <w:abstractNum w:abstractNumId="14" w15:restartNumberingAfterBreak="0">
+  <w:abstractNum w:abstractNumId="17" w15:restartNumberingAfterBreak="0">
     <w:nsid w:val="733F1969"/>
     <w:multiLevelType w:val="hybridMultilevel"/>
     <w:tmpl w:val="94D43434"/>
@@ -19171,7 +22534,7 @@
       </w:pPr>
     </w:lvl>
   </w:abstractNum>
-  <w:abstractNum w:abstractNumId="15" w15:restartNumberingAfterBreak="0">
+  <w:abstractNum w:abstractNumId="18" w15:restartNumberingAfterBreak="0">
     <w:nsid w:val="74680495"/>
     <w:multiLevelType w:val="multilevel"/>
     <w:tmpl w:val="E6C6FB6E"/>
@@ -19320,7 +22683,7 @@
       </w:rPr>
     </w:lvl>
   </w:abstractNum>
-  <w:abstractNum w:abstractNumId="16" w15:restartNumberingAfterBreak="0">
+  <w:abstractNum w:abstractNumId="19" w15:restartNumberingAfterBreak="0">
     <w:nsid w:val="7710798E"/>
     <w:multiLevelType w:val="multilevel"/>
     <w:tmpl w:val="3F4A8E4A"/>
@@ -19469,7 +22832,7 @@
       </w:rPr>
     </w:lvl>
   </w:abstractNum>
-  <w:abstractNum w:abstractNumId="17" w15:restartNumberingAfterBreak="0">
+  <w:abstractNum w:abstractNumId="20" w15:restartNumberingAfterBreak="0">
     <w:nsid w:val="79E2309F"/>
     <w:multiLevelType w:val="multilevel"/>
     <w:tmpl w:val="E342E5D6"/>
@@ -19582,7 +22945,7 @@
       </w:pPr>
     </w:lvl>
   </w:abstractNum>
-  <w:abstractNum w:abstractNumId="18" w15:restartNumberingAfterBreak="0">
+  <w:abstractNum w:abstractNumId="21" w15:restartNumberingAfterBreak="0">
     <w:nsid w:val="7A573DDE"/>
     <w:multiLevelType w:val="multilevel"/>
     <w:tmpl w:val="5D144C50"/>
@@ -19728,64 +23091,73 @@
     </w:lvl>
   </w:abstractNum>
   <w:num w:numId="1" w16cid:durableId="1746150151">
-    <w:abstractNumId w:val="14"/>
+    <w:abstractNumId w:val="17"/>
   </w:num>
   <w:num w:numId="2" w16cid:durableId="214004282">
-    <w:abstractNumId w:val="14"/>
+    <w:abstractNumId w:val="17"/>
   </w:num>
   <w:num w:numId="3" w16cid:durableId="1354500463">
-    <w:abstractNumId w:val="3"/>
+    <w:abstractNumId w:val="4"/>
   </w:num>
   <w:num w:numId="4" w16cid:durableId="1482388049">
+    <w:abstractNumId w:val="9"/>
+  </w:num>
+  <w:num w:numId="5" w16cid:durableId="2034763612">
+    <w:abstractNumId w:val="20"/>
+  </w:num>
+  <w:num w:numId="6" w16cid:durableId="1637300789">
     <w:abstractNumId w:val="7"/>
   </w:num>
-  <w:num w:numId="5" w16cid:durableId="2034763612">
-    <w:abstractNumId w:val="17"/>
-  </w:num>
-  <w:num w:numId="6" w16cid:durableId="1637300789">
-    <w:abstractNumId w:val="5"/>
-  </w:num>
   <w:num w:numId="7" w16cid:durableId="1535074460">
-    <w:abstractNumId w:val="12"/>
+    <w:abstractNumId w:val="15"/>
   </w:num>
   <w:num w:numId="8" w16cid:durableId="718018368">
-    <w:abstractNumId w:val="16"/>
+    <w:abstractNumId w:val="19"/>
   </w:num>
   <w:num w:numId="9" w16cid:durableId="1057171463">
     <w:abstractNumId w:val="0"/>
   </w:num>
   <w:num w:numId="10" w16cid:durableId="172653782">
-    <w:abstractNumId w:val="4"/>
+    <w:abstractNumId w:val="5"/>
   </w:num>
   <w:num w:numId="11" w16cid:durableId="444807078">
-    <w:abstractNumId w:val="10"/>
+    <w:abstractNumId w:val="12"/>
   </w:num>
   <w:num w:numId="12" w16cid:durableId="1531258956">
-    <w:abstractNumId w:val="9"/>
+    <w:abstractNumId w:val="11"/>
   </w:num>
   <w:num w:numId="13" w16cid:durableId="1678538774">
     <w:abstractNumId w:val="2"/>
   </w:num>
   <w:num w:numId="14" w16cid:durableId="2079404248">
-    <w:abstractNumId w:val="6"/>
+    <w:abstractNumId w:val="8"/>
   </w:num>
   <w:num w:numId="15" w16cid:durableId="1261720356">
     <w:abstractNumId w:val="1"/>
   </w:num>
   <w:num w:numId="16" w16cid:durableId="591476444">
-    <w:abstractNumId w:val="15"/>
+    <w:abstractNumId w:val="18"/>
   </w:num>
   <w:num w:numId="17" w16cid:durableId="1462841781">
-    <w:abstractNumId w:val="11"/>
+    <w:abstractNumId w:val="14"/>
   </w:num>
   <w:num w:numId="18" w16cid:durableId="1626766400">
-    <w:abstractNumId w:val="8"/>
+    <w:abstractNumId w:val="10"/>
   </w:num>
   <w:num w:numId="19" w16cid:durableId="4017543">
-    <w:abstractNumId w:val="18"/>
+    <w:abstractNumId w:val="21"/>
   </w:num>
   <w:num w:numId="20" w16cid:durableId="1305116368">
+    <w:abstractNumId w:val="16"/>
+  </w:num>
+  <w:num w:numId="21" w16cid:durableId="815955086">
     <w:abstractNumId w:val="13"/>
+  </w:num>
+  <w:num w:numId="22" w16cid:durableId="1128429840">
+    <w:abstractNumId w:val="6"/>
+  </w:num>
+  <w:num w:numId="23" w16cid:durableId="1539270250">
+    <w:abstractNumId w:val="3"/>
   </w:num>
 </w:numbering>
 </file>
@@ -20636,6 +24008,51 @@
       <w:shd w:val="clear" w:color="auto" w:fill="E1DFDD"/>
     </w:rPr>
   </w:style>
+  <w:style w:type="character" w:customStyle="1" w:styleId="ng-tns-c1577067504-98">
+    <w:name w:val="ng-tns-c1577067504-98"/>
+    <w:basedOn w:val="Policepardfaut"/>
+    <w:rsid w:val="00813B1E"/>
+  </w:style>
+  <w:style w:type="character" w:customStyle="1" w:styleId="ng-tns-c1577067504-99">
+    <w:name w:val="ng-tns-c1577067504-99"/>
+    <w:basedOn w:val="Policepardfaut"/>
+    <w:rsid w:val="00813B1E"/>
+  </w:style>
+  <w:style w:type="character" w:customStyle="1" w:styleId="ng-tns-c1577067504-100">
+    <w:name w:val="ng-tns-c1577067504-100"/>
+    <w:basedOn w:val="Policepardfaut"/>
+    <w:rsid w:val="00813B1E"/>
+  </w:style>
+  <w:style w:type="character" w:customStyle="1" w:styleId="ng-tns-c1577067504-101">
+    <w:name w:val="ng-tns-c1577067504-101"/>
+    <w:basedOn w:val="Policepardfaut"/>
+    <w:rsid w:val="00813B1E"/>
+  </w:style>
+  <w:style w:type="character" w:customStyle="1" w:styleId="ng-tns-c1577067504-102">
+    <w:name w:val="ng-tns-c1577067504-102"/>
+    <w:basedOn w:val="Policepardfaut"/>
+    <w:rsid w:val="00813B1E"/>
+  </w:style>
+  <w:style w:type="character" w:customStyle="1" w:styleId="ng-tns-c1577067504-103">
+    <w:name w:val="ng-tns-c1577067504-103"/>
+    <w:basedOn w:val="Policepardfaut"/>
+    <w:rsid w:val="00813B1E"/>
+  </w:style>
+  <w:style w:type="character" w:customStyle="1" w:styleId="ng-tns-c1577067504-104">
+    <w:name w:val="ng-tns-c1577067504-104"/>
+    <w:basedOn w:val="Policepardfaut"/>
+    <w:rsid w:val="00813B1E"/>
+  </w:style>
+  <w:style w:type="character" w:customStyle="1" w:styleId="ng-tns-c1577067504-105">
+    <w:name w:val="ng-tns-c1577067504-105"/>
+    <w:basedOn w:val="Policepardfaut"/>
+    <w:rsid w:val="00813B1E"/>
+  </w:style>
+  <w:style w:type="character" w:customStyle="1" w:styleId="ng-tns-c1577067504-106">
+    <w:name w:val="ng-tns-c1577067504-106"/>
+    <w:basedOn w:val="Policepardfaut"/>
+    <w:rsid w:val="00813B1E"/>
+  </w:style>
 </w:styles>
 </file>
 

</xml_diff>